<commit_message>
Add configurable PWM outputs and serial IO controls
</commit_message>
<xml_diff>
--- a/docs/ESP32-S3_USB_Modbus_IO_Protocol.docx
+++ b/docs/ESP32-S3_USB_Modbus_IO_Protocol.docx
@@ -43,7 +43,7 @@
           <w:color w:val="000000"/>
           <w:sz w:val="20"/>
         </w:rPr>
-        <w:t>协议版本 1.0    固件版本 1.0    从站地址 1</w:t>
+        <w:t>协议版本 1.1    固件版本 1.1    从站地址 1</w:t>
       </w:r>
     </w:p>
     <w:p>
@@ -58,7 +58,7 @@
           <w:color w:val="000000"/>
           <w:sz w:val="21"/>
         </w:rPr>
-        <w:t>本手册给出图示 ESP32-S3-WROOM-1 开发板的 USB 虚拟串口 Modbus RTU 接口。主站可读取数字输入和输出状态、控制数字输出、读取 GPIO1 到 GPIO18 的 ADC 数据，并通过保持寄存器设置每个通道的工作模式。</w:t>
+        <w:t>本手册给出图示 ESP32-S3-WROOM-1 开发板的 USB 虚拟串口 Modbus RTU 接口。主站可读取数字输入和输出状态、控制数字输出、读取 GPIO1 到 GPIO18 的 ADC 数据，并配置 PWM 频率、占空比和启停状态。版本 1.1 保留 1.0 的数字 IO 和 ADC 地址。</w:t>
       </w:r>
     </w:p>
     <w:p>
@@ -77,7 +77,7 @@
               <a:graphicData uri="http://schemas.openxmlformats.org/drawingml/2006/picture">
                 <pic:pic>
                   <pic:nvPicPr>
-                    <pic:cNvPr id="0" name="codex-clipboard-cffef77b-80c4-43f5-947d-564f35cb61a6.png"/>
+                    <pic:cNvPr id="0" name="esp32-s3-board.png"/>
                     <pic:cNvPicPr/>
                   </pic:nvPicPr>
                   <pic:blipFill>
@@ -859,6 +859,95 @@
                 <w:sz w:val="18"/>
               </w:rPr>
               <w:t>GPIO1 到 GPIO18</w:t>
+            </w:r>
+          </w:p>
+        </w:tc>
+      </w:tr>
+      <w:tr>
+        <w:trPr>
+          <w:cantSplit/>
+        </w:trPr>
+        <w:tc>
+          <w:tcPr>
+            <w:tcW w:type="dxa" w:w="2088"/>
+            <w:shd w:fill="EAF2F8"/>
+            <w:tcMar>
+              <w:top w:w="90" w:type="dxa"/>
+              <w:start w:w="110" w:type="dxa"/>
+              <w:bottom w:w="90" w:type="dxa"/>
+              <w:end w:w="110" w:type="dxa"/>
+            </w:tcMar>
+            <w:vAlign w:val="center"/>
+          </w:tcPr>
+          <w:p>
+            <w:pPr>
+              <w:spacing w:before="0" w:after="0" w:line="259" w:lineRule="auto"/>
+              <w:jc w:val="left"/>
+            </w:pPr>
+            <w:r>
+              <w:rPr>
+                <w:rFonts w:ascii="Microsoft YaHei" w:hAnsi="Microsoft YaHei" w:eastAsia="Microsoft YaHei"/>
+                <w:b w:val="0"/>
+                <w:color w:val="000000"/>
+                <w:sz w:val="18"/>
+              </w:rPr>
+              <w:t>PWM 输出</w:t>
+            </w:r>
+          </w:p>
+        </w:tc>
+        <w:tc>
+          <w:tcPr>
+            <w:tcW w:type="dxa" w:w="2232"/>
+            <w:shd w:fill="EAF2F8"/>
+            <w:tcMar>
+              <w:top w:w="90" w:type="dxa"/>
+              <w:start w:w="110" w:type="dxa"/>
+              <w:bottom w:w="90" w:type="dxa"/>
+              <w:end w:w="110" w:type="dxa"/>
+            </w:tcMar>
+            <w:vAlign w:val="center"/>
+          </w:tcPr>
+          <w:p>
+            <w:pPr>
+              <w:spacing w:before="0" w:after="0" w:line="259" w:lineRule="auto"/>
+              <w:jc w:val="center"/>
+            </w:pPr>
+            <w:r>
+              <w:rPr>
+                <w:rFonts w:ascii="Microsoft YaHei" w:hAnsi="Microsoft YaHei" w:eastAsia="Microsoft YaHei"/>
+                <w:b w:val="0"/>
+                <w:color w:val="000000"/>
+                <w:sz w:val="18"/>
+              </w:rPr>
+              <w:t>最多 8 路</w:t>
+            </w:r>
+          </w:p>
+        </w:tc>
+        <w:tc>
+          <w:tcPr>
+            <w:tcW w:type="dxa" w:w="5760"/>
+            <w:shd w:fill="EAF2F8"/>
+            <w:tcMar>
+              <w:top w:w="90" w:type="dxa"/>
+              <w:start w:w="110" w:type="dxa"/>
+              <w:bottom w:w="90" w:type="dxa"/>
+              <w:end w:w="110" w:type="dxa"/>
+            </w:tcMar>
+            <w:vAlign w:val="center"/>
+          </w:tcPr>
+          <w:p>
+            <w:pPr>
+              <w:spacing w:before="0" w:after="0" w:line="259" w:lineRule="auto"/>
+              <w:jc w:val="left"/>
+            </w:pPr>
+            <w:r>
+              <w:rPr>
+                <w:rFonts w:ascii="Microsoft YaHei" w:hAnsi="Microsoft YaHei" w:eastAsia="Microsoft YaHei"/>
+                <w:b w:val="0"/>
+                <w:color w:val="000000"/>
+                <w:sz w:val="18"/>
+              </w:rPr>
+              <w:t>同时最多 4 种频率；10 Hz 到 100 kHz</w:t>
             </w:r>
           </w:p>
         </w:tc>
@@ -1915,7 +2004,7 @@
                 <w:color w:val="000000"/>
                 <w:sz w:val="18"/>
               </w:rPr>
-              <w:t>读取模式、GPIO 映射和设备信息</w:t>
+              <w:t>读取模式、GPIO 映射、设备信息和 PWM 配置</w:t>
             </w:r>
           </w:p>
         </w:tc>
@@ -2354,7 +2443,7 @@
                 <w:color w:val="000000"/>
                 <w:sz w:val="18"/>
               </w:rPr>
-              <w:t>批量设置连续通道模式</w:t>
+              <w:t>批量设置模式或写单路完整 PWM 配置</w:t>
             </w:r>
           </w:p>
         </w:tc>
@@ -2385,7 +2474,7 @@
           <w:color w:val="000000"/>
           <w:sz w:val="21"/>
         </w:rPr>
-        <w:t>Modbus PDU 地址从 0 开始，传统线圈号和离散输入号从 1 开始显示。线圈返回最近写入的输出命令状态，离散输入返回引脚实际电平。GPIO35 到 GPIO37 的通道号始终保留，但默认访问会返回非法数据地址异常。</w:t>
+        <w:t>Modbus PDU 地址从 0 开始，传统线圈号和离散输入号从 1 开始显示。线圈返回最近写入的输出命令状态，离散输入返回引脚实际电平。GPIO35 到 GPIO37 的通道号始终保留，但默认访问会返回非法数据地址异常。PWM 模式读线圈仍返回最近的数字输出命令值；读离散输入只得到采样瞬间电平，不能用来判断 PWM 占空比。模拟模式读离散输入返回异常 0x04。</w:t>
       </w:r>
     </w:p>
     <w:tbl>
@@ -8391,7 +8480,7 @@
           <w:color w:val="000000"/>
           <w:sz w:val="21"/>
         </w:rPr>
-        <w:t>模拟通道 0 到 17 依次对应 GPIO1 到 GPIO18。ADC 使用 12 dB 衰减和默认位宽。读取时会把非输出 GPIO 切换为模拟模式。如果对应 GPIO 正在输出，固件返回异常 0x04，避免改变现有输出。</w:t>
+        <w:t>模拟通道 0 到 17 依次对应 GPIO1 到 GPIO18。ADC 使用 12 dB 衰减和默认位宽。读取时会把非输出 GPIO 切换为模拟模式。如果对应 GPIO 正在数字输出或 PWM 输出，固件返回异常 0x04，保持现有输出；可先明确切换到模拟模式再读取 ADC。</w:t>
       </w:r>
     </w:p>
     <w:tbl>
@@ -8813,7 +8902,7 @@
           <w:color w:val="000000"/>
           <w:sz w:val="21"/>
         </w:rPr>
-        <w:t>PDU 地址 0x0000 到 0x0021 对应数字通道 0 到 33。可用 0x03 读取，用 0x06 或 0x10 写入。写线圈会自动切换到输出模式；切换为其他模式会关闭输出驱动。</w:t>
+        <w:t>PDU 地址 0x0000 到 0x0021 对应数字通道 0 到 33。可用 0x03 读取，用 0x06 或 0x10 写入。写线圈会停止 PWM 并切换到数字输出模式；PWM 通道切换为模式 0 到 4 时释放 PWM 资源。切换到模式 3 时恢复最近一次线圈命令值。</w:t>
       </w:r>
     </w:p>
     <w:tbl>
@@ -9358,6 +9447,95 @@
                 <w:sz w:val="18"/>
               </w:rPr>
               <w:t>仅数字通道 1 到 18</w:t>
+            </w:r>
+          </w:p>
+        </w:tc>
+      </w:tr>
+      <w:tr>
+        <w:trPr>
+          <w:cantSplit/>
+        </w:trPr>
+        <w:tc>
+          <w:tcPr>
+            <w:tcW w:type="dxa" w:w="1440"/>
+            <w:shd w:fill="EAF2F8"/>
+            <w:tcMar>
+              <w:top w:w="90" w:type="dxa"/>
+              <w:start w:w="110" w:type="dxa"/>
+              <w:bottom w:w="90" w:type="dxa"/>
+              <w:end w:w="110" w:type="dxa"/>
+            </w:tcMar>
+            <w:vAlign w:val="center"/>
+          </w:tcPr>
+          <w:p>
+            <w:pPr>
+              <w:spacing w:before="0" w:after="0" w:line="259" w:lineRule="auto"/>
+              <w:jc w:val="center"/>
+            </w:pPr>
+            <w:r>
+              <w:rPr>
+                <w:rFonts w:ascii="Microsoft YaHei" w:hAnsi="Microsoft YaHei" w:eastAsia="Microsoft YaHei"/>
+                <w:b w:val="0"/>
+                <w:color w:val="000000"/>
+                <w:sz w:val="18"/>
+              </w:rPr>
+              <w:t>5</w:t>
+            </w:r>
+          </w:p>
+        </w:tc>
+        <w:tc>
+          <w:tcPr>
+            <w:tcW w:type="dxa" w:w="3168"/>
+            <w:shd w:fill="EAF2F8"/>
+            <w:tcMar>
+              <w:top w:w="90" w:type="dxa"/>
+              <w:start w:w="110" w:type="dxa"/>
+              <w:bottom w:w="90" w:type="dxa"/>
+              <w:end w:w="110" w:type="dxa"/>
+            </w:tcMar>
+            <w:vAlign w:val="center"/>
+          </w:tcPr>
+          <w:p>
+            <w:pPr>
+              <w:spacing w:before="0" w:after="0" w:line="259" w:lineRule="auto"/>
+              <w:jc w:val="left"/>
+            </w:pPr>
+            <w:r>
+              <w:rPr>
+                <w:rFonts w:ascii="Microsoft YaHei" w:hAnsi="Microsoft YaHei" w:eastAsia="Microsoft YaHei"/>
+                <w:b w:val="0"/>
+                <w:color w:val="000000"/>
+                <w:sz w:val="18"/>
+              </w:rPr>
+              <w:t>PWM 输出</w:t>
+            </w:r>
+          </w:p>
+        </w:tc>
+        <w:tc>
+          <w:tcPr>
+            <w:tcW w:type="dxa" w:w="5472"/>
+            <w:shd w:fill="EAF2F8"/>
+            <w:tcMar>
+              <w:top w:w="90" w:type="dxa"/>
+              <w:start w:w="110" w:type="dxa"/>
+              <w:bottom w:w="90" w:type="dxa"/>
+              <w:end w:w="110" w:type="dxa"/>
+            </w:tcMar>
+            <w:vAlign w:val="center"/>
+          </w:tcPr>
+          <w:p>
+            <w:pPr>
+              <w:spacing w:before="0" w:after="0" w:line="259" w:lineRule="auto"/>
+              <w:jc w:val="left"/>
+            </w:pPr>
+            <w:r>
+              <w:rPr>
+                <w:rFonts w:ascii="Microsoft YaHei" w:hAnsi="Microsoft YaHei" w:eastAsia="Microsoft YaHei"/>
+                <w:b w:val="0"/>
+                <w:color w:val="000000"/>
+                <w:sz w:val="18"/>
+              </w:rPr>
+              <w:t>使用已保存配置；初始 1000 Hz、50%</w:t>
             </w:r>
           </w:p>
         </w:tc>
@@ -9646,7 +9824,7 @@
                 <w:color w:val="000000"/>
                 <w:sz w:val="18"/>
               </w:rPr>
-              <w:t>0x0100 表示 1.0</w:t>
+              <w:t>0x0101 表示 1.1</w:t>
             </w:r>
           </w:p>
         </w:tc>
@@ -9763,7 +9941,7 @@
                 <w:color w:val="000000"/>
                 <w:sz w:val="18"/>
               </w:rPr>
-              <w:t>0x0100 表示 1.0</w:t>
+              <w:t>0x0101 表示 1.1</w:t>
             </w:r>
           </w:p>
         </w:tc>
@@ -10106,7 +10284,237 @@
                 <w:color w:val="000000"/>
                 <w:sz w:val="18"/>
               </w:rPr>
-              <w:t>bit0 ADC 校准；bit1 GPIO35 到 GPIO37</w:t>
+              <w:t>bit0 ADC 校准；bit1 GPIO35 到 GPIO37；bit2 PWM</w:t>
+            </w:r>
+          </w:p>
+        </w:tc>
+      </w:tr>
+      <w:tr>
+        <w:trPr>
+          <w:cantSplit/>
+        </w:trPr>
+        <w:tc>
+          <w:tcPr>
+            <w:tcW w:type="dxa" w:w="1440"/>
+            <w:shd w:fill="EAF2F8"/>
+            <w:tcMar>
+              <w:top w:w="90" w:type="dxa"/>
+              <w:start w:w="110" w:type="dxa"/>
+              <w:bottom w:w="90" w:type="dxa"/>
+              <w:end w:w="110" w:type="dxa"/>
+            </w:tcMar>
+            <w:vAlign w:val="center"/>
+          </w:tcPr>
+          <w:p>
+            <w:pPr>
+              <w:spacing w:before="0" w:after="0" w:line="259" w:lineRule="auto"/>
+              <w:jc w:val="center"/>
+            </w:pPr>
+            <w:r>
+              <w:rPr>
+                <w:rFonts w:ascii="Microsoft YaHei" w:hAnsi="Microsoft YaHei" w:eastAsia="Microsoft YaHei"/>
+                <w:b w:val="0"/>
+                <w:color w:val="000000"/>
+                <w:sz w:val="18"/>
+              </w:rPr>
+              <w:t>0x0205</w:t>
+            </w:r>
+          </w:p>
+        </w:tc>
+        <w:tc>
+          <w:tcPr>
+            <w:tcW w:type="dxa" w:w="1728"/>
+            <w:shd w:fill="EAF2F8"/>
+            <w:tcMar>
+              <w:top w:w="90" w:type="dxa"/>
+              <w:start w:w="110" w:type="dxa"/>
+              <w:bottom w:w="90" w:type="dxa"/>
+              <w:end w:w="110" w:type="dxa"/>
+            </w:tcMar>
+            <w:vAlign w:val="center"/>
+          </w:tcPr>
+          <w:p>
+            <w:pPr>
+              <w:spacing w:before="0" w:after="0" w:line="259" w:lineRule="auto"/>
+              <w:jc w:val="center"/>
+            </w:pPr>
+            <w:r>
+              <w:rPr>
+                <w:rFonts w:ascii="Microsoft YaHei" w:hAnsi="Microsoft YaHei" w:eastAsia="Microsoft YaHei"/>
+                <w:b w:val="0"/>
+                <w:color w:val="000000"/>
+                <w:sz w:val="18"/>
+              </w:rPr>
+              <w:t>40518</w:t>
+            </w:r>
+          </w:p>
+        </w:tc>
+        <w:tc>
+          <w:tcPr>
+            <w:tcW w:type="dxa" w:w="2592"/>
+            <w:shd w:fill="EAF2F8"/>
+            <w:tcMar>
+              <w:top w:w="90" w:type="dxa"/>
+              <w:start w:w="110" w:type="dxa"/>
+              <w:bottom w:w="90" w:type="dxa"/>
+              <w:end w:w="110" w:type="dxa"/>
+            </w:tcMar>
+            <w:vAlign w:val="center"/>
+          </w:tcPr>
+          <w:p>
+            <w:pPr>
+              <w:spacing w:before="0" w:after="0" w:line="259" w:lineRule="auto"/>
+              <w:jc w:val="left"/>
+            </w:pPr>
+            <w:r>
+              <w:rPr>
+                <w:rFonts w:ascii="Microsoft YaHei" w:hAnsi="Microsoft YaHei" w:eastAsia="Microsoft YaHei"/>
+                <w:b w:val="0"/>
+                <w:color w:val="000000"/>
+                <w:sz w:val="18"/>
+              </w:rPr>
+              <w:t>最大 PWM 输出数</w:t>
+            </w:r>
+          </w:p>
+        </w:tc>
+        <w:tc>
+          <w:tcPr>
+            <w:tcW w:type="dxa" w:w="4320"/>
+            <w:shd w:fill="EAF2F8"/>
+            <w:tcMar>
+              <w:top w:w="90" w:type="dxa"/>
+              <w:start w:w="110" w:type="dxa"/>
+              <w:bottom w:w="90" w:type="dxa"/>
+              <w:end w:w="110" w:type="dxa"/>
+            </w:tcMar>
+            <w:vAlign w:val="center"/>
+          </w:tcPr>
+          <w:p>
+            <w:pPr>
+              <w:spacing w:before="0" w:after="0" w:line="259" w:lineRule="auto"/>
+              <w:jc w:val="left"/>
+            </w:pPr>
+            <w:r>
+              <w:rPr>
+                <w:rFonts w:ascii="Microsoft YaHei" w:hAnsi="Microsoft YaHei" w:eastAsia="Microsoft YaHei"/>
+                <w:b w:val="0"/>
+                <w:color w:val="000000"/>
+                <w:sz w:val="18"/>
+              </w:rPr>
+              <w:t>8</w:t>
+            </w:r>
+          </w:p>
+        </w:tc>
+      </w:tr>
+      <w:tr>
+        <w:trPr>
+          <w:cantSplit/>
+        </w:trPr>
+        <w:tc>
+          <w:tcPr>
+            <w:tcW w:type="dxa" w:w="1440"/>
+            <w:tcMar>
+              <w:top w:w="90" w:type="dxa"/>
+              <w:start w:w="110" w:type="dxa"/>
+              <w:bottom w:w="90" w:type="dxa"/>
+              <w:end w:w="110" w:type="dxa"/>
+            </w:tcMar>
+            <w:vAlign w:val="center"/>
+          </w:tcPr>
+          <w:p>
+            <w:pPr>
+              <w:spacing w:before="0" w:after="0" w:line="259" w:lineRule="auto"/>
+              <w:jc w:val="center"/>
+            </w:pPr>
+            <w:r>
+              <w:rPr>
+                <w:rFonts w:ascii="Microsoft YaHei" w:hAnsi="Microsoft YaHei" w:eastAsia="Microsoft YaHei"/>
+                <w:b w:val="0"/>
+                <w:color w:val="000000"/>
+                <w:sz w:val="18"/>
+              </w:rPr>
+              <w:t>0x0206</w:t>
+            </w:r>
+          </w:p>
+        </w:tc>
+        <w:tc>
+          <w:tcPr>
+            <w:tcW w:type="dxa" w:w="1728"/>
+            <w:tcMar>
+              <w:top w:w="90" w:type="dxa"/>
+              <w:start w:w="110" w:type="dxa"/>
+              <w:bottom w:w="90" w:type="dxa"/>
+              <w:end w:w="110" w:type="dxa"/>
+            </w:tcMar>
+            <w:vAlign w:val="center"/>
+          </w:tcPr>
+          <w:p>
+            <w:pPr>
+              <w:spacing w:before="0" w:after="0" w:line="259" w:lineRule="auto"/>
+              <w:jc w:val="center"/>
+            </w:pPr>
+            <w:r>
+              <w:rPr>
+                <w:rFonts w:ascii="Microsoft YaHei" w:hAnsi="Microsoft YaHei" w:eastAsia="Microsoft YaHei"/>
+                <w:b w:val="0"/>
+                <w:color w:val="000000"/>
+                <w:sz w:val="18"/>
+              </w:rPr>
+              <w:t>40519</w:t>
+            </w:r>
+          </w:p>
+        </w:tc>
+        <w:tc>
+          <w:tcPr>
+            <w:tcW w:type="dxa" w:w="2592"/>
+            <w:tcMar>
+              <w:top w:w="90" w:type="dxa"/>
+              <w:start w:w="110" w:type="dxa"/>
+              <w:bottom w:w="90" w:type="dxa"/>
+              <w:end w:w="110" w:type="dxa"/>
+            </w:tcMar>
+            <w:vAlign w:val="center"/>
+          </w:tcPr>
+          <w:p>
+            <w:pPr>
+              <w:spacing w:before="0" w:after="0" w:line="259" w:lineRule="auto"/>
+              <w:jc w:val="left"/>
+            </w:pPr>
+            <w:r>
+              <w:rPr>
+                <w:rFonts w:ascii="Microsoft YaHei" w:hAnsi="Microsoft YaHei" w:eastAsia="Microsoft YaHei"/>
+                <w:b w:val="0"/>
+                <w:color w:val="000000"/>
+                <w:sz w:val="18"/>
+              </w:rPr>
+              <w:t>最大频率种类</w:t>
+            </w:r>
+          </w:p>
+        </w:tc>
+        <w:tc>
+          <w:tcPr>
+            <w:tcW w:type="dxa" w:w="4320"/>
+            <w:tcMar>
+              <w:top w:w="90" w:type="dxa"/>
+              <w:start w:w="110" w:type="dxa"/>
+              <w:bottom w:w="90" w:type="dxa"/>
+              <w:end w:w="110" w:type="dxa"/>
+            </w:tcMar>
+            <w:vAlign w:val="center"/>
+          </w:tcPr>
+          <w:p>
+            <w:pPr>
+              <w:spacing w:before="0" w:after="0" w:line="259" w:lineRule="auto"/>
+              <w:jc w:val="left"/>
+            </w:pPr>
+            <w:r>
+              <w:rPr>
+                <w:rFonts w:ascii="Microsoft YaHei" w:hAnsi="Microsoft YaHei" w:eastAsia="Microsoft YaHei"/>
+                <w:b w:val="0"/>
+                <w:color w:val="000000"/>
+                <w:sz w:val="18"/>
+              </w:rPr>
+              <w:t>4</w:t>
             </w:r>
           </w:p>
         </w:tc>
@@ -10116,6 +10524,608 @@
       <w:pPr>
         <w:spacing w:after="0"/>
       </w:pPr>
+    </w:p>
+    <w:p>
+      <w:pPr>
+        <w:pStyle w:val="BodyText"/>
+        <w:keepLines w:val="0"/>
+      </w:pPr>
+      <w:r>
+        <w:rPr>
+          <w:rFonts w:ascii="Microsoft YaHei" w:hAnsi="Microsoft YaHei" w:eastAsia="Microsoft YaHei"/>
+          <w:b w:val="0"/>
+          <w:color w:val="000000"/>
+          <w:sz w:val="21"/>
+        </w:rPr>
+        <w:t>前 5 个信息寄存器保持兼容。先读 0x0200 到 0x0204，确认 bit2 后再读取 PWM 扩展。旧版 1.0 固件没有 PWM 扩展地址。</w:t>
+      </w:r>
+    </w:p>
+    <w:p>
+      <w:pPr>
+        <w:pStyle w:val="Heading2"/>
+      </w:pPr>
+      <w:r>
+        <w:t>7 4 PWM 配置</w:t>
+      </w:r>
+    </w:p>
+    <w:p>
+      <w:pPr>
+        <w:pStyle w:val="BodyText"/>
+        <w:keepLines w:val="0"/>
+      </w:pPr>
+      <w:r>
+        <w:rPr>
+          <w:rFonts w:ascii="Microsoft YaHei" w:hAnsi="Microsoft YaHei" w:eastAsia="Microsoft YaHei"/>
+          <w:b w:val="0"/>
+          <w:color w:val="000000"/>
+          <w:sz w:val="21"/>
+        </w:rPr>
+        <w:t>数字通道 N 的 PWM 记录首地址为 0x0300 + 4 × N，每条记录占 4 个寄存器。整个配置区为 0x0300 到 0x0387，传统寄存器号为 40769 到 40904。通道 31 到 33 仍受 GPIO35 到 GPIO37 构建开关限制，禁用时返回 0x02。</w:t>
+      </w:r>
+    </w:p>
+    <w:tbl>
+      <w:tblPr>
+        <w:tblW w:type="auto" w:w="0"/>
+        <w:jc w:val="center"/>
+        <w:tblLayout w:type="fixed"/>
+        <w:tblLook w:firstColumn="1" w:firstRow="1" w:lastColumn="0" w:lastRow="0" w:noHBand="0" w:noVBand="1" w:val="04A0"/>
+        <w:tblBorders>
+          <w:top w:val="single" w:sz="6" w:space="0" w:color="D9D9D9"/>
+          <w:left w:val="single" w:sz="6" w:space="0" w:color="D9D9D9"/>
+          <w:bottom w:val="single" w:sz="6" w:space="0" w:color="D9D9D9"/>
+          <w:right w:val="single" w:sz="6" w:space="0" w:color="D9D9D9"/>
+          <w:insideH w:val="single" w:sz="6" w:space="0" w:color="D9D9D9"/>
+          <w:insideV w:val="single" w:sz="6" w:space="0" w:color="D9D9D9"/>
+        </w:tblBorders>
+      </w:tblPr>
+      <w:tblGrid>
+        <w:gridCol w:w="3389"/>
+        <w:gridCol w:w="3389"/>
+        <w:gridCol w:w="3389"/>
+      </w:tblGrid>
+      <w:tr>
+        <w:trPr>
+          <w:tblHeader w:val="true"/>
+          <w:cantSplit/>
+        </w:trPr>
+        <w:tc>
+          <w:tcPr>
+            <w:tcW w:type="dxa" w:w="1007"/>
+            <w:shd w:fill="1F4E78"/>
+            <w:tcMar>
+              <w:top w:w="90" w:type="dxa"/>
+              <w:start w:w="110" w:type="dxa"/>
+              <w:bottom w:w="90" w:type="dxa"/>
+              <w:end w:w="110" w:type="dxa"/>
+            </w:tcMar>
+            <w:vAlign w:val="center"/>
+          </w:tcPr>
+          <w:p>
+            <w:pPr>
+              <w:spacing w:before="0" w:after="0"/>
+              <w:jc w:val="center"/>
+            </w:pPr>
+            <w:r>
+              <w:rPr>
+                <w:rFonts w:ascii="Microsoft YaHei" w:hAnsi="Microsoft YaHei" w:eastAsia="Microsoft YaHei"/>
+                <w:b/>
+                <w:color w:val="FFFFFF"/>
+                <w:sz w:val="18"/>
+              </w:rPr>
+              <w:t>偏移</w:t>
+            </w:r>
+          </w:p>
+        </w:tc>
+        <w:tc>
+          <w:tcPr>
+            <w:tcW w:type="dxa" w:w="2304"/>
+            <w:shd w:fill="1F4E78"/>
+            <w:tcMar>
+              <w:top w:w="90" w:type="dxa"/>
+              <w:start w:w="110" w:type="dxa"/>
+              <w:bottom w:w="90" w:type="dxa"/>
+              <w:end w:w="110" w:type="dxa"/>
+            </w:tcMar>
+            <w:vAlign w:val="center"/>
+          </w:tcPr>
+          <w:p>
+            <w:pPr>
+              <w:spacing w:before="0" w:after="0"/>
+              <w:jc w:val="center"/>
+            </w:pPr>
+            <w:r>
+              <w:rPr>
+                <w:rFonts w:ascii="Microsoft YaHei" w:hAnsi="Microsoft YaHei" w:eastAsia="Microsoft YaHei"/>
+                <w:b/>
+                <w:color w:val="FFFFFF"/>
+                <w:sz w:val="18"/>
+              </w:rPr>
+              <w:t>内容</w:t>
+            </w:r>
+          </w:p>
+        </w:tc>
+        <w:tc>
+          <w:tcPr>
+            <w:tcW w:type="dxa" w:w="6768"/>
+            <w:shd w:fill="1F4E78"/>
+            <w:tcMar>
+              <w:top w:w="90" w:type="dxa"/>
+              <w:start w:w="110" w:type="dxa"/>
+              <w:bottom w:w="90" w:type="dxa"/>
+              <w:end w:w="110" w:type="dxa"/>
+            </w:tcMar>
+            <w:vAlign w:val="center"/>
+          </w:tcPr>
+          <w:p>
+            <w:pPr>
+              <w:spacing w:before="0" w:after="0"/>
+              <w:jc w:val="center"/>
+            </w:pPr>
+            <w:r>
+              <w:rPr>
+                <w:rFonts w:ascii="Microsoft YaHei" w:hAnsi="Microsoft YaHei" w:eastAsia="Microsoft YaHei"/>
+                <w:b/>
+                <w:color w:val="FFFFFF"/>
+                <w:sz w:val="18"/>
+              </w:rPr>
+              <w:t>范围和含义</w:t>
+            </w:r>
+          </w:p>
+        </w:tc>
+      </w:tr>
+      <w:tr>
+        <w:trPr>
+          <w:cantSplit/>
+        </w:trPr>
+        <w:tc>
+          <w:tcPr>
+            <w:tcW w:type="dxa" w:w="1007"/>
+            <w:tcMar>
+              <w:top w:w="90" w:type="dxa"/>
+              <w:start w:w="110" w:type="dxa"/>
+              <w:bottom w:w="90" w:type="dxa"/>
+              <w:end w:w="110" w:type="dxa"/>
+            </w:tcMar>
+            <w:vAlign w:val="center"/>
+          </w:tcPr>
+          <w:p>
+            <w:pPr>
+              <w:spacing w:before="0" w:after="0" w:line="259" w:lineRule="auto"/>
+              <w:jc w:val="center"/>
+            </w:pPr>
+            <w:r>
+              <w:rPr>
+                <w:rFonts w:ascii="Microsoft YaHei" w:hAnsi="Microsoft YaHei" w:eastAsia="Microsoft YaHei"/>
+                <w:b w:val="0"/>
+                <w:color w:val="000000"/>
+                <w:sz w:val="18"/>
+              </w:rPr>
+              <w:t>+0</w:t>
+            </w:r>
+          </w:p>
+        </w:tc>
+        <w:tc>
+          <w:tcPr>
+            <w:tcW w:type="dxa" w:w="2304"/>
+            <w:tcMar>
+              <w:top w:w="90" w:type="dxa"/>
+              <w:start w:w="110" w:type="dxa"/>
+              <w:bottom w:w="90" w:type="dxa"/>
+              <w:end w:w="110" w:type="dxa"/>
+            </w:tcMar>
+            <w:vAlign w:val="center"/>
+          </w:tcPr>
+          <w:p>
+            <w:pPr>
+              <w:spacing w:before="0" w:after="0" w:line="259" w:lineRule="auto"/>
+              <w:jc w:val="left"/>
+            </w:pPr>
+            <w:r>
+              <w:rPr>
+                <w:rFonts w:ascii="Microsoft YaHei" w:hAnsi="Microsoft YaHei" w:eastAsia="Microsoft YaHei"/>
+                <w:b w:val="0"/>
+                <w:color w:val="000000"/>
+                <w:sz w:val="18"/>
+              </w:rPr>
+              <w:t>频率高 16 位</w:t>
+            </w:r>
+          </w:p>
+        </w:tc>
+        <w:tc>
+          <w:tcPr>
+            <w:tcW w:type="dxa" w:w="6768"/>
+            <w:tcMar>
+              <w:top w:w="90" w:type="dxa"/>
+              <w:start w:w="110" w:type="dxa"/>
+              <w:bottom w:w="90" w:type="dxa"/>
+              <w:end w:w="110" w:type="dxa"/>
+            </w:tcMar>
+            <w:vAlign w:val="center"/>
+          </w:tcPr>
+          <w:p>
+            <w:pPr>
+              <w:spacing w:before="0" w:after="0" w:line="259" w:lineRule="auto"/>
+              <w:jc w:val="left"/>
+            </w:pPr>
+            <w:r>
+              <w:rPr>
+                <w:rFonts w:ascii="Microsoft YaHei" w:hAnsi="Microsoft YaHei" w:eastAsia="Microsoft YaHei"/>
+                <w:b w:val="0"/>
+                <w:color w:val="000000"/>
+                <w:sz w:val="18"/>
+              </w:rPr>
+              <w:t>与低字拼为 32 位无符号整数，单位 Hz</w:t>
+            </w:r>
+          </w:p>
+        </w:tc>
+      </w:tr>
+      <w:tr>
+        <w:trPr>
+          <w:cantSplit/>
+        </w:trPr>
+        <w:tc>
+          <w:tcPr>
+            <w:tcW w:type="dxa" w:w="1007"/>
+            <w:shd w:fill="EAF2F8"/>
+            <w:tcMar>
+              <w:top w:w="90" w:type="dxa"/>
+              <w:start w:w="110" w:type="dxa"/>
+              <w:bottom w:w="90" w:type="dxa"/>
+              <w:end w:w="110" w:type="dxa"/>
+            </w:tcMar>
+            <w:vAlign w:val="center"/>
+          </w:tcPr>
+          <w:p>
+            <w:pPr>
+              <w:spacing w:before="0" w:after="0" w:line="259" w:lineRule="auto"/>
+              <w:jc w:val="center"/>
+            </w:pPr>
+            <w:r>
+              <w:rPr>
+                <w:rFonts w:ascii="Microsoft YaHei" w:hAnsi="Microsoft YaHei" w:eastAsia="Microsoft YaHei"/>
+                <w:b w:val="0"/>
+                <w:color w:val="000000"/>
+                <w:sz w:val="18"/>
+              </w:rPr>
+              <w:t>+1</w:t>
+            </w:r>
+          </w:p>
+        </w:tc>
+        <w:tc>
+          <w:tcPr>
+            <w:tcW w:type="dxa" w:w="2304"/>
+            <w:shd w:fill="EAF2F8"/>
+            <w:tcMar>
+              <w:top w:w="90" w:type="dxa"/>
+              <w:start w:w="110" w:type="dxa"/>
+              <w:bottom w:w="90" w:type="dxa"/>
+              <w:end w:w="110" w:type="dxa"/>
+            </w:tcMar>
+            <w:vAlign w:val="center"/>
+          </w:tcPr>
+          <w:p>
+            <w:pPr>
+              <w:spacing w:before="0" w:after="0" w:line="259" w:lineRule="auto"/>
+              <w:jc w:val="left"/>
+            </w:pPr>
+            <w:r>
+              <w:rPr>
+                <w:rFonts w:ascii="Microsoft YaHei" w:hAnsi="Microsoft YaHei" w:eastAsia="Microsoft YaHei"/>
+                <w:b w:val="0"/>
+                <w:color w:val="000000"/>
+                <w:sz w:val="18"/>
+              </w:rPr>
+              <w:t>频率低 16 位</w:t>
+            </w:r>
+          </w:p>
+        </w:tc>
+        <w:tc>
+          <w:tcPr>
+            <w:tcW w:type="dxa" w:w="6768"/>
+            <w:shd w:fill="EAF2F8"/>
+            <w:tcMar>
+              <w:top w:w="90" w:type="dxa"/>
+              <w:start w:w="110" w:type="dxa"/>
+              <w:bottom w:w="90" w:type="dxa"/>
+              <w:end w:w="110" w:type="dxa"/>
+            </w:tcMar>
+            <w:vAlign w:val="center"/>
+          </w:tcPr>
+          <w:p>
+            <w:pPr>
+              <w:spacing w:before="0" w:after="0" w:line="259" w:lineRule="auto"/>
+              <w:jc w:val="left"/>
+            </w:pPr>
+            <w:r>
+              <w:rPr>
+                <w:rFonts w:ascii="Microsoft YaHei" w:hAnsi="Microsoft YaHei" w:eastAsia="Microsoft YaHei"/>
+                <w:b w:val="0"/>
+                <w:color w:val="000000"/>
+                <w:sz w:val="18"/>
+              </w:rPr>
+              <w:t>合成频率为 10 到 100000 Hz</w:t>
+            </w:r>
+          </w:p>
+        </w:tc>
+      </w:tr>
+      <w:tr>
+        <w:trPr>
+          <w:cantSplit/>
+        </w:trPr>
+        <w:tc>
+          <w:tcPr>
+            <w:tcW w:type="dxa" w:w="1007"/>
+            <w:tcMar>
+              <w:top w:w="90" w:type="dxa"/>
+              <w:start w:w="110" w:type="dxa"/>
+              <w:bottom w:w="90" w:type="dxa"/>
+              <w:end w:w="110" w:type="dxa"/>
+            </w:tcMar>
+            <w:vAlign w:val="center"/>
+          </w:tcPr>
+          <w:p>
+            <w:pPr>
+              <w:spacing w:before="0" w:after="0" w:line="259" w:lineRule="auto"/>
+              <w:jc w:val="center"/>
+            </w:pPr>
+            <w:r>
+              <w:rPr>
+                <w:rFonts w:ascii="Microsoft YaHei" w:hAnsi="Microsoft YaHei" w:eastAsia="Microsoft YaHei"/>
+                <w:b w:val="0"/>
+                <w:color w:val="000000"/>
+                <w:sz w:val="18"/>
+              </w:rPr>
+              <w:t>+2</w:t>
+            </w:r>
+          </w:p>
+        </w:tc>
+        <w:tc>
+          <w:tcPr>
+            <w:tcW w:type="dxa" w:w="2304"/>
+            <w:tcMar>
+              <w:top w:w="90" w:type="dxa"/>
+              <w:start w:w="110" w:type="dxa"/>
+              <w:bottom w:w="90" w:type="dxa"/>
+              <w:end w:w="110" w:type="dxa"/>
+            </w:tcMar>
+            <w:vAlign w:val="center"/>
+          </w:tcPr>
+          <w:p>
+            <w:pPr>
+              <w:spacing w:before="0" w:after="0" w:line="259" w:lineRule="auto"/>
+              <w:jc w:val="left"/>
+            </w:pPr>
+            <w:r>
+              <w:rPr>
+                <w:rFonts w:ascii="Microsoft YaHei" w:hAnsi="Microsoft YaHei" w:eastAsia="Microsoft YaHei"/>
+                <w:b w:val="0"/>
+                <w:color w:val="000000"/>
+                <w:sz w:val="18"/>
+              </w:rPr>
+              <w:t>占空比</w:t>
+            </w:r>
+          </w:p>
+        </w:tc>
+        <w:tc>
+          <w:tcPr>
+            <w:tcW w:type="dxa" w:w="6768"/>
+            <w:tcMar>
+              <w:top w:w="90" w:type="dxa"/>
+              <w:start w:w="110" w:type="dxa"/>
+              <w:bottom w:w="90" w:type="dxa"/>
+              <w:end w:w="110" w:type="dxa"/>
+            </w:tcMar>
+            <w:vAlign w:val="center"/>
+          </w:tcPr>
+          <w:p>
+            <w:pPr>
+              <w:spacing w:before="0" w:after="0" w:line="259" w:lineRule="auto"/>
+              <w:jc w:val="left"/>
+            </w:pPr>
+            <w:r>
+              <w:rPr>
+                <w:rFonts w:ascii="Microsoft YaHei" w:hAnsi="Microsoft YaHei" w:eastAsia="Microsoft YaHei"/>
+                <w:b w:val="0"/>
+                <w:color w:val="000000"/>
+                <w:sz w:val="18"/>
+              </w:rPr>
+              <w:t>0 到 10000；每单位 0.01%；5000 表示 50%</w:t>
+            </w:r>
+          </w:p>
+        </w:tc>
+      </w:tr>
+      <w:tr>
+        <w:trPr>
+          <w:cantSplit/>
+        </w:trPr>
+        <w:tc>
+          <w:tcPr>
+            <w:tcW w:type="dxa" w:w="1007"/>
+            <w:shd w:fill="EAF2F8"/>
+            <w:tcMar>
+              <w:top w:w="90" w:type="dxa"/>
+              <w:start w:w="110" w:type="dxa"/>
+              <w:bottom w:w="90" w:type="dxa"/>
+              <w:end w:w="110" w:type="dxa"/>
+            </w:tcMar>
+            <w:vAlign w:val="center"/>
+          </w:tcPr>
+          <w:p>
+            <w:pPr>
+              <w:spacing w:before="0" w:after="0" w:line="259" w:lineRule="auto"/>
+              <w:jc w:val="center"/>
+            </w:pPr>
+            <w:r>
+              <w:rPr>
+                <w:rFonts w:ascii="Microsoft YaHei" w:hAnsi="Microsoft YaHei" w:eastAsia="Microsoft YaHei"/>
+                <w:b w:val="0"/>
+                <w:color w:val="000000"/>
+                <w:sz w:val="18"/>
+              </w:rPr>
+              <w:t>+3</w:t>
+            </w:r>
+          </w:p>
+        </w:tc>
+        <w:tc>
+          <w:tcPr>
+            <w:tcW w:type="dxa" w:w="2304"/>
+            <w:shd w:fill="EAF2F8"/>
+            <w:tcMar>
+              <w:top w:w="90" w:type="dxa"/>
+              <w:start w:w="110" w:type="dxa"/>
+              <w:bottom w:w="90" w:type="dxa"/>
+              <w:end w:w="110" w:type="dxa"/>
+            </w:tcMar>
+            <w:vAlign w:val="center"/>
+          </w:tcPr>
+          <w:p>
+            <w:pPr>
+              <w:spacing w:before="0" w:after="0" w:line="259" w:lineRule="auto"/>
+              <w:jc w:val="left"/>
+            </w:pPr>
+            <w:r>
+              <w:rPr>
+                <w:rFonts w:ascii="Microsoft YaHei" w:hAnsi="Microsoft YaHei" w:eastAsia="Microsoft YaHei"/>
+                <w:b w:val="0"/>
+                <w:color w:val="000000"/>
+                <w:sz w:val="18"/>
+              </w:rPr>
+              <w:t>使能</w:t>
+            </w:r>
+          </w:p>
+        </w:tc>
+        <w:tc>
+          <w:tcPr>
+            <w:tcW w:type="dxa" w:w="6768"/>
+            <w:shd w:fill="EAF2F8"/>
+            <w:tcMar>
+              <w:top w:w="90" w:type="dxa"/>
+              <w:start w:w="110" w:type="dxa"/>
+              <w:bottom w:w="90" w:type="dxa"/>
+              <w:end w:w="110" w:type="dxa"/>
+            </w:tcMar>
+            <w:vAlign w:val="center"/>
+          </w:tcPr>
+          <w:p>
+            <w:pPr>
+              <w:spacing w:before="0" w:after="0" w:line="259" w:lineRule="auto"/>
+              <w:jc w:val="left"/>
+            </w:pPr>
+            <w:r>
+              <w:rPr>
+                <w:rFonts w:ascii="Microsoft YaHei" w:hAnsi="Microsoft YaHei" w:eastAsia="Microsoft YaHei"/>
+                <w:b w:val="0"/>
+                <w:color w:val="000000"/>
+                <w:sz w:val="18"/>
+              </w:rPr>
+              <w:t>0 停止，1 启动；回读表示当前 PWM 状态</w:t>
+            </w:r>
+          </w:p>
+        </w:tc>
+      </w:tr>
+    </w:tbl>
+    <w:p>
+      <w:pPr>
+        <w:spacing w:after="0"/>
+      </w:pPr>
+    </w:p>
+    <w:p>
+      <w:pPr>
+        <w:pStyle w:val="BodyText"/>
+        <w:keepLines w:val="0"/>
+      </w:pPr>
+      <w:r>
+        <w:rPr>
+          <w:rFonts w:ascii="Microsoft YaHei" w:hAnsi="Microsoft YaHei" w:eastAsia="Microsoft YaHei"/>
+          <w:b w:val="0"/>
+          <w:color w:val="000000"/>
+          <w:sz w:val="21"/>
+        </w:rPr>
+        <w:t>频率等于高字 × 65536 + 低字。1000 Hz 编码为 0x0000 0x03E8，100000 Hz 编码为 0x0001 0x86A0。每个寄存器内部高字节在前。读功能码 0x03 可读取单个字段或连续字段。</w:t>
+      </w:r>
+    </w:p>
+    <w:p>
+      <w:pPr>
+        <w:pStyle w:val="BodyText"/>
+        <w:keepLines w:val="0"/>
+      </w:pPr>
+      <w:r>
+        <w:rPr>
+          <w:rFonts w:ascii="Microsoft YaHei" w:hAnsi="Microsoft YaHei" w:eastAsia="Microsoft YaHei"/>
+          <w:b w:val="0"/>
+          <w:color w:val="000000"/>
+          <w:sz w:val="21"/>
+        </w:rPr>
+        <w:t>写功能码 0x10 必须从记录首地址开始，数量为 4、字节数为 8，一次提交频率、占空比和使能。禁止部分写或跨记录写；0x06 写 PWM 配置返回 0x03。参数超范围、使能不是 0 或 1 时，也返回 0x03。</w:t>
+      </w:r>
+    </w:p>
+    <w:p>
+      <w:pPr>
+        <w:pStyle w:val="BodyText"/>
+        <w:keepLines w:val="0"/>
+      </w:pPr>
+      <w:r>
+        <w:rPr>
+          <w:rFonts w:ascii="Microsoft YaHei" w:hAnsi="Microsoft YaHei" w:eastAsia="Microsoft YaHei"/>
+          <w:b w:val="0"/>
+          <w:color w:val="000000"/>
+          <w:sz w:val="21"/>
+        </w:rPr>
+        <w:t>使能为 1 时应用参数并进入模式 5。使能为 0 时保存参数；若通道原来为 PWM，则停止并切换为浮空输入，其他模式保持原样。停止后的参数可再次通过模式 5 启动。参数只保存在内存中，重启后 GPIO 恢复浮空输入，PWM 全部关闭，各通道 PWM 配置恢复为 1000 Hz、50%。</w:t>
+      </w:r>
+    </w:p>
+    <w:p>
+      <w:pPr>
+        <w:pStyle w:val="Heading2"/>
+      </w:pPr>
+      <w:r>
+        <w:t>7 5 PWM 资源和精度</w:t>
+      </w:r>
+    </w:p>
+    <w:p>
+      <w:pPr>
+        <w:pStyle w:val="BodyText"/>
+        <w:keepLines w:val="0"/>
+      </w:pPr>
+      <w:r>
+        <w:rPr>
+          <w:rFonts w:ascii="Microsoft YaHei" w:hAnsi="Microsoft YaHei" w:eastAsia="Microsoft YaHei"/>
+          <w:b w:val="0"/>
+          <w:color w:val="000000"/>
+          <w:sz w:val="21"/>
+        </w:rPr>
+        <w:t>LEDC 硬件最多同时输出 8 路、使用 4 种频率。同频通道共享定时器，占空比独立。修改其中一路的占空比不会修改其他通道；不同频率需要另一只定时器。资源不足返回 0x06，资源检查阶段保持原有输出。可使用已有频率，或先停止不再使用的输出以释放资源。</w:t>
+      </w:r>
+    </w:p>
+    <w:p>
+      <w:pPr>
+        <w:pStyle w:val="BodyText"/>
+        <w:keepLines w:val="0"/>
+      </w:pPr>
+      <w:r>
+        <w:rPr>
+          <w:rFonts w:ascii="Microsoft YaHei" w:hAnsi="Microsoft YaHei" w:eastAsia="Microsoft YaHei"/>
+          <w:b w:val="0"/>
+          <w:color w:val="000000"/>
+          <w:sz w:val="21"/>
+        </w:rPr>
+        <w:t>时钟源为 40 MHz XTAL，驱动按频率选择 8 到 14 位计数分辨率。0.01% 是协议输入步进，实际占空比会量化到硬件刻度；频率越高，可用分辨率越低。实际频率也有分频量化误差。回读返回请求参数，不是波形测量值。0% 常低、100% 常高，两者仍占用 PWM 资源。</w:t>
+      </w:r>
+    </w:p>
+    <w:p>
+      <w:pPr>
+        <w:pStyle w:val="BodyText"/>
+        <w:keepLines w:val="0"/>
+      </w:pPr>
+      <w:r>
+        <w:rPr>
+          <w:rFonts w:ascii="Microsoft YaHei" w:hAnsi="Microsoft YaHei" w:eastAsia="Microsoft YaHei"/>
+          <w:b w:val="0"/>
+          <w:color w:val="000000"/>
+          <w:sz w:val="21"/>
+        </w:rPr>
+        <w:t>PWM 是 3.3 V 数字脉冲，不是 DAC 模拟电压。外部电路需要平滑电压时应按负载设计滤波和缓冲；需要精确频率、占空比或切换时序时，应在目标板上用示波器核验。</w:t>
+      </w:r>
     </w:p>
     <w:p>
       <w:pPr>
@@ -10167,7 +11177,7 @@
           <w:color w:val="000000"/>
           <w:sz w:val="21"/>
         </w:rPr>
-        <w:t>功能码 0x03 和 0x04 的寄存器按高字节在前排列。0x06 只允许写 GPIO 模式地址。</w:t>
+        <w:t>功能码 0x03 和 0x04 的寄存器按高字节在前排列。0x06 只允许写 GPIO 模式地址，包括模式 5；写 PWM 配置返回 0x03。</w:t>
       </w:r>
     </w:p>
     <w:p>
@@ -10182,7 +11192,22 @@
           <w:color w:val="000000"/>
           <w:sz w:val="21"/>
         </w:rPr>
-        <w:t>功能码 0x0F 按最低位优先携带线圈值。0x10 的每个模式占 2 字节。固件先验证完整请求，再执行批量写。</w:t>
+        <w:t>功能码 0x0F 按最低位优先携带线圈值。0x10 的每个寄存器占 2 字节。固件先验证完整请求，再执行批量写。成功响应回显起始地址和数量。</w:t>
+      </w:r>
+    </w:p>
+    <w:p>
+      <w:pPr>
+        <w:pStyle w:val="BodyText"/>
+        <w:keepLines w:val="0"/>
+      </w:pPr>
+      <w:r>
+        <w:rPr>
+          <w:rFonts w:ascii="Microsoft YaHei" w:hAnsi="Microsoft YaHei" w:eastAsia="Microsoft YaHei"/>
+          <w:b w:val="0"/>
+          <w:color w:val="000000"/>
+          <w:sz w:val="21"/>
+        </w:rPr>
+        <w:t>GPIO 模式区的 0x10 写入只要包含模式 5，数量就必须为 1；多通道模式请求含模式 5 时，整条返回 0x03，不会部分启动。模式 0 到 4 仍可批量写。PWM 配置区的 0x10 只接受单条对齐的完整 4 寄存器记录。需要启动多路 PWM 时逐路配置并检查响应。</w:t>
       </w:r>
     </w:p>
     <w:p>
@@ -10559,7 +11584,7 @@
                 <w:color w:val="000000"/>
                 <w:sz w:val="18"/>
               </w:rPr>
-              <w:t>数量、字节数、线圈编码或模式值无效</w:t>
+              <w:t>数量、字节数、线圈、模式或 PWM 参数和格式无效</w:t>
             </w:r>
           </w:p>
         </w:tc>
@@ -10648,7 +11673,93 @@
                 <w:color w:val="000000"/>
                 <w:sz w:val="18"/>
               </w:rPr>
-              <w:t>模式冲突或底层 GPIO ADC 操作失败</w:t>
+              <w:t>模式冲突或底层 GPIO ADC PWM 操作失败</w:t>
+            </w:r>
+          </w:p>
+        </w:tc>
+      </w:tr>
+      <w:tr>
+        <w:trPr>
+          <w:cantSplit/>
+        </w:trPr>
+        <w:tc>
+          <w:tcPr>
+            <w:tcW w:type="dxa" w:w="1440"/>
+            <w:tcMar>
+              <w:top w:w="90" w:type="dxa"/>
+              <w:start w:w="110" w:type="dxa"/>
+              <w:bottom w:w="90" w:type="dxa"/>
+              <w:end w:w="110" w:type="dxa"/>
+            </w:tcMar>
+            <w:vAlign w:val="center"/>
+          </w:tcPr>
+          <w:p>
+            <w:pPr>
+              <w:spacing w:before="0" w:after="0" w:line="259" w:lineRule="auto"/>
+              <w:jc w:val="center"/>
+            </w:pPr>
+            <w:r>
+              <w:rPr>
+                <w:rFonts w:ascii="Microsoft YaHei" w:hAnsi="Microsoft YaHei" w:eastAsia="Microsoft YaHei"/>
+                <w:b w:val="0"/>
+                <w:color w:val="000000"/>
+                <w:sz w:val="18"/>
+              </w:rPr>
+              <w:t>0x06</w:t>
+            </w:r>
+          </w:p>
+        </w:tc>
+        <w:tc>
+          <w:tcPr>
+            <w:tcW w:type="dxa" w:w="3024"/>
+            <w:tcMar>
+              <w:top w:w="90" w:type="dxa"/>
+              <w:start w:w="110" w:type="dxa"/>
+              <w:bottom w:w="90" w:type="dxa"/>
+              <w:end w:w="110" w:type="dxa"/>
+            </w:tcMar>
+            <w:vAlign w:val="center"/>
+          </w:tcPr>
+          <w:p>
+            <w:pPr>
+              <w:spacing w:before="0" w:after="0" w:line="259" w:lineRule="auto"/>
+              <w:jc w:val="left"/>
+            </w:pPr>
+            <w:r>
+              <w:rPr>
+                <w:rFonts w:ascii="Microsoft YaHei" w:hAnsi="Microsoft YaHei" w:eastAsia="Microsoft YaHei"/>
+                <w:b w:val="0"/>
+                <w:color w:val="000000"/>
+                <w:sz w:val="18"/>
+              </w:rPr>
+              <w:t>Server Device Busy</w:t>
+            </w:r>
+          </w:p>
+        </w:tc>
+        <w:tc>
+          <w:tcPr>
+            <w:tcW w:type="dxa" w:w="5616"/>
+            <w:tcMar>
+              <w:top w:w="90" w:type="dxa"/>
+              <w:start w:w="110" w:type="dxa"/>
+              <w:bottom w:w="90" w:type="dxa"/>
+              <w:end w:w="110" w:type="dxa"/>
+            </w:tcMar>
+            <w:vAlign w:val="center"/>
+          </w:tcPr>
+          <w:p>
+            <w:pPr>
+              <w:spacing w:before="0" w:after="0" w:line="259" w:lineRule="auto"/>
+              <w:jc w:val="left"/>
+            </w:pPr>
+            <w:r>
+              <w:rPr>
+                <w:rFonts w:ascii="Microsoft YaHei" w:hAnsi="Microsoft YaHei" w:eastAsia="Microsoft YaHei"/>
+                <w:b w:val="0"/>
+                <w:color w:val="000000"/>
+                <w:sz w:val="18"/>
+              </w:rPr>
+              <w:t>PWM 通道或定时器资源不足</w:t>
             </w:r>
           </w:p>
         </w:tc>
@@ -11060,6 +12171,195 @@
     </w:p>
     <w:p>
       <w:pPr>
+        <w:pStyle w:val="BodyText"/>
+        <w:keepNext/>
+        <w:keepLines w:val="0"/>
+      </w:pPr>
+      <w:r>
+        <w:rPr>
+          <w:rFonts w:ascii="Microsoft YaHei" w:hAnsi="Microsoft YaHei" w:eastAsia="Microsoft YaHei"/>
+          <w:b/>
+          <w:color w:val="000000"/>
+          <w:sz w:val="21"/>
+        </w:rPr>
+        <w:t>通道 1 GPIO1 设置 1000 Hz、50% 并启动 PWM</w:t>
+      </w:r>
+      <w:r>
+        <w:rPr>
+          <w:rFonts w:ascii="Microsoft YaHei" w:hAnsi="Microsoft YaHei" w:eastAsia="Microsoft YaHei"/>
+          <w:b w:val="0"/>
+          <w:color w:val="000000"/>
+          <w:sz w:val="21"/>
+        </w:rPr>
+      </w:r>
+    </w:p>
+    <w:p>
+      <w:pPr>
+        <w:pStyle w:val="Code"/>
+        <w:keepLines/>
+        <w:spacing w:before="0" w:after="0"/>
+        <w:shd w:fill="F3F5F7"/>
+      </w:pPr>
+      <w:r>
+        <w:rPr>
+          <w:rFonts w:ascii="Cascadia Mono" w:hAnsi="Cascadia Mono" w:eastAsia="Cascadia Mono"/>
+          <w:b w:val="0"/>
+          <w:color w:val="000000"/>
+          <w:sz w:val="18"/>
+        </w:rPr>
+        <w:t>请求  01 10 03 04 00 04 08 00 00 03 E8 13 88 00 01 67 3C</w:t>
+      </w:r>
+    </w:p>
+    <w:p>
+      <w:pPr>
+        <w:pStyle w:val="Code"/>
+        <w:keepLines/>
+        <w:spacing w:before="0" w:after="0"/>
+        <w:shd w:fill="F3F5F7"/>
+      </w:pPr>
+      <w:r>
+        <w:rPr>
+          <w:rFonts w:ascii="Cascadia Mono" w:hAnsi="Cascadia Mono" w:eastAsia="Cascadia Mono"/>
+          <w:b w:val="0"/>
+          <w:color w:val="000000"/>
+          <w:sz w:val="18"/>
+        </w:rPr>
+        <w:t>响应  01 10 03 04 00 04 80 4F</w:t>
+      </w:r>
+    </w:p>
+    <w:p>
+      <w:pPr>
+        <w:spacing w:after="0"/>
+      </w:pPr>
+    </w:p>
+    <w:p>
+      <w:pPr>
+        <w:pStyle w:val="BodyText"/>
+        <w:keepNext/>
+        <w:keepLines w:val="0"/>
+      </w:pPr>
+      <w:r>
+        <w:rPr>
+          <w:rFonts w:ascii="Microsoft YaHei" w:hAnsi="Microsoft YaHei" w:eastAsia="Microsoft YaHei"/>
+          <w:b/>
+          <w:color w:val="000000"/>
+          <w:sz w:val="21"/>
+        </w:rPr>
+        <w:t>读取通道 1 PWM 配置，响应对应上例启动后的状态</w:t>
+      </w:r>
+      <w:r>
+        <w:rPr>
+          <w:rFonts w:ascii="Microsoft YaHei" w:hAnsi="Microsoft YaHei" w:eastAsia="Microsoft YaHei"/>
+          <w:b w:val="0"/>
+          <w:color w:val="000000"/>
+          <w:sz w:val="21"/>
+        </w:rPr>
+      </w:r>
+    </w:p>
+    <w:p>
+      <w:pPr>
+        <w:pStyle w:val="Code"/>
+        <w:keepLines/>
+        <w:spacing w:before="0" w:after="0"/>
+        <w:shd w:fill="F3F5F7"/>
+      </w:pPr>
+      <w:r>
+        <w:rPr>
+          <w:rFonts w:ascii="Cascadia Mono" w:hAnsi="Cascadia Mono" w:eastAsia="Cascadia Mono"/>
+          <w:b w:val="0"/>
+          <w:color w:val="000000"/>
+          <w:sz w:val="18"/>
+        </w:rPr>
+        <w:t>请求  01 03 03 04 00 04 05 8C</w:t>
+      </w:r>
+    </w:p>
+    <w:p>
+      <w:pPr>
+        <w:pStyle w:val="Code"/>
+        <w:keepLines/>
+        <w:spacing w:before="0" w:after="0"/>
+        <w:shd w:fill="F3F5F7"/>
+      </w:pPr>
+      <w:r>
+        <w:rPr>
+          <w:rFonts w:ascii="Cascadia Mono" w:hAnsi="Cascadia Mono" w:eastAsia="Cascadia Mono"/>
+          <w:b w:val="0"/>
+          <w:color w:val="000000"/>
+          <w:sz w:val="18"/>
+        </w:rPr>
+        <w:t>响应  01 03 08 00 00 03 E8 13 88 00 01 B0 9D</w:t>
+      </w:r>
+    </w:p>
+    <w:p>
+      <w:pPr>
+        <w:spacing w:after="0"/>
+      </w:pPr>
+    </w:p>
+    <w:p>
+      <w:pPr>
+        <w:pStyle w:val="BodyText"/>
+        <w:keepNext/>
+        <w:keepLines w:val="0"/>
+      </w:pPr>
+      <w:r>
+        <w:rPr>
+          <w:rFonts w:ascii="Microsoft YaHei" w:hAnsi="Microsoft YaHei" w:eastAsia="Microsoft YaHei"/>
+          <w:b/>
+          <w:color w:val="000000"/>
+          <w:sz w:val="21"/>
+        </w:rPr>
+        <w:t>停止通道 1 PWM，恢复浮空输入并保留参数</w:t>
+      </w:r>
+      <w:r>
+        <w:rPr>
+          <w:rFonts w:ascii="Microsoft YaHei" w:hAnsi="Microsoft YaHei" w:eastAsia="Microsoft YaHei"/>
+          <w:b w:val="0"/>
+          <w:color w:val="000000"/>
+          <w:sz w:val="21"/>
+        </w:rPr>
+      </w:r>
+    </w:p>
+    <w:p>
+      <w:pPr>
+        <w:pStyle w:val="Code"/>
+        <w:keepLines/>
+        <w:spacing w:before="0" w:after="0"/>
+        <w:shd w:fill="F3F5F7"/>
+      </w:pPr>
+      <w:r>
+        <w:rPr>
+          <w:rFonts w:ascii="Cascadia Mono" w:hAnsi="Cascadia Mono" w:eastAsia="Cascadia Mono"/>
+          <w:b w:val="0"/>
+          <w:color w:val="000000"/>
+          <w:sz w:val="18"/>
+        </w:rPr>
+        <w:t>请求  01 10 03 04 00 04 08 00 00 03 E8 13 88 00 00 A6 FC</w:t>
+      </w:r>
+    </w:p>
+    <w:p>
+      <w:pPr>
+        <w:pStyle w:val="Code"/>
+        <w:keepLines/>
+        <w:spacing w:before="0" w:after="0"/>
+        <w:shd w:fill="F3F5F7"/>
+      </w:pPr>
+      <w:r>
+        <w:rPr>
+          <w:rFonts w:ascii="Cascadia Mono" w:hAnsi="Cascadia Mono" w:eastAsia="Cascadia Mono"/>
+          <w:b w:val="0"/>
+          <w:color w:val="000000"/>
+          <w:sz w:val="18"/>
+        </w:rPr>
+        <w:t>响应  01 10 03 04 00 04 80 4F</w:t>
+      </w:r>
+    </w:p>
+    <w:p>
+      <w:pPr>
+        <w:spacing w:after="0"/>
+      </w:pPr>
+    </w:p>
+    <w:p>
+      <w:pPr>
         <w:pStyle w:val="Heading1"/>
       </w:pPr>
       <w:r>
@@ -11219,8 +12519,106 @@
     </w:p>
     <w:p>
       <w:pPr>
+        <w:pStyle w:val="Code"/>
+        <w:keepLines/>
+        <w:spacing w:before="0" w:after="0"/>
+        <w:shd w:fill="F3F5F7"/>
+      </w:pPr>
+      <w:r>
+        <w:rPr>
+          <w:rFonts w:ascii="Cascadia Mono" w:hAnsi="Cascadia Mono" w:eastAsia="Cascadia Mono"/>
+          <w:b w:val="0"/>
+          <w:color w:val="000000"/>
+          <w:sz w:val="18"/>
+        </w:rPr>
+        <w:t>python tools/modbus_usb_client.py --port COM8 pwm-set 1 1000 50</w:t>
+      </w:r>
+    </w:p>
+    <w:p>
+      <w:pPr>
+        <w:pStyle w:val="Code"/>
+        <w:keepLines/>
+        <w:spacing w:before="0" w:after="0"/>
+        <w:shd w:fill="F3F5F7"/>
+      </w:pPr>
+      <w:r>
+        <w:rPr>
+          <w:rFonts w:ascii="Cascadia Mono" w:hAnsi="Cascadia Mono" w:eastAsia="Cascadia Mono"/>
+          <w:b w:val="0"/>
+          <w:color w:val="000000"/>
+          <w:sz w:val="18"/>
+        </w:rPr>
+        <w:t>python tools/modbus_usb_client.py --port COM8 pwm-read 1</w:t>
+      </w:r>
+    </w:p>
+    <w:p>
+      <w:pPr>
+        <w:pStyle w:val="Code"/>
+        <w:keepLines/>
+        <w:spacing w:before="0" w:after="0"/>
+        <w:shd w:fill="F3F5F7"/>
+      </w:pPr>
+      <w:r>
+        <w:rPr>
+          <w:rFonts w:ascii="Cascadia Mono" w:hAnsi="Cascadia Mono" w:eastAsia="Cascadia Mono"/>
+          <w:b w:val="0"/>
+          <w:color w:val="000000"/>
+          <w:sz w:val="18"/>
+        </w:rPr>
+        <w:t>python tools/modbus_usb_client.py --port COM8 pwm-stop 1</w:t>
+      </w:r>
+    </w:p>
+    <w:p>
+      <w:pPr>
+        <w:pStyle w:val="Code"/>
+        <w:keepLines/>
+        <w:spacing w:before="0" w:after="0"/>
+        <w:shd w:fill="F3F5F7"/>
+      </w:pPr>
+      <w:r>
+        <w:rPr>
+          <w:rFonts w:ascii="Cascadia Mono" w:hAnsi="Cascadia Mono" w:eastAsia="Cascadia Mono"/>
+          <w:b w:val="0"/>
+          <w:color w:val="000000"/>
+          <w:sz w:val="18"/>
+        </w:rPr>
+        <w:t>python tools/modbus_usb_client.py --port COM8 pwm-set 1 1000 25 --disabled</w:t>
+      </w:r>
+    </w:p>
+    <w:p>
+      <w:pPr>
         <w:spacing w:after="0"/>
       </w:pPr>
+    </w:p>
+    <w:p>
+      <w:pPr>
+        <w:pStyle w:val="BodyText"/>
+        <w:keepLines w:val="0"/>
+      </w:pPr>
+      <w:r>
+        <w:rPr>
+          <w:rFonts w:ascii="Microsoft YaHei" w:hAnsi="Microsoft YaHei" w:eastAsia="Microsoft YaHei"/>
+          <w:b w:val="0"/>
+          <w:color w:val="000000"/>
+          <w:sz w:val="21"/>
+        </w:rPr>
+        <w:t>pwm-set 参数依次为数字通道号、整数频率 Hz、占空比百分数，支持如 12.34 的占空比。默认启动；--disabled 保存配置但不启动，并停止当前通道已有 PWM。pwm-read 回读配置和使能，pwm-stop 停止并保留参数。</w:t>
+      </w:r>
+    </w:p>
+    <w:p>
+      <w:pPr>
+        <w:pStyle w:val="BodyText"/>
+        <w:keepLines w:val="0"/>
+      </w:pPr>
+      <w:r>
+        <w:rPr>
+          <w:rFonts w:ascii="Microsoft YaHei" w:hAnsi="Microsoft YaHei" w:eastAsia="Microsoft YaHei"/>
+          <w:b w:val="0"/>
+          <w:color w:val="000000"/>
+          <w:sz w:val="21"/>
+        </w:rPr>
+        <w:t>图形上位机 tools/modbus_usb_gui.py 的 PWM 页面提供通道选择、频率 Hz、占空比 %、应用并启动、停止和回读。连接旧版 1.0 固件时，数字 IO 和 ADC 仍可使用，PWM 控件按能力位禁用。</w:t>
+      </w:r>
     </w:p>
     <w:p>
       <w:pPr>
@@ -11374,7 +12772,7 @@
             <w:u w:val="single"/>
             <w:sz w:val="18"/>
           </w:rPr>
-          <w:t>ESP32-S3 Datasheet</w:t>
+          <w:t>ESP-IDF LEDC Driver</w:t>
         </w:r>
       </w:hyperlink>
     </w:p>
@@ -11391,6 +12789,23 @@
             <w:u w:val="single"/>
             <w:sz w:val="18"/>
           </w:rPr>
+          <w:t>ESP32-S3 Datasheet</w:t>
+        </w:r>
+      </w:hyperlink>
+    </w:p>
+    <w:p>
+      <w:pPr>
+        <w:pStyle w:val="ListBullet"/>
+        <w:spacing w:after="0" w:line="240" w:lineRule="auto"/>
+      </w:pPr>
+      <w:hyperlink r:id="rId15">
+        <w:r>
+          <w:rPr>
+            <w:rFonts w:ascii="Microsoft YaHei" w:hAnsi="Microsoft YaHei" w:eastAsia="Microsoft YaHei"/>
+            <w:color w:val="0563C1"/>
+            <w:u w:val="single"/>
+            <w:sz w:val="18"/>
+          </w:rPr>
           <w:t>Modbus Application Protocol V1.1b3</w:t>
         </w:r>
       </w:hyperlink>
@@ -11400,7 +12815,7 @@
         <w:pStyle w:val="ListBullet"/>
         <w:spacing w:after="0" w:line="240" w:lineRule="auto"/>
       </w:pPr>
-      <w:hyperlink r:id="rId15">
+      <w:hyperlink r:id="rId16">
         <w:r>
           <w:rPr>
             <w:rFonts w:ascii="Microsoft YaHei" w:hAnsi="Microsoft YaHei" w:eastAsia="Microsoft YaHei"/>
@@ -11454,7 +12869,7 @@
               <w:color w:val="000000"/>
               <w:sz w:val="17"/>
             </w:rPr>
-            <w:t>ESP32-S3 USB Modbus IO 协议 1.0</w:t>
+            <w:t>ESP32-S3 USB Modbus IO 协议 1.1</w:t>
           </w:r>
         </w:p>
       </w:tc>

</xml_diff>

<commit_message>
feat: add multi-protocol ESP32-S3 debugger
</commit_message>
<xml_diff>
--- a/docs/ESP32-S3_USB_Modbus_IO_Protocol.docx
+++ b/docs/ESP32-S3_USB_Modbus_IO_Protocol.docx
@@ -43,7 +43,7 @@
           <w:color w:val="000000"/>
           <w:sz w:val="20"/>
         </w:rPr>
-        <w:t>协议版本 1.1    固件版本 1.1    从站地址 1</w:t>
+        <w:t>协议版本 1.2    固件版本 1.2    从站地址 1</w:t>
       </w:r>
     </w:p>
     <w:p>
@@ -58,7 +58,7 @@
           <w:color w:val="000000"/>
           <w:sz w:val="21"/>
         </w:rPr>
-        <w:t>本手册给出图示 ESP32-S3-WROOM-1 开发板的 USB 虚拟串口 Modbus RTU 接口。主站可读取数字输入和输出状态、控制数字输出、读取 GPIO1 到 GPIO18 的 ADC 数据，并配置 PWM 频率、占空比和启停状态。版本 1.1 保留 1.0 的数字 IO 和 ADC 地址。</w:t>
+        <w:t>本手册给出图示 ESP32-S3-WROOM-1 开发板的 USB 虚拟串口 Modbus RTU 接口。主站可读取数字输入和输出状态、控制数字输出、读取 GPIO1 到 GPIO18 的 ADC 数据，并配置 PWM、I²C、SPI 和 UART。CDC0 承载 Modbus 控制事务，CDC1 提供 UART 原始字节透传。版本 1.2 保留 1.0 和 1.1 的数字 IO、ADC 和 PWM 地址。</w:t>
       </w:r>
     </w:p>
     <w:p>
@@ -394,7 +394,7 @@
                 <w:color w:val="000000"/>
                 <w:sz w:val="18"/>
               </w:rPr>
-              <w:t>USB CDC-ACM</w:t>
+              <w:t>双 USB CDC-ACM</w:t>
             </w:r>
           </w:p>
         </w:tc>
@@ -422,7 +422,7 @@
                 <w:color w:val="000000"/>
                 <w:sz w:val="18"/>
               </w:rPr>
-              <w:t>原生 USB D- GPIO19 和 D+ GPIO20</w:t>
+              <w:t>CDC0 Modbus 控制；CDC1 UART 字节透传</w:t>
             </w:r>
           </w:p>
         </w:tc>
@@ -948,6 +948,92 @@
                 <w:sz w:val="18"/>
               </w:rPr>
               <w:t>同时最多 4 种频率；10 Hz 到 100 kHz</w:t>
+            </w:r>
+          </w:p>
+        </w:tc>
+      </w:tr>
+      <w:tr>
+        <w:trPr>
+          <w:cantSplit/>
+        </w:trPr>
+        <w:tc>
+          <w:tcPr>
+            <w:tcW w:type="dxa" w:w="2088"/>
+            <w:tcMar>
+              <w:top w:w="90" w:type="dxa"/>
+              <w:start w:w="110" w:type="dxa"/>
+              <w:bottom w:w="90" w:type="dxa"/>
+              <w:end w:w="110" w:type="dxa"/>
+            </w:tcMar>
+            <w:vAlign w:val="center"/>
+          </w:tcPr>
+          <w:p>
+            <w:pPr>
+              <w:spacing w:before="0" w:after="0" w:line="259" w:lineRule="auto"/>
+              <w:jc w:val="left"/>
+            </w:pPr>
+            <w:r>
+              <w:rPr>
+                <w:rFonts w:ascii="Microsoft YaHei" w:hAnsi="Microsoft YaHei" w:eastAsia="Microsoft YaHei"/>
+                <w:b w:val="0"/>
+                <w:color w:val="000000"/>
+                <w:sz w:val="18"/>
+              </w:rPr>
+              <w:t>调试总线</w:t>
+            </w:r>
+          </w:p>
+        </w:tc>
+        <w:tc>
+          <w:tcPr>
+            <w:tcW w:type="dxa" w:w="2232"/>
+            <w:tcMar>
+              <w:top w:w="90" w:type="dxa"/>
+              <w:start w:w="110" w:type="dxa"/>
+              <w:bottom w:w="90" w:type="dxa"/>
+              <w:end w:w="110" w:type="dxa"/>
+            </w:tcMar>
+            <w:vAlign w:val="center"/>
+          </w:tcPr>
+          <w:p>
+            <w:pPr>
+              <w:spacing w:before="0" w:after="0" w:line="259" w:lineRule="auto"/>
+              <w:jc w:val="center"/>
+            </w:pPr>
+            <w:r>
+              <w:rPr>
+                <w:rFonts w:ascii="Microsoft YaHei" w:hAnsi="Microsoft YaHei" w:eastAsia="Microsoft YaHei"/>
+                <w:b w:val="0"/>
+                <w:color w:val="000000"/>
+                <w:sz w:val="18"/>
+              </w:rPr>
+              <w:t>I²C SPI UART</w:t>
+            </w:r>
+          </w:p>
+        </w:tc>
+        <w:tc>
+          <w:tcPr>
+            <w:tcW w:type="dxa" w:w="5760"/>
+            <w:tcMar>
+              <w:top w:w="90" w:type="dxa"/>
+              <w:start w:w="110" w:type="dxa"/>
+              <w:bottom w:w="90" w:type="dxa"/>
+              <w:end w:w="110" w:type="dxa"/>
+            </w:tcMar>
+            <w:vAlign w:val="center"/>
+          </w:tcPr>
+          <w:p>
+            <w:pPr>
+              <w:spacing w:before="0" w:after="0" w:line="259" w:lineRule="auto"/>
+              <w:jc w:val="left"/>
+            </w:pPr>
+            <w:r>
+              <w:rPr>
+                <w:rFonts w:ascii="Microsoft YaHei" w:hAnsi="Microsoft YaHei" w:eastAsia="Microsoft YaHei"/>
+                <w:b w:val="0"/>
+                <w:color w:val="000000"/>
+                <w:sz w:val="18"/>
+              </w:rPr>
+              <w:t>经功能码 0x41 配置，通道引脚可选择</w:t>
             </w:r>
           </w:p>
         </w:tc>
@@ -1142,6 +1228,20 @@
     </w:p>
     <w:p>
       <w:pPr>
+        <w:pStyle w:val="ListBullet"/>
+      </w:pPr>
+      <w:r>
+        <w:rPr>
+          <w:rFonts w:ascii="Microsoft YaHei" w:hAnsi="Microsoft YaHei" w:eastAsia="Microsoft YaHei"/>
+          <w:b w:val="0"/>
+          <w:color w:val="000000"/>
+          <w:sz w:val="21"/>
+        </w:rPr>
+        <w:t>I²C 需要外部上拉；上拉不得接至 5 V。SPI 和 UART 跨电压域使用电平转换。</w:t>
+      </w:r>
+    </w:p>
+    <w:p>
+      <w:pPr>
         <w:pStyle w:val="Heading1"/>
         <w:pageBreakBefore/>
       </w:pPr>
@@ -2448,6 +2548,92 @@
           </w:p>
         </w:tc>
       </w:tr>
+      <w:tr>
+        <w:trPr>
+          <w:cantSplit/>
+        </w:trPr>
+        <w:tc>
+          <w:tcPr>
+            <w:tcW w:type="dxa" w:w="1440"/>
+            <w:tcMar>
+              <w:top w:w="90" w:type="dxa"/>
+              <w:start w:w="110" w:type="dxa"/>
+              <w:bottom w:w="90" w:type="dxa"/>
+              <w:end w:w="110" w:type="dxa"/>
+            </w:tcMar>
+            <w:vAlign w:val="center"/>
+          </w:tcPr>
+          <w:p>
+            <w:pPr>
+              <w:spacing w:before="0" w:after="0" w:line="259" w:lineRule="auto"/>
+              <w:jc w:val="center"/>
+            </w:pPr>
+            <w:r>
+              <w:rPr>
+                <w:rFonts w:ascii="Microsoft YaHei" w:hAnsi="Microsoft YaHei" w:eastAsia="Microsoft YaHei"/>
+                <w:b w:val="0"/>
+                <w:color w:val="000000"/>
+                <w:sz w:val="18"/>
+              </w:rPr>
+              <w:t>0x41</w:t>
+            </w:r>
+          </w:p>
+        </w:tc>
+        <w:tc>
+          <w:tcPr>
+            <w:tcW w:type="dxa" w:w="3528"/>
+            <w:tcMar>
+              <w:top w:w="90" w:type="dxa"/>
+              <w:start w:w="110" w:type="dxa"/>
+              <w:bottom w:w="90" w:type="dxa"/>
+              <w:end w:w="110" w:type="dxa"/>
+            </w:tcMar>
+            <w:vAlign w:val="center"/>
+          </w:tcPr>
+          <w:p>
+            <w:pPr>
+              <w:spacing w:before="0" w:after="0" w:line="259" w:lineRule="auto"/>
+              <w:jc w:val="left"/>
+            </w:pPr>
+            <w:r>
+              <w:rPr>
+                <w:rFonts w:ascii="Microsoft YaHei" w:hAnsi="Microsoft YaHei" w:eastAsia="Microsoft YaHei"/>
+                <w:b w:val="0"/>
+                <w:color w:val="000000"/>
+                <w:sz w:val="18"/>
+              </w:rPr>
+              <w:t>Debugger Extension</w:t>
+            </w:r>
+          </w:p>
+        </w:tc>
+        <w:tc>
+          <w:tcPr>
+            <w:tcW w:type="dxa" w:w="5112"/>
+            <w:tcMar>
+              <w:top w:w="90" w:type="dxa"/>
+              <w:start w:w="110" w:type="dxa"/>
+              <w:bottom w:w="90" w:type="dxa"/>
+              <w:end w:w="110" w:type="dxa"/>
+            </w:tcMar>
+            <w:vAlign w:val="center"/>
+          </w:tcPr>
+          <w:p>
+            <w:pPr>
+              <w:spacing w:before="0" w:after="0" w:line="259" w:lineRule="auto"/>
+              <w:jc w:val="left"/>
+            </w:pPr>
+            <w:r>
+              <w:rPr>
+                <w:rFonts w:ascii="Microsoft YaHei" w:hAnsi="Microsoft YaHei" w:eastAsia="Microsoft YaHei"/>
+                <w:b w:val="0"/>
+                <w:color w:val="000000"/>
+                <w:sz w:val="18"/>
+              </w:rPr>
+              <w:t>I²C SPI UART 配置及事务，仅单播</w:t>
+            </w:r>
+          </w:p>
+        </w:tc>
+      </w:tr>
     </w:tbl>
     <w:p>
       <w:pPr>
@@ -2474,7 +2660,7 @@
           <w:color w:val="000000"/>
           <w:sz w:val="21"/>
         </w:rPr>
-        <w:t>Modbus PDU 地址从 0 开始，传统线圈号和离散输入号从 1 开始显示。线圈返回最近写入的输出命令状态，离散输入返回引脚实际电平。GPIO35 到 GPIO37 的通道号始终保留，但默认访问会返回非法数据地址异常。PWM 模式读线圈仍返回最近的数字输出命令值；读离散输入只得到采样瞬间电平，不能用来判断 PWM 占空比。模拟模式读离散输入返回异常 0x04。</w:t>
+        <w:t>Modbus PDU 地址从 0 开始，传统线圈号和离散输入号从 1 开始显示。线圈返回最近写入的输出命令状态，离散输入返回引脚实际电平。GPIO35 到 GPIO37 的通道号始终保留，但默认访问会返回非法数据地址异常。PWM 模式读线圈仍返回最近的数字输出命令值；读离散输入只得到采样瞬间电平，不能用来判断 PWM 占空比。模拟或总线占用模式读离散输入返回异常 0x04。</w:t>
       </w:r>
     </w:p>
     <w:tbl>
@@ -8480,7 +8666,7 @@
           <w:color w:val="000000"/>
           <w:sz w:val="21"/>
         </w:rPr>
-        <w:t>模拟通道 0 到 17 依次对应 GPIO1 到 GPIO18。ADC 使用 12 dB 衰减和默认位宽。读取时会把非输出 GPIO 切换为模拟模式。如果对应 GPIO 正在数字输出或 PWM 输出，固件返回异常 0x04，保持现有输出；可先明确切换到模拟模式再读取 ADC。</w:t>
+        <w:t>模拟通道 0 到 17 依次对应 GPIO1 到 GPIO18。ADC 使用 12 dB 衰减和默认位宽。读取时会把非输出且未被总线占用的 GPIO 切换为模拟模式。如果对应 GPIO 正在数字输出、PWM 输出或被外设占用，固件返回异常 0x04，保持现有输出；可先明确切换到模拟模式再读取 ADC。</w:t>
       </w:r>
     </w:p>
     <w:tbl>
@@ -9540,6 +9726,267 @@
           </w:p>
         </w:tc>
       </w:tr>
+      <w:tr>
+        <w:trPr>
+          <w:cantSplit/>
+        </w:trPr>
+        <w:tc>
+          <w:tcPr>
+            <w:tcW w:type="dxa" w:w="1440"/>
+            <w:tcMar>
+              <w:top w:w="90" w:type="dxa"/>
+              <w:start w:w="110" w:type="dxa"/>
+              <w:bottom w:w="90" w:type="dxa"/>
+              <w:end w:w="110" w:type="dxa"/>
+            </w:tcMar>
+            <w:vAlign w:val="center"/>
+          </w:tcPr>
+          <w:p>
+            <w:pPr>
+              <w:spacing w:before="0" w:after="0" w:line="259" w:lineRule="auto"/>
+              <w:jc w:val="center"/>
+            </w:pPr>
+            <w:r>
+              <w:rPr>
+                <w:rFonts w:ascii="Microsoft YaHei" w:hAnsi="Microsoft YaHei" w:eastAsia="Microsoft YaHei"/>
+                <w:b w:val="0"/>
+                <w:color w:val="000000"/>
+                <w:sz w:val="18"/>
+              </w:rPr>
+              <w:t>6</w:t>
+            </w:r>
+          </w:p>
+        </w:tc>
+        <w:tc>
+          <w:tcPr>
+            <w:tcW w:type="dxa" w:w="3168"/>
+            <w:tcMar>
+              <w:top w:w="90" w:type="dxa"/>
+              <w:start w:w="110" w:type="dxa"/>
+              <w:bottom w:w="90" w:type="dxa"/>
+              <w:end w:w="110" w:type="dxa"/>
+            </w:tcMar>
+            <w:vAlign w:val="center"/>
+          </w:tcPr>
+          <w:p>
+            <w:pPr>
+              <w:spacing w:before="0" w:after="0" w:line="259" w:lineRule="auto"/>
+              <w:jc w:val="left"/>
+            </w:pPr>
+            <w:r>
+              <w:rPr>
+                <w:rFonts w:ascii="Microsoft YaHei" w:hAnsi="Microsoft YaHei" w:eastAsia="Microsoft YaHei"/>
+                <w:b w:val="0"/>
+                <w:color w:val="000000"/>
+                <w:sz w:val="18"/>
+              </w:rPr>
+              <w:t>I²C 占用</w:t>
+            </w:r>
+          </w:p>
+        </w:tc>
+        <w:tc>
+          <w:tcPr>
+            <w:tcW w:type="dxa" w:w="5472"/>
+            <w:tcMar>
+              <w:top w:w="90" w:type="dxa"/>
+              <w:start w:w="110" w:type="dxa"/>
+              <w:bottom w:w="90" w:type="dxa"/>
+              <w:end w:w="110" w:type="dxa"/>
+            </w:tcMar>
+            <w:vAlign w:val="center"/>
+          </w:tcPr>
+          <w:p>
+            <w:pPr>
+              <w:spacing w:before="0" w:after="0" w:line="259" w:lineRule="auto"/>
+              <w:jc w:val="left"/>
+            </w:pPr>
+            <w:r>
+              <w:rPr>
+                <w:rFonts w:ascii="Microsoft YaHei" w:hAnsi="Microsoft YaHei" w:eastAsia="Microsoft YaHei"/>
+                <w:b w:val="0"/>
+                <w:color w:val="000000"/>
+                <w:sz w:val="18"/>
+              </w:rPr>
+              <w:t>只读，由 0x41 配置和释放</w:t>
+            </w:r>
+          </w:p>
+        </w:tc>
+      </w:tr>
+      <w:tr>
+        <w:trPr>
+          <w:cantSplit/>
+        </w:trPr>
+        <w:tc>
+          <w:tcPr>
+            <w:tcW w:type="dxa" w:w="1440"/>
+            <w:shd w:fill="EAF2F8"/>
+            <w:tcMar>
+              <w:top w:w="90" w:type="dxa"/>
+              <w:start w:w="110" w:type="dxa"/>
+              <w:bottom w:w="90" w:type="dxa"/>
+              <w:end w:w="110" w:type="dxa"/>
+            </w:tcMar>
+            <w:vAlign w:val="center"/>
+          </w:tcPr>
+          <w:p>
+            <w:pPr>
+              <w:spacing w:before="0" w:after="0" w:line="259" w:lineRule="auto"/>
+              <w:jc w:val="center"/>
+            </w:pPr>
+            <w:r>
+              <w:rPr>
+                <w:rFonts w:ascii="Microsoft YaHei" w:hAnsi="Microsoft YaHei" w:eastAsia="Microsoft YaHei"/>
+                <w:b w:val="0"/>
+                <w:color w:val="000000"/>
+                <w:sz w:val="18"/>
+              </w:rPr>
+              <w:t>7</w:t>
+            </w:r>
+          </w:p>
+        </w:tc>
+        <w:tc>
+          <w:tcPr>
+            <w:tcW w:type="dxa" w:w="3168"/>
+            <w:shd w:fill="EAF2F8"/>
+            <w:tcMar>
+              <w:top w:w="90" w:type="dxa"/>
+              <w:start w:w="110" w:type="dxa"/>
+              <w:bottom w:w="90" w:type="dxa"/>
+              <w:end w:w="110" w:type="dxa"/>
+            </w:tcMar>
+            <w:vAlign w:val="center"/>
+          </w:tcPr>
+          <w:p>
+            <w:pPr>
+              <w:spacing w:before="0" w:after="0" w:line="259" w:lineRule="auto"/>
+              <w:jc w:val="left"/>
+            </w:pPr>
+            <w:r>
+              <w:rPr>
+                <w:rFonts w:ascii="Microsoft YaHei" w:hAnsi="Microsoft YaHei" w:eastAsia="Microsoft YaHei"/>
+                <w:b w:val="0"/>
+                <w:color w:val="000000"/>
+                <w:sz w:val="18"/>
+              </w:rPr>
+              <w:t>SPI 占用</w:t>
+            </w:r>
+          </w:p>
+        </w:tc>
+        <w:tc>
+          <w:tcPr>
+            <w:tcW w:type="dxa" w:w="5472"/>
+            <w:shd w:fill="EAF2F8"/>
+            <w:tcMar>
+              <w:top w:w="90" w:type="dxa"/>
+              <w:start w:w="110" w:type="dxa"/>
+              <w:bottom w:w="90" w:type="dxa"/>
+              <w:end w:w="110" w:type="dxa"/>
+            </w:tcMar>
+            <w:vAlign w:val="center"/>
+          </w:tcPr>
+          <w:p>
+            <w:pPr>
+              <w:spacing w:before="0" w:after="0" w:line="259" w:lineRule="auto"/>
+              <w:jc w:val="left"/>
+            </w:pPr>
+            <w:r>
+              <w:rPr>
+                <w:rFonts w:ascii="Microsoft YaHei" w:hAnsi="Microsoft YaHei" w:eastAsia="Microsoft YaHei"/>
+                <w:b w:val="0"/>
+                <w:color w:val="000000"/>
+                <w:sz w:val="18"/>
+              </w:rPr>
+              <w:t>只读，由 0x41 配置和释放</w:t>
+            </w:r>
+          </w:p>
+        </w:tc>
+      </w:tr>
+      <w:tr>
+        <w:trPr>
+          <w:cantSplit/>
+        </w:trPr>
+        <w:tc>
+          <w:tcPr>
+            <w:tcW w:type="dxa" w:w="1440"/>
+            <w:tcMar>
+              <w:top w:w="90" w:type="dxa"/>
+              <w:start w:w="110" w:type="dxa"/>
+              <w:bottom w:w="90" w:type="dxa"/>
+              <w:end w:w="110" w:type="dxa"/>
+            </w:tcMar>
+            <w:vAlign w:val="center"/>
+          </w:tcPr>
+          <w:p>
+            <w:pPr>
+              <w:spacing w:before="0" w:after="0" w:line="259" w:lineRule="auto"/>
+              <w:jc w:val="center"/>
+            </w:pPr>
+            <w:r>
+              <w:rPr>
+                <w:rFonts w:ascii="Microsoft YaHei" w:hAnsi="Microsoft YaHei" w:eastAsia="Microsoft YaHei"/>
+                <w:b w:val="0"/>
+                <w:color w:val="000000"/>
+                <w:sz w:val="18"/>
+              </w:rPr>
+              <w:t>8</w:t>
+            </w:r>
+          </w:p>
+        </w:tc>
+        <w:tc>
+          <w:tcPr>
+            <w:tcW w:type="dxa" w:w="3168"/>
+            <w:tcMar>
+              <w:top w:w="90" w:type="dxa"/>
+              <w:start w:w="110" w:type="dxa"/>
+              <w:bottom w:w="90" w:type="dxa"/>
+              <w:end w:w="110" w:type="dxa"/>
+            </w:tcMar>
+            <w:vAlign w:val="center"/>
+          </w:tcPr>
+          <w:p>
+            <w:pPr>
+              <w:spacing w:before="0" w:after="0" w:line="259" w:lineRule="auto"/>
+              <w:jc w:val="left"/>
+            </w:pPr>
+            <w:r>
+              <w:rPr>
+                <w:rFonts w:ascii="Microsoft YaHei" w:hAnsi="Microsoft YaHei" w:eastAsia="Microsoft YaHei"/>
+                <w:b w:val="0"/>
+                <w:color w:val="000000"/>
+                <w:sz w:val="18"/>
+              </w:rPr>
+              <w:t>UART 占用</w:t>
+            </w:r>
+          </w:p>
+        </w:tc>
+        <w:tc>
+          <w:tcPr>
+            <w:tcW w:type="dxa" w:w="5472"/>
+            <w:tcMar>
+              <w:top w:w="90" w:type="dxa"/>
+              <w:start w:w="110" w:type="dxa"/>
+              <w:bottom w:w="90" w:type="dxa"/>
+              <w:end w:w="110" w:type="dxa"/>
+            </w:tcMar>
+            <w:vAlign w:val="center"/>
+          </w:tcPr>
+          <w:p>
+            <w:pPr>
+              <w:spacing w:before="0" w:after="0" w:line="259" w:lineRule="auto"/>
+              <w:jc w:val="left"/>
+            </w:pPr>
+            <w:r>
+              <w:rPr>
+                <w:rFonts w:ascii="Microsoft YaHei" w:hAnsi="Microsoft YaHei" w:eastAsia="Microsoft YaHei"/>
+                <w:b w:val="0"/>
+                <w:color w:val="000000"/>
+                <w:sz w:val="18"/>
+              </w:rPr>
+              <w:t>只读，由 0x41 配置和释放</w:t>
+            </w:r>
+          </w:p>
+        </w:tc>
+      </w:tr>
     </w:tbl>
     <w:p>
       <w:pPr>
@@ -9824,7 +10271,7 @@
                 <w:color w:val="000000"/>
                 <w:sz w:val="18"/>
               </w:rPr>
-              <w:t>0x0101 表示 1.1</w:t>
+              <w:t>0x0102 表示 1.2</w:t>
             </w:r>
           </w:p>
         </w:tc>
@@ -9941,7 +10388,7 @@
                 <w:color w:val="000000"/>
                 <w:sz w:val="18"/>
               </w:rPr>
-              <w:t>0x0101 表示 1.1</w:t>
+              <w:t>0x0102 表示 1.2</w:t>
             </w:r>
           </w:p>
         </w:tc>
@@ -10284,7 +10731,7 @@
                 <w:color w:val="000000"/>
                 <w:sz w:val="18"/>
               </w:rPr>
-              <w:t>bit0 ADC 校准；bit1 GPIO35 到 GPIO37；bit2 PWM</w:t>
+              <w:t>bit0 ADC 校准；bit1 GPIO35～37；bit2 PWM；bit3 I²C；bit4 SPI；bit5 UART</w:t>
             </w:r>
           </w:p>
         </w:tc>
@@ -10537,7 +10984,7 @@
           <w:color w:val="000000"/>
           <w:sz w:val="21"/>
         </w:rPr>
-        <w:t>前 5 个信息寄存器保持兼容。先读 0x0200 到 0x0204，确认 bit2 后再读取 PWM 扩展。旧版 1.0 固件没有 PWM 扩展地址。</w:t>
+        <w:t>前 5 个信息寄存器布局保持兼容。先读 0x0200 到 0x0204，确认 bit2 后再读取 PWM 扩展；确认 bit3 到 bit5 后再使用功能码 0x41。旧版 1.0 固件没有 PWM 扩展地址。</w:t>
       </w:r>
     </w:p>
     <w:p>
@@ -11192,7 +11639,7 @@
           <w:color w:val="000000"/>
           <w:sz w:val="21"/>
         </w:rPr>
-        <w:t>功能码 0x0F 按最低位优先携带线圈值。0x10 的每个寄存器占 2 字节。固件先验证完整请求，再执行批量写。成功响应回显起始地址和数量。</w:t>
+        <w:t>0x0F 线圈值按最低位优先排列；0x10 每个寄存器占 2 字节。批量写先验证完整请求，成功响应回显地址和数量。</w:t>
       </w:r>
     </w:p>
     <w:p>
@@ -11207,7 +11654,7 @@
           <w:color w:val="000000"/>
           <w:sz w:val="21"/>
         </w:rPr>
-        <w:t>GPIO 模式区的 0x10 写入只要包含模式 5，数量就必须为 1；多通道模式请求含模式 5 时，整条返回 0x03，不会部分启动。模式 0 到 4 仍可批量写。PWM 配置区的 0x10 只接受单条对齐的完整 4 寄存器记录。需要启动多路 PWM 时逐路配置并检查响应。</w:t>
+        <w:t>GPIO 模式区批量写若包含模式 5，数量必须为 1；否则整帧返回 0x03，不会部分启动。模式 0～4 可批量写。PWM 配置区只接受一条对齐的完整 4 寄存器记录。</w:t>
       </w:r>
     </w:p>
     <w:p>
@@ -11248,9 +11695,9 @@
             <w:tcW w:type="dxa" w:w="1440"/>
             <w:shd w:fill="1F4E78"/>
             <w:tcMar>
-              <w:top w:w="90" w:type="dxa"/>
-              <w:start w:w="110" w:type="dxa"/>
-              <w:bottom w:w="90" w:type="dxa"/>
+              <w:top w:w="35" w:type="dxa"/>
+              <w:start w:w="110" w:type="dxa"/>
+              <w:bottom w:w="35" w:type="dxa"/>
               <w:end w:w="110" w:type="dxa"/>
             </w:tcMar>
             <w:vAlign w:val="center"/>
@@ -11276,9 +11723,9 @@
             <w:tcW w:type="dxa" w:w="3024"/>
             <w:shd w:fill="1F4E78"/>
             <w:tcMar>
-              <w:top w:w="90" w:type="dxa"/>
-              <w:start w:w="110" w:type="dxa"/>
-              <w:bottom w:w="90" w:type="dxa"/>
+              <w:top w:w="35" w:type="dxa"/>
+              <w:start w:w="110" w:type="dxa"/>
+              <w:bottom w:w="35" w:type="dxa"/>
               <w:end w:w="110" w:type="dxa"/>
             </w:tcMar>
             <w:vAlign w:val="center"/>
@@ -11304,9 +11751,9 @@
             <w:tcW w:type="dxa" w:w="5616"/>
             <w:shd w:fill="1F4E78"/>
             <w:tcMar>
-              <w:top w:w="90" w:type="dxa"/>
-              <w:start w:w="110" w:type="dxa"/>
-              <w:bottom w:w="90" w:type="dxa"/>
+              <w:top w:w="35" w:type="dxa"/>
+              <w:start w:w="110" w:type="dxa"/>
+              <w:bottom w:w="35" w:type="dxa"/>
               <w:end w:w="110" w:type="dxa"/>
             </w:tcMar>
             <w:vAlign w:val="center"/>
@@ -11336,9 +11783,9 @@
           <w:tcPr>
             <w:tcW w:type="dxa" w:w="1440"/>
             <w:tcMar>
-              <w:top w:w="90" w:type="dxa"/>
-              <w:start w:w="110" w:type="dxa"/>
-              <w:bottom w:w="90" w:type="dxa"/>
+              <w:top w:w="35" w:type="dxa"/>
+              <w:start w:w="110" w:type="dxa"/>
+              <w:bottom w:w="35" w:type="dxa"/>
               <w:end w:w="110" w:type="dxa"/>
             </w:tcMar>
             <w:vAlign w:val="center"/>
@@ -11363,9 +11810,9 @@
           <w:tcPr>
             <w:tcW w:type="dxa" w:w="3024"/>
             <w:tcMar>
-              <w:top w:w="90" w:type="dxa"/>
-              <w:start w:w="110" w:type="dxa"/>
-              <w:bottom w:w="90" w:type="dxa"/>
+              <w:top w:w="35" w:type="dxa"/>
+              <w:start w:w="110" w:type="dxa"/>
+              <w:bottom w:w="35" w:type="dxa"/>
               <w:end w:w="110" w:type="dxa"/>
             </w:tcMar>
             <w:vAlign w:val="center"/>
@@ -11390,9 +11837,9 @@
           <w:tcPr>
             <w:tcW w:type="dxa" w:w="5616"/>
             <w:tcMar>
-              <w:top w:w="90" w:type="dxa"/>
-              <w:start w:w="110" w:type="dxa"/>
-              <w:bottom w:w="90" w:type="dxa"/>
+              <w:top w:w="35" w:type="dxa"/>
+              <w:start w:w="110" w:type="dxa"/>
+              <w:bottom w:w="35" w:type="dxa"/>
               <w:end w:w="110" w:type="dxa"/>
             </w:tcMar>
             <w:vAlign w:val="center"/>
@@ -11423,9 +11870,9 @@
             <w:tcW w:type="dxa" w:w="1440"/>
             <w:shd w:fill="EAF2F8"/>
             <w:tcMar>
-              <w:top w:w="90" w:type="dxa"/>
-              <w:start w:w="110" w:type="dxa"/>
-              <w:bottom w:w="90" w:type="dxa"/>
+              <w:top w:w="35" w:type="dxa"/>
+              <w:start w:w="110" w:type="dxa"/>
+              <w:bottom w:w="35" w:type="dxa"/>
               <w:end w:w="110" w:type="dxa"/>
             </w:tcMar>
             <w:vAlign w:val="center"/>
@@ -11451,9 +11898,9 @@
             <w:tcW w:type="dxa" w:w="3024"/>
             <w:shd w:fill="EAF2F8"/>
             <w:tcMar>
-              <w:top w:w="90" w:type="dxa"/>
-              <w:start w:w="110" w:type="dxa"/>
-              <w:bottom w:w="90" w:type="dxa"/>
+              <w:top w:w="35" w:type="dxa"/>
+              <w:start w:w="110" w:type="dxa"/>
+              <w:bottom w:w="35" w:type="dxa"/>
               <w:end w:w="110" w:type="dxa"/>
             </w:tcMar>
             <w:vAlign w:val="center"/>
@@ -11479,9 +11926,9 @@
             <w:tcW w:type="dxa" w:w="5616"/>
             <w:shd w:fill="EAF2F8"/>
             <w:tcMar>
-              <w:top w:w="90" w:type="dxa"/>
-              <w:start w:w="110" w:type="dxa"/>
-              <w:bottom w:w="90" w:type="dxa"/>
+              <w:top w:w="35" w:type="dxa"/>
+              <w:start w:w="110" w:type="dxa"/>
+              <w:bottom w:w="35" w:type="dxa"/>
               <w:end w:w="110" w:type="dxa"/>
             </w:tcMar>
             <w:vAlign w:val="center"/>
@@ -11511,9 +11958,9 @@
           <w:tcPr>
             <w:tcW w:type="dxa" w:w="1440"/>
             <w:tcMar>
-              <w:top w:w="90" w:type="dxa"/>
-              <w:start w:w="110" w:type="dxa"/>
-              <w:bottom w:w="90" w:type="dxa"/>
+              <w:top w:w="35" w:type="dxa"/>
+              <w:start w:w="110" w:type="dxa"/>
+              <w:bottom w:w="35" w:type="dxa"/>
               <w:end w:w="110" w:type="dxa"/>
             </w:tcMar>
             <w:vAlign w:val="center"/>
@@ -11538,9 +11985,9 @@
           <w:tcPr>
             <w:tcW w:type="dxa" w:w="3024"/>
             <w:tcMar>
-              <w:top w:w="90" w:type="dxa"/>
-              <w:start w:w="110" w:type="dxa"/>
-              <w:bottom w:w="90" w:type="dxa"/>
+              <w:top w:w="35" w:type="dxa"/>
+              <w:start w:w="110" w:type="dxa"/>
+              <w:bottom w:w="35" w:type="dxa"/>
               <w:end w:w="110" w:type="dxa"/>
             </w:tcMar>
             <w:vAlign w:val="center"/>
@@ -11565,9 +12012,9 @@
           <w:tcPr>
             <w:tcW w:type="dxa" w:w="5616"/>
             <w:tcMar>
-              <w:top w:w="90" w:type="dxa"/>
-              <w:start w:w="110" w:type="dxa"/>
-              <w:bottom w:w="90" w:type="dxa"/>
+              <w:top w:w="35" w:type="dxa"/>
+              <w:start w:w="110" w:type="dxa"/>
+              <w:bottom w:w="35" w:type="dxa"/>
               <w:end w:w="110" w:type="dxa"/>
             </w:tcMar>
             <w:vAlign w:val="center"/>
@@ -11598,9 +12045,9 @@
             <w:tcW w:type="dxa" w:w="1440"/>
             <w:shd w:fill="EAF2F8"/>
             <w:tcMar>
-              <w:top w:w="90" w:type="dxa"/>
-              <w:start w:w="110" w:type="dxa"/>
-              <w:bottom w:w="90" w:type="dxa"/>
+              <w:top w:w="35" w:type="dxa"/>
+              <w:start w:w="110" w:type="dxa"/>
+              <w:bottom w:w="35" w:type="dxa"/>
               <w:end w:w="110" w:type="dxa"/>
             </w:tcMar>
             <w:vAlign w:val="center"/>
@@ -11626,9 +12073,9 @@
             <w:tcW w:type="dxa" w:w="3024"/>
             <w:shd w:fill="EAF2F8"/>
             <w:tcMar>
-              <w:top w:w="90" w:type="dxa"/>
-              <w:start w:w="110" w:type="dxa"/>
-              <w:bottom w:w="90" w:type="dxa"/>
+              <w:top w:w="35" w:type="dxa"/>
+              <w:start w:w="110" w:type="dxa"/>
+              <w:bottom w:w="35" w:type="dxa"/>
               <w:end w:w="110" w:type="dxa"/>
             </w:tcMar>
             <w:vAlign w:val="center"/>
@@ -11654,9 +12101,9 @@
             <w:tcW w:type="dxa" w:w="5616"/>
             <w:shd w:fill="EAF2F8"/>
             <w:tcMar>
-              <w:top w:w="90" w:type="dxa"/>
-              <w:start w:w="110" w:type="dxa"/>
-              <w:bottom w:w="90" w:type="dxa"/>
+              <w:top w:w="35" w:type="dxa"/>
+              <w:start w:w="110" w:type="dxa"/>
+              <w:bottom w:w="35" w:type="dxa"/>
               <w:end w:w="110" w:type="dxa"/>
             </w:tcMar>
             <w:vAlign w:val="center"/>
@@ -11673,7 +12120,7 @@
                 <w:color w:val="000000"/>
                 <w:sz w:val="18"/>
               </w:rPr>
-              <w:t>模式冲突或底层 GPIO ADC PWM 操作失败</w:t>
+              <w:t>模式冲突，或 GPIO ADC PWM I²C SPI UART 驱动失败</w:t>
             </w:r>
           </w:p>
         </w:tc>
@@ -11686,9 +12133,9 @@
           <w:tcPr>
             <w:tcW w:type="dxa" w:w="1440"/>
             <w:tcMar>
-              <w:top w:w="90" w:type="dxa"/>
-              <w:start w:w="110" w:type="dxa"/>
-              <w:bottom w:w="90" w:type="dxa"/>
+              <w:top w:w="35" w:type="dxa"/>
+              <w:start w:w="110" w:type="dxa"/>
+              <w:bottom w:w="35" w:type="dxa"/>
               <w:end w:w="110" w:type="dxa"/>
             </w:tcMar>
             <w:vAlign w:val="center"/>
@@ -11713,9 +12160,9 @@
           <w:tcPr>
             <w:tcW w:type="dxa" w:w="3024"/>
             <w:tcMar>
-              <w:top w:w="90" w:type="dxa"/>
-              <w:start w:w="110" w:type="dxa"/>
-              <w:bottom w:w="90" w:type="dxa"/>
+              <w:top w:w="35" w:type="dxa"/>
+              <w:start w:w="110" w:type="dxa"/>
+              <w:bottom w:w="35" w:type="dxa"/>
               <w:end w:w="110" w:type="dxa"/>
             </w:tcMar>
             <w:vAlign w:val="center"/>
@@ -11740,9 +12187,9 @@
           <w:tcPr>
             <w:tcW w:type="dxa" w:w="5616"/>
             <w:tcMar>
-              <w:top w:w="90" w:type="dxa"/>
-              <w:start w:w="110" w:type="dxa"/>
-              <w:bottom w:w="90" w:type="dxa"/>
+              <w:top w:w="35" w:type="dxa"/>
+              <w:start w:w="110" w:type="dxa"/>
+              <w:bottom w:w="35" w:type="dxa"/>
               <w:end w:w="110" w:type="dxa"/>
             </w:tcMar>
             <w:vAlign w:val="center"/>
@@ -11769,21 +12216,6 @@
       <w:pPr>
         <w:spacing w:after="0"/>
       </w:pPr>
-    </w:p>
-    <w:p>
-      <w:pPr>
-        <w:pStyle w:val="BodyText"/>
-        <w:keepLines w:val="0"/>
-      </w:pPr>
-      <w:r>
-        <w:rPr>
-          <w:rFonts w:ascii="Microsoft YaHei" w:hAnsi="Microsoft YaHei" w:eastAsia="Microsoft YaHei"/>
-          <w:b w:val="0"/>
-          <w:color w:val="000000"/>
-          <w:sz w:val="21"/>
-        </w:rPr>
-        <w:t>CRC 错误、发给其他从站的请求和不完整超时帧不会产生响应。</w:t>
-      </w:r>
     </w:p>
     <w:p>
       <w:pPr>
@@ -12587,6 +13019,74 @@
     </w:p>
     <w:p>
       <w:pPr>
+        <w:pStyle w:val="Code"/>
+        <w:keepLines/>
+        <w:spacing w:before="0" w:after="0"/>
+        <w:shd w:fill="F3F5F7"/>
+      </w:pPr>
+      <w:r>
+        <w:rPr>
+          <w:rFonts w:ascii="Cascadia Mono" w:hAnsi="Cascadia Mono" w:eastAsia="Cascadia Mono"/>
+          <w:b w:val="0"/>
+          <w:color w:val="000000"/>
+          <w:sz w:val="18"/>
+        </w:rPr>
+        <w:t>python tools/modbus_usb_client.py --port COM8 i2c-config 4 5</w:t>
+      </w:r>
+    </w:p>
+    <w:p>
+      <w:pPr>
+        <w:pStyle w:val="Code"/>
+        <w:keepLines/>
+        <w:spacing w:before="0" w:after="0"/>
+        <w:shd w:fill="F3F5F7"/>
+      </w:pPr>
+      <w:r>
+        <w:rPr>
+          <w:rFonts w:ascii="Cascadia Mono" w:hAnsi="Cascadia Mono" w:eastAsia="Cascadia Mono"/>
+          <w:b w:val="0"/>
+          <w:color w:val="000000"/>
+          <w:sz w:val="18"/>
+        </w:rPr>
+        <w:t>python tools/modbus_usb_client.py --port COM8 i2c-scan</w:t>
+      </w:r>
+    </w:p>
+    <w:p>
+      <w:pPr>
+        <w:pStyle w:val="Code"/>
+        <w:keepLines/>
+        <w:spacing w:before="0" w:after="0"/>
+        <w:shd w:fill="F3F5F7"/>
+      </w:pPr>
+      <w:r>
+        <w:rPr>
+          <w:rFonts w:ascii="Cascadia Mono" w:hAnsi="Cascadia Mono" w:eastAsia="Cascadia Mono"/>
+          <w:b w:val="0"/>
+          <w:color w:val="000000"/>
+          <w:sz w:val="18"/>
+        </w:rPr>
+        <w:t>python tools/modbus_usb_client.py --port COM8 spi-config 6 7 --miso 8 --cs 9</w:t>
+      </w:r>
+    </w:p>
+    <w:p>
+      <w:pPr>
+        <w:pStyle w:val="Code"/>
+        <w:keepLines/>
+        <w:spacing w:before="0" w:after="0"/>
+        <w:shd w:fill="F3F5F7"/>
+      </w:pPr>
+      <w:r>
+        <w:rPr>
+          <w:rFonts w:ascii="Cascadia Mono" w:hAnsi="Cascadia Mono" w:eastAsia="Cascadia Mono"/>
+          <w:b w:val="0"/>
+          <w:color w:val="000000"/>
+          <w:sz w:val="18"/>
+        </w:rPr>
+        <w:t>python tools/modbus_usb_client.py --port COM8 bus-status</w:t>
+      </w:r>
+    </w:p>
+    <w:p>
+      <w:pPr>
         <w:spacing w:after="0"/>
       </w:pPr>
     </w:p>
@@ -12617,12 +13117,13 @@
           <w:color w:val="000000"/>
           <w:sz w:val="21"/>
         </w:rPr>
-        <w:t>图形上位机 tools/modbus_usb_gui.py 的 PWM 页面提供通道选择、频率 Hz、占空比 %、应用并启动、停止和回读。连接旧版 1.0 固件时，数字 IO 和 ADC 仍可使用，PWM 控件按能力位禁用。</w:t>
+        <w:t>图形上位机 tools/modbus_usb_gui.py 包含数字 IO、ADC、PWM、I²C/SPI/UART 配置、串口助手和最多 4 路实时轮询波形。串口助手支持任意系统串口的文本或 HEX 收发、时间戳和日志保存；波形可导出 CSV。旧版固件仍可使用其已实现的功能。</w:t>
       </w:r>
     </w:p>
     <w:p>
       <w:pPr>
         <w:pStyle w:val="Heading1"/>
+        <w:keepNext/>
       </w:pPr>
       <w:r>
         <w:t>12 构建配置</w:t>
@@ -12631,7 +13132,7 @@
     <w:p>
       <w:pPr>
         <w:pStyle w:val="BodyText"/>
-        <w:keepLines w:val="0"/>
+        <w:keepLines/>
       </w:pPr>
       <w:r>
         <w:rPr>
@@ -12640,7 +13141,7 @@
           <w:color w:val="000000"/>
           <w:sz w:val="21"/>
         </w:rPr>
-        <w:t>工程支持 ESP-IDF 5.4 和 5.5。首次构建时组件管理器下载 espressif/esp_tinyusb。菜单 USB Modbus IO 可设置从站地址、不完整帧超时和 GPIO35 到 GPIO37 开关。工程默认关闭控制台，避免 UART0 或 USB 日志污染 Modbus 数据，并释放 GPIO43 和 GPIO44。</w:t>
+        <w:t>工程支持 ESP-IDF 5.4 和 5.5。首次构建时组件管理器下载 espressif/esp_tinyusb。菜单 USB Modbus IO 可设置从站地址、不完整帧超时和 GPIO35 到 GPIO37 开关。工程默认关闭控制台，避免 UART0 或 USB 日志污染 Modbus 数据，并释放 GPIO43 和 GPIO44。默认启用两个 TinyUSB CDC 通道；本地已有旧 sdkconfig 时，应在 menuconfig 确认 CDC Channel Count 为 2。</w:t>
       </w:r>
     </w:p>
     <w:p>
@@ -12719,10 +13220,2448 @@
     <w:p>
       <w:pPr>
         <w:pStyle w:val="Heading1"/>
+      </w:pPr>
+      <w:r>
+        <w:t>13 总线调试扩展</w:t>
+      </w:r>
+    </w:p>
+    <w:p>
+      <w:pPr>
+        <w:pStyle w:val="Heading2"/>
+      </w:pPr>
+      <w:r>
+        <w:t>13 1 双虚拟串口和帧格式</w:t>
+      </w:r>
+    </w:p>
+    <w:p>
+      <w:pPr>
+        <w:pStyle w:val="BodyText"/>
+        <w:keepLines w:val="0"/>
+      </w:pPr>
+      <w:r>
+        <w:rPr>
+          <w:rFonts w:ascii="Microsoft YaHei" w:hAnsi="Microsoft YaHei" w:eastAsia="Microsoft YaHei"/>
+          <w:b w:val="0"/>
+          <w:color w:val="000000"/>
+          <w:sz w:val="21"/>
+        </w:rPr>
+        <w:t>CDC0 保留标准 Modbus RTU 从站、数字 IO、ADC 和 PWM。功能码 0x41 传输 I²C、SPI、UART 配置及 I²C/SPI 事务；不能向广播地址 0 发送。请求和成功响应均依次包含从站地址、0x41、操作码、数据长度、数据、CRC 低字节和 CRC 高字节。数据长度只计数据字段，频率和波特率为 32 位大端整数。最大 ADU 长度为 256 字节，错误响应使用标准 0xC1 异常帧。I²C 扫描可能耗时约 1 秒，主站响应超时建议至少 2 秒。</w:t>
+      </w:r>
+    </w:p>
+    <w:p>
+      <w:pPr>
+        <w:pStyle w:val="Code"/>
+        <w:keepLines/>
+        <w:spacing w:before="0" w:after="0"/>
+        <w:shd w:fill="F3F5F7"/>
+      </w:pPr>
+      <w:r>
+        <w:rPr>
+          <w:rFonts w:ascii="Cascadia Mono" w:hAnsi="Cascadia Mono" w:eastAsia="Cascadia Mono"/>
+          <w:b w:val="0"/>
+          <w:color w:val="000000"/>
+          <w:sz w:val="18"/>
+        </w:rPr>
+        <w:t>请求/成功响应: SLAVE 41 OP LEN DATA... CRC_LO CRC_HI</w:t>
+      </w:r>
+    </w:p>
+    <w:p>
+      <w:pPr>
+        <w:pStyle w:val="Code"/>
+        <w:keepLines/>
+        <w:spacing w:before="0" w:after="0"/>
+        <w:shd w:fill="F3F5F7"/>
+      </w:pPr>
+      <w:r>
+        <w:rPr>
+          <w:rFonts w:ascii="Cascadia Mono" w:hAnsi="Cascadia Mono" w:eastAsia="Cascadia Mono"/>
+          <w:b w:val="0"/>
+          <w:color w:val="000000"/>
+          <w:sz w:val="18"/>
+        </w:rPr>
+        <w:t>异常响应:     SLAVE C1 EXCEPTION CRC_LO CRC_HI</w:t>
+      </w:r>
+    </w:p>
+    <w:p>
+      <w:pPr>
+        <w:spacing w:after="0"/>
+      </w:pPr>
+    </w:p>
+    <w:p>
+      <w:pPr>
+        <w:pStyle w:val="BodyText"/>
+        <w:keepLines w:val="0"/>
+      </w:pPr>
+      <w:r>
+        <w:rPr>
+          <w:rFonts w:ascii="Microsoft YaHei" w:hAnsi="Microsoft YaHei" w:eastAsia="Microsoft YaHei"/>
+          <w:b w:val="0"/>
+          <w:color w:val="000000"/>
+          <w:sz w:val="21"/>
+        </w:rPr>
+        <w:t>CDC1 是 UART1 原始字节透传口，不使用 Modbus 帧或 CRC。操作系统给两个 CDC 口分配的 COM 号不保证固定或相邻。电脑端对 CDC1 设置的波特率不自动改变 UART1，实际目标串口参数必须通过操作码 08 设置。</w:t>
+      </w:r>
+    </w:p>
+    <w:p>
+      <w:pPr>
+        <w:pStyle w:val="Heading2"/>
+      </w:pPr>
+      <w:r>
+        <w:t>13 2 操作码</w:t>
+      </w:r>
+    </w:p>
+    <w:p>
+      <w:pPr>
+        <w:pStyle w:val="BodyText"/>
+        <w:keepLines w:val="0"/>
+      </w:pPr>
+      <w:r>
+        <w:rPr>
+          <w:rFonts w:ascii="Microsoft YaHei" w:hAnsi="Microsoft YaHei" w:eastAsia="Microsoft YaHei"/>
+          <w:b w:val="0"/>
+          <w:color w:val="000000"/>
+          <w:sz w:val="21"/>
+        </w:rPr>
+        <w:t>引脚字段均为第 5 节的数字通道号，不是 GPIO 编号。配置前引脚必须为模式 0 浮空输入；同一总线改配置前先释放。SPI 的 MISO 和 CS 可以用 FF 表示省略，同一配置中的其余引脚必须互不重复。外设占用的模式 6～8 不能通过普通模式寄存器写入或释放。</w:t>
+      </w:r>
+    </w:p>
+    <w:tbl>
+      <w:tblPr>
+        <w:tblW w:type="auto" w:w="0"/>
+        <w:jc w:val="center"/>
+        <w:tblLayout w:type="fixed"/>
+        <w:tblLook w:firstColumn="1" w:firstRow="1" w:lastColumn="0" w:lastRow="0" w:noHBand="0" w:noVBand="1" w:val="04A0"/>
+        <w:tblBorders>
+          <w:top w:val="single" w:sz="6" w:space="0" w:color="D9D9D9"/>
+          <w:left w:val="single" w:sz="6" w:space="0" w:color="D9D9D9"/>
+          <w:bottom w:val="single" w:sz="6" w:space="0" w:color="D9D9D9"/>
+          <w:right w:val="single" w:sz="6" w:space="0" w:color="D9D9D9"/>
+          <w:insideH w:val="single" w:sz="6" w:space="0" w:color="D9D9D9"/>
+          <w:insideV w:val="single" w:sz="6" w:space="0" w:color="D9D9D9"/>
+        </w:tblBorders>
+      </w:tblPr>
+      <w:tblGrid>
+        <w:gridCol w:w="2541"/>
+        <w:gridCol w:w="2541"/>
+        <w:gridCol w:w="2541"/>
+        <w:gridCol w:w="2541"/>
+      </w:tblGrid>
+      <w:tr>
+        <w:trPr>
+          <w:tblHeader w:val="true"/>
+          <w:cantSplit/>
+        </w:trPr>
+        <w:tc>
+          <w:tcPr>
+            <w:tcW w:type="dxa" w:w="1080"/>
+            <w:shd w:fill="1F4E78"/>
+            <w:tcMar>
+              <w:top w:w="90" w:type="dxa"/>
+              <w:start w:w="110" w:type="dxa"/>
+              <w:bottom w:w="90" w:type="dxa"/>
+              <w:end w:w="110" w:type="dxa"/>
+            </w:tcMar>
+            <w:vAlign w:val="center"/>
+          </w:tcPr>
+          <w:p>
+            <w:pPr>
+              <w:spacing w:before="0" w:after="0"/>
+              <w:jc w:val="center"/>
+            </w:pPr>
+            <w:r>
+              <w:rPr>
+                <w:rFonts w:ascii="Microsoft YaHei" w:hAnsi="Microsoft YaHei" w:eastAsia="Microsoft YaHei"/>
+                <w:b/>
+                <w:color w:val="FFFFFF"/>
+                <w:sz w:val="18"/>
+              </w:rPr>
+              <w:t>操作码</w:t>
+            </w:r>
+          </w:p>
+        </w:tc>
+        <w:tc>
+          <w:tcPr>
+            <w:tcW w:type="dxa" w:w="1800"/>
+            <w:shd w:fill="1F4E78"/>
+            <w:tcMar>
+              <w:top w:w="90" w:type="dxa"/>
+              <w:start w:w="110" w:type="dxa"/>
+              <w:bottom w:w="90" w:type="dxa"/>
+              <w:end w:w="110" w:type="dxa"/>
+            </w:tcMar>
+            <w:vAlign w:val="center"/>
+          </w:tcPr>
+          <w:p>
+            <w:pPr>
+              <w:spacing w:before="0" w:after="0"/>
+              <w:jc w:val="center"/>
+            </w:pPr>
+            <w:r>
+              <w:rPr>
+                <w:rFonts w:ascii="Microsoft YaHei" w:hAnsi="Microsoft YaHei" w:eastAsia="Microsoft YaHei"/>
+                <w:b/>
+                <w:color w:val="FFFFFF"/>
+                <w:sz w:val="18"/>
+              </w:rPr>
+              <w:t>功能</w:t>
+            </w:r>
+          </w:p>
+        </w:tc>
+        <w:tc>
+          <w:tcPr>
+            <w:tcW w:type="dxa" w:w="5112"/>
+            <w:shd w:fill="1F4E78"/>
+            <w:tcMar>
+              <w:top w:w="90" w:type="dxa"/>
+              <w:start w:w="110" w:type="dxa"/>
+              <w:bottom w:w="90" w:type="dxa"/>
+              <w:end w:w="110" w:type="dxa"/>
+            </w:tcMar>
+            <w:vAlign w:val="center"/>
+          </w:tcPr>
+          <w:p>
+            <w:pPr>
+              <w:spacing w:before="0" w:after="0"/>
+              <w:jc w:val="center"/>
+            </w:pPr>
+            <w:r>
+              <w:rPr>
+                <w:rFonts w:ascii="Microsoft YaHei" w:hAnsi="Microsoft YaHei" w:eastAsia="Microsoft YaHei"/>
+                <w:b/>
+                <w:color w:val="FFFFFF"/>
+                <w:sz w:val="18"/>
+              </w:rPr>
+              <w:t>请求数据</w:t>
+            </w:r>
+          </w:p>
+        </w:tc>
+        <w:tc>
+          <w:tcPr>
+            <w:tcW w:type="dxa" w:w="2088"/>
+            <w:shd w:fill="1F4E78"/>
+            <w:tcMar>
+              <w:top w:w="90" w:type="dxa"/>
+              <w:start w:w="110" w:type="dxa"/>
+              <w:bottom w:w="90" w:type="dxa"/>
+              <w:end w:w="110" w:type="dxa"/>
+            </w:tcMar>
+            <w:vAlign w:val="center"/>
+          </w:tcPr>
+          <w:p>
+            <w:pPr>
+              <w:spacing w:before="0" w:after="0"/>
+              <w:jc w:val="center"/>
+            </w:pPr>
+            <w:r>
+              <w:rPr>
+                <w:rFonts w:ascii="Microsoft YaHei" w:hAnsi="Microsoft YaHei" w:eastAsia="Microsoft YaHei"/>
+                <w:b/>
+                <w:color w:val="FFFFFF"/>
+                <w:sz w:val="18"/>
+              </w:rPr>
+              <w:t>响应数据</w:t>
+            </w:r>
+          </w:p>
+        </w:tc>
+      </w:tr>
+      <w:tr>
+        <w:trPr>
+          <w:cantSplit/>
+        </w:trPr>
+        <w:tc>
+          <w:tcPr>
+            <w:tcW w:type="dxa" w:w="1080"/>
+            <w:tcMar>
+              <w:top w:w="90" w:type="dxa"/>
+              <w:start w:w="110" w:type="dxa"/>
+              <w:bottom w:w="90" w:type="dxa"/>
+              <w:end w:w="110" w:type="dxa"/>
+            </w:tcMar>
+            <w:vAlign w:val="center"/>
+          </w:tcPr>
+          <w:p>
+            <w:pPr>
+              <w:spacing w:before="0" w:after="0" w:line="259" w:lineRule="auto"/>
+            </w:pPr>
+            <w:r>
+              <w:rPr>
+                <w:rFonts w:ascii="Microsoft YaHei" w:hAnsi="Microsoft YaHei" w:eastAsia="Microsoft YaHei"/>
+                <w:b w:val="0"/>
+                <w:color w:val="000000"/>
+                <w:sz w:val="18"/>
+              </w:rPr>
+              <w:t>01</w:t>
+            </w:r>
+          </w:p>
+        </w:tc>
+        <w:tc>
+          <w:tcPr>
+            <w:tcW w:type="dxa" w:w="1800"/>
+            <w:tcMar>
+              <w:top w:w="90" w:type="dxa"/>
+              <w:start w:w="110" w:type="dxa"/>
+              <w:bottom w:w="90" w:type="dxa"/>
+              <w:end w:w="110" w:type="dxa"/>
+            </w:tcMar>
+            <w:vAlign w:val="center"/>
+          </w:tcPr>
+          <w:p>
+            <w:pPr>
+              <w:spacing w:before="0" w:after="0" w:line="259" w:lineRule="auto"/>
+            </w:pPr>
+            <w:r>
+              <w:rPr>
+                <w:rFonts w:ascii="Microsoft YaHei" w:hAnsi="Microsoft YaHei" w:eastAsia="Microsoft YaHei"/>
+                <w:b w:val="0"/>
+                <w:color w:val="000000"/>
+                <w:sz w:val="18"/>
+              </w:rPr>
+              <w:t>I²C 启用</w:t>
+            </w:r>
+          </w:p>
+        </w:tc>
+        <w:tc>
+          <w:tcPr>
+            <w:tcW w:type="dxa" w:w="5112"/>
+            <w:tcMar>
+              <w:top w:w="90" w:type="dxa"/>
+              <w:start w:w="110" w:type="dxa"/>
+              <w:bottom w:w="90" w:type="dxa"/>
+              <w:end w:w="110" w:type="dxa"/>
+            </w:tcMar>
+            <w:vAlign w:val="center"/>
+          </w:tcPr>
+          <w:p>
+            <w:pPr>
+              <w:spacing w:before="0" w:after="0" w:line="259" w:lineRule="auto"/>
+            </w:pPr>
+            <w:r>
+              <w:rPr>
+                <w:rFonts w:ascii="Microsoft YaHei" w:hAnsi="Microsoft YaHei" w:eastAsia="Microsoft YaHei"/>
+                <w:b w:val="0"/>
+                <w:color w:val="000000"/>
+                <w:sz w:val="18"/>
+              </w:rPr>
+              <w:t>SDA SCL 频率4字节</w:t>
+            </w:r>
+          </w:p>
+        </w:tc>
+        <w:tc>
+          <w:tcPr>
+            <w:tcW w:type="dxa" w:w="2088"/>
+            <w:tcMar>
+              <w:top w:w="90" w:type="dxa"/>
+              <w:start w:w="110" w:type="dxa"/>
+              <w:bottom w:w="90" w:type="dxa"/>
+              <w:end w:w="110" w:type="dxa"/>
+            </w:tcMar>
+            <w:vAlign w:val="center"/>
+          </w:tcPr>
+          <w:p>
+            <w:pPr>
+              <w:spacing w:before="0" w:after="0" w:line="259" w:lineRule="auto"/>
+            </w:pPr>
+            <w:r>
+              <w:rPr>
+                <w:rFonts w:ascii="Microsoft YaHei" w:hAnsi="Microsoft YaHei" w:eastAsia="Microsoft YaHei"/>
+                <w:b w:val="0"/>
+                <w:color w:val="000000"/>
+                <w:sz w:val="18"/>
+              </w:rPr>
+              <w:t>空</w:t>
+            </w:r>
+          </w:p>
+        </w:tc>
+      </w:tr>
+      <w:tr>
+        <w:trPr>
+          <w:cantSplit/>
+        </w:trPr>
+        <w:tc>
+          <w:tcPr>
+            <w:tcW w:type="dxa" w:w="1080"/>
+            <w:shd w:fill="EAF2F8"/>
+            <w:tcMar>
+              <w:top w:w="90" w:type="dxa"/>
+              <w:start w:w="110" w:type="dxa"/>
+              <w:bottom w:w="90" w:type="dxa"/>
+              <w:end w:w="110" w:type="dxa"/>
+            </w:tcMar>
+            <w:vAlign w:val="center"/>
+          </w:tcPr>
+          <w:p>
+            <w:pPr>
+              <w:spacing w:before="0" w:after="0" w:line="259" w:lineRule="auto"/>
+            </w:pPr>
+            <w:r>
+              <w:rPr>
+                <w:rFonts w:ascii="Microsoft YaHei" w:hAnsi="Microsoft YaHei" w:eastAsia="Microsoft YaHei"/>
+                <w:b w:val="0"/>
+                <w:color w:val="000000"/>
+                <w:sz w:val="18"/>
+              </w:rPr>
+              <w:t>02</w:t>
+            </w:r>
+          </w:p>
+        </w:tc>
+        <w:tc>
+          <w:tcPr>
+            <w:tcW w:type="dxa" w:w="1800"/>
+            <w:shd w:fill="EAF2F8"/>
+            <w:tcMar>
+              <w:top w:w="90" w:type="dxa"/>
+              <w:start w:w="110" w:type="dxa"/>
+              <w:bottom w:w="90" w:type="dxa"/>
+              <w:end w:w="110" w:type="dxa"/>
+            </w:tcMar>
+            <w:vAlign w:val="center"/>
+          </w:tcPr>
+          <w:p>
+            <w:pPr>
+              <w:spacing w:before="0" w:after="0" w:line="259" w:lineRule="auto"/>
+            </w:pPr>
+            <w:r>
+              <w:rPr>
+                <w:rFonts w:ascii="Microsoft YaHei" w:hAnsi="Microsoft YaHei" w:eastAsia="Microsoft YaHei"/>
+                <w:b w:val="0"/>
+                <w:color w:val="000000"/>
+                <w:sz w:val="18"/>
+              </w:rPr>
+              <w:t>I²C 释放</w:t>
+            </w:r>
+          </w:p>
+        </w:tc>
+        <w:tc>
+          <w:tcPr>
+            <w:tcW w:type="dxa" w:w="5112"/>
+            <w:shd w:fill="EAF2F8"/>
+            <w:tcMar>
+              <w:top w:w="90" w:type="dxa"/>
+              <w:start w:w="110" w:type="dxa"/>
+              <w:bottom w:w="90" w:type="dxa"/>
+              <w:end w:w="110" w:type="dxa"/>
+            </w:tcMar>
+            <w:vAlign w:val="center"/>
+          </w:tcPr>
+          <w:p>
+            <w:pPr>
+              <w:spacing w:before="0" w:after="0" w:line="259" w:lineRule="auto"/>
+            </w:pPr>
+            <w:r>
+              <w:rPr>
+                <w:rFonts w:ascii="Microsoft YaHei" w:hAnsi="Microsoft YaHei" w:eastAsia="Microsoft YaHei"/>
+                <w:b w:val="0"/>
+                <w:color w:val="000000"/>
+                <w:sz w:val="18"/>
+              </w:rPr>
+              <w:t>空</w:t>
+            </w:r>
+          </w:p>
+        </w:tc>
+        <w:tc>
+          <w:tcPr>
+            <w:tcW w:type="dxa" w:w="2088"/>
+            <w:shd w:fill="EAF2F8"/>
+            <w:tcMar>
+              <w:top w:w="90" w:type="dxa"/>
+              <w:start w:w="110" w:type="dxa"/>
+              <w:bottom w:w="90" w:type="dxa"/>
+              <w:end w:w="110" w:type="dxa"/>
+            </w:tcMar>
+            <w:vAlign w:val="center"/>
+          </w:tcPr>
+          <w:p>
+            <w:pPr>
+              <w:spacing w:before="0" w:after="0" w:line="259" w:lineRule="auto"/>
+            </w:pPr>
+            <w:r>
+              <w:rPr>
+                <w:rFonts w:ascii="Microsoft YaHei" w:hAnsi="Microsoft YaHei" w:eastAsia="Microsoft YaHei"/>
+                <w:b w:val="0"/>
+                <w:color w:val="000000"/>
+                <w:sz w:val="18"/>
+              </w:rPr>
+              <w:t>空</w:t>
+            </w:r>
+          </w:p>
+        </w:tc>
+      </w:tr>
+      <w:tr>
+        <w:trPr>
+          <w:cantSplit/>
+        </w:trPr>
+        <w:tc>
+          <w:tcPr>
+            <w:tcW w:type="dxa" w:w="1080"/>
+            <w:tcMar>
+              <w:top w:w="90" w:type="dxa"/>
+              <w:start w:w="110" w:type="dxa"/>
+              <w:bottom w:w="90" w:type="dxa"/>
+              <w:end w:w="110" w:type="dxa"/>
+            </w:tcMar>
+            <w:vAlign w:val="center"/>
+          </w:tcPr>
+          <w:p>
+            <w:pPr>
+              <w:spacing w:before="0" w:after="0" w:line="259" w:lineRule="auto"/>
+            </w:pPr>
+            <w:r>
+              <w:rPr>
+                <w:rFonts w:ascii="Microsoft YaHei" w:hAnsi="Microsoft YaHei" w:eastAsia="Microsoft YaHei"/>
+                <w:b w:val="0"/>
+                <w:color w:val="000000"/>
+                <w:sz w:val="18"/>
+              </w:rPr>
+              <w:t>03</w:t>
+            </w:r>
+          </w:p>
+        </w:tc>
+        <w:tc>
+          <w:tcPr>
+            <w:tcW w:type="dxa" w:w="1800"/>
+            <w:tcMar>
+              <w:top w:w="90" w:type="dxa"/>
+              <w:start w:w="110" w:type="dxa"/>
+              <w:bottom w:w="90" w:type="dxa"/>
+              <w:end w:w="110" w:type="dxa"/>
+            </w:tcMar>
+            <w:vAlign w:val="center"/>
+          </w:tcPr>
+          <w:p>
+            <w:pPr>
+              <w:spacing w:before="0" w:after="0" w:line="259" w:lineRule="auto"/>
+            </w:pPr>
+            <w:r>
+              <w:rPr>
+                <w:rFonts w:ascii="Microsoft YaHei" w:hAnsi="Microsoft YaHei" w:eastAsia="Microsoft YaHei"/>
+                <w:b w:val="0"/>
+                <w:color w:val="000000"/>
+                <w:sz w:val="18"/>
+              </w:rPr>
+              <w:t>I²C 扫描</w:t>
+            </w:r>
+          </w:p>
+        </w:tc>
+        <w:tc>
+          <w:tcPr>
+            <w:tcW w:type="dxa" w:w="5112"/>
+            <w:tcMar>
+              <w:top w:w="90" w:type="dxa"/>
+              <w:start w:w="110" w:type="dxa"/>
+              <w:bottom w:w="90" w:type="dxa"/>
+              <w:end w:w="110" w:type="dxa"/>
+            </w:tcMar>
+            <w:vAlign w:val="center"/>
+          </w:tcPr>
+          <w:p>
+            <w:pPr>
+              <w:spacing w:before="0" w:after="0" w:line="259" w:lineRule="auto"/>
+            </w:pPr>
+            <w:r>
+              <w:rPr>
+                <w:rFonts w:ascii="Microsoft YaHei" w:hAnsi="Microsoft YaHei" w:eastAsia="Microsoft YaHei"/>
+                <w:b w:val="0"/>
+                <w:color w:val="000000"/>
+                <w:sz w:val="18"/>
+              </w:rPr>
+              <w:t>空</w:t>
+            </w:r>
+          </w:p>
+        </w:tc>
+        <w:tc>
+          <w:tcPr>
+            <w:tcW w:type="dxa" w:w="2088"/>
+            <w:tcMar>
+              <w:top w:w="90" w:type="dxa"/>
+              <w:start w:w="110" w:type="dxa"/>
+              <w:bottom w:w="90" w:type="dxa"/>
+              <w:end w:w="110" w:type="dxa"/>
+            </w:tcMar>
+            <w:vAlign w:val="center"/>
+          </w:tcPr>
+          <w:p>
+            <w:pPr>
+              <w:spacing w:before="0" w:after="0" w:line="259" w:lineRule="auto"/>
+            </w:pPr>
+            <w:r>
+              <w:rPr>
+                <w:rFonts w:ascii="Microsoft YaHei" w:hAnsi="Microsoft YaHei" w:eastAsia="Microsoft YaHei"/>
+                <w:b w:val="0"/>
+                <w:color w:val="000000"/>
+                <w:sz w:val="18"/>
+              </w:rPr>
+              <w:t>16 字节地址位图</w:t>
+            </w:r>
+          </w:p>
+        </w:tc>
+      </w:tr>
+      <w:tr>
+        <w:trPr>
+          <w:cantSplit/>
+        </w:trPr>
+        <w:tc>
+          <w:tcPr>
+            <w:tcW w:type="dxa" w:w="1080"/>
+            <w:shd w:fill="EAF2F8"/>
+            <w:tcMar>
+              <w:top w:w="90" w:type="dxa"/>
+              <w:start w:w="110" w:type="dxa"/>
+              <w:bottom w:w="90" w:type="dxa"/>
+              <w:end w:w="110" w:type="dxa"/>
+            </w:tcMar>
+            <w:vAlign w:val="center"/>
+          </w:tcPr>
+          <w:p>
+            <w:pPr>
+              <w:spacing w:before="0" w:after="0" w:line="259" w:lineRule="auto"/>
+            </w:pPr>
+            <w:r>
+              <w:rPr>
+                <w:rFonts w:ascii="Microsoft YaHei" w:hAnsi="Microsoft YaHei" w:eastAsia="Microsoft YaHei"/>
+                <w:b w:val="0"/>
+                <w:color w:val="000000"/>
+                <w:sz w:val="18"/>
+              </w:rPr>
+              <w:t>04</w:t>
+            </w:r>
+          </w:p>
+        </w:tc>
+        <w:tc>
+          <w:tcPr>
+            <w:tcW w:type="dxa" w:w="1800"/>
+            <w:shd w:fill="EAF2F8"/>
+            <w:tcMar>
+              <w:top w:w="90" w:type="dxa"/>
+              <w:start w:w="110" w:type="dxa"/>
+              <w:bottom w:w="90" w:type="dxa"/>
+              <w:end w:w="110" w:type="dxa"/>
+            </w:tcMar>
+            <w:vAlign w:val="center"/>
+          </w:tcPr>
+          <w:p>
+            <w:pPr>
+              <w:spacing w:before="0" w:after="0" w:line="259" w:lineRule="auto"/>
+            </w:pPr>
+            <w:r>
+              <w:rPr>
+                <w:rFonts w:ascii="Microsoft YaHei" w:hAnsi="Microsoft YaHei" w:eastAsia="Microsoft YaHei"/>
+                <w:b w:val="0"/>
+                <w:color w:val="000000"/>
+                <w:sz w:val="18"/>
+              </w:rPr>
+              <w:t>I²C 事务</w:t>
+            </w:r>
+          </w:p>
+        </w:tc>
+        <w:tc>
+          <w:tcPr>
+            <w:tcW w:type="dxa" w:w="5112"/>
+            <w:shd w:fill="EAF2F8"/>
+            <w:tcMar>
+              <w:top w:w="90" w:type="dxa"/>
+              <w:start w:w="110" w:type="dxa"/>
+              <w:bottom w:w="90" w:type="dxa"/>
+              <w:end w:w="110" w:type="dxa"/>
+            </w:tcMar>
+            <w:vAlign w:val="center"/>
+          </w:tcPr>
+          <w:p>
+            <w:pPr>
+              <w:spacing w:before="0" w:after="0" w:line="259" w:lineRule="auto"/>
+            </w:pPr>
+            <w:r>
+              <w:rPr>
+                <w:rFonts w:ascii="Microsoft YaHei" w:hAnsi="Microsoft YaHei" w:eastAsia="Microsoft YaHei"/>
+                <w:b w:val="0"/>
+                <w:color w:val="000000"/>
+                <w:sz w:val="18"/>
+              </w:rPr>
+              <w:t>地址 写长度 读长度 写数据</w:t>
+            </w:r>
+          </w:p>
+        </w:tc>
+        <w:tc>
+          <w:tcPr>
+            <w:tcW w:type="dxa" w:w="2088"/>
+            <w:shd w:fill="EAF2F8"/>
+            <w:tcMar>
+              <w:top w:w="90" w:type="dxa"/>
+              <w:start w:w="110" w:type="dxa"/>
+              <w:bottom w:w="90" w:type="dxa"/>
+              <w:end w:w="110" w:type="dxa"/>
+            </w:tcMar>
+            <w:vAlign w:val="center"/>
+          </w:tcPr>
+          <w:p>
+            <w:pPr>
+              <w:spacing w:before="0" w:after="0" w:line="259" w:lineRule="auto"/>
+            </w:pPr>
+            <w:r>
+              <w:rPr>
+                <w:rFonts w:ascii="Microsoft YaHei" w:hAnsi="Microsoft YaHei" w:eastAsia="Microsoft YaHei"/>
+                <w:b w:val="0"/>
+                <w:color w:val="000000"/>
+                <w:sz w:val="18"/>
+              </w:rPr>
+              <w:t>读数据</w:t>
+            </w:r>
+          </w:p>
+        </w:tc>
+      </w:tr>
+      <w:tr>
+        <w:trPr>
+          <w:cantSplit/>
+        </w:trPr>
+        <w:tc>
+          <w:tcPr>
+            <w:tcW w:type="dxa" w:w="1080"/>
+            <w:tcMar>
+              <w:top w:w="90" w:type="dxa"/>
+              <w:start w:w="110" w:type="dxa"/>
+              <w:bottom w:w="90" w:type="dxa"/>
+              <w:end w:w="110" w:type="dxa"/>
+            </w:tcMar>
+            <w:vAlign w:val="center"/>
+          </w:tcPr>
+          <w:p>
+            <w:pPr>
+              <w:spacing w:before="0" w:after="0" w:line="259" w:lineRule="auto"/>
+            </w:pPr>
+            <w:r>
+              <w:rPr>
+                <w:rFonts w:ascii="Microsoft YaHei" w:hAnsi="Microsoft YaHei" w:eastAsia="Microsoft YaHei"/>
+                <w:b w:val="0"/>
+                <w:color w:val="000000"/>
+                <w:sz w:val="18"/>
+              </w:rPr>
+              <w:t>05</w:t>
+            </w:r>
+          </w:p>
+        </w:tc>
+        <w:tc>
+          <w:tcPr>
+            <w:tcW w:type="dxa" w:w="1800"/>
+            <w:tcMar>
+              <w:top w:w="90" w:type="dxa"/>
+              <w:start w:w="110" w:type="dxa"/>
+              <w:bottom w:w="90" w:type="dxa"/>
+              <w:end w:w="110" w:type="dxa"/>
+            </w:tcMar>
+            <w:vAlign w:val="center"/>
+          </w:tcPr>
+          <w:p>
+            <w:pPr>
+              <w:spacing w:before="0" w:after="0" w:line="259" w:lineRule="auto"/>
+            </w:pPr>
+            <w:r>
+              <w:rPr>
+                <w:rFonts w:ascii="Microsoft YaHei" w:hAnsi="Microsoft YaHei" w:eastAsia="Microsoft YaHei"/>
+                <w:b w:val="0"/>
+                <w:color w:val="000000"/>
+                <w:sz w:val="18"/>
+              </w:rPr>
+              <w:t>SPI 启用</w:t>
+            </w:r>
+          </w:p>
+        </w:tc>
+        <w:tc>
+          <w:tcPr>
+            <w:tcW w:type="dxa" w:w="5112"/>
+            <w:tcMar>
+              <w:top w:w="90" w:type="dxa"/>
+              <w:start w:w="110" w:type="dxa"/>
+              <w:bottom w:w="90" w:type="dxa"/>
+              <w:end w:w="110" w:type="dxa"/>
+            </w:tcMar>
+            <w:vAlign w:val="center"/>
+          </w:tcPr>
+          <w:p>
+            <w:pPr>
+              <w:spacing w:before="0" w:after="0" w:line="259" w:lineRule="auto"/>
+            </w:pPr>
+            <w:r>
+              <w:rPr>
+                <w:rFonts w:ascii="Microsoft YaHei" w:hAnsi="Microsoft YaHei" w:eastAsia="Microsoft YaHei"/>
+                <w:b w:val="0"/>
+                <w:color w:val="000000"/>
+                <w:sz w:val="18"/>
+              </w:rPr>
+              <w:t>SCLK MOSI MISO CS 模式 频率4字节</w:t>
+            </w:r>
+          </w:p>
+        </w:tc>
+        <w:tc>
+          <w:tcPr>
+            <w:tcW w:type="dxa" w:w="2088"/>
+            <w:tcMar>
+              <w:top w:w="90" w:type="dxa"/>
+              <w:start w:w="110" w:type="dxa"/>
+              <w:bottom w:w="90" w:type="dxa"/>
+              <w:end w:w="110" w:type="dxa"/>
+            </w:tcMar>
+            <w:vAlign w:val="center"/>
+          </w:tcPr>
+          <w:p>
+            <w:pPr>
+              <w:spacing w:before="0" w:after="0" w:line="259" w:lineRule="auto"/>
+            </w:pPr>
+            <w:r>
+              <w:rPr>
+                <w:rFonts w:ascii="Microsoft YaHei" w:hAnsi="Microsoft YaHei" w:eastAsia="Microsoft YaHei"/>
+                <w:b w:val="0"/>
+                <w:color w:val="000000"/>
+                <w:sz w:val="18"/>
+              </w:rPr>
+              <w:t>空</w:t>
+            </w:r>
+          </w:p>
+        </w:tc>
+      </w:tr>
+      <w:tr>
+        <w:trPr>
+          <w:cantSplit/>
+        </w:trPr>
+        <w:tc>
+          <w:tcPr>
+            <w:tcW w:type="dxa" w:w="1080"/>
+            <w:shd w:fill="EAF2F8"/>
+            <w:tcMar>
+              <w:top w:w="90" w:type="dxa"/>
+              <w:start w:w="110" w:type="dxa"/>
+              <w:bottom w:w="90" w:type="dxa"/>
+              <w:end w:w="110" w:type="dxa"/>
+            </w:tcMar>
+            <w:vAlign w:val="center"/>
+          </w:tcPr>
+          <w:p>
+            <w:pPr>
+              <w:spacing w:before="0" w:after="0" w:line="259" w:lineRule="auto"/>
+            </w:pPr>
+            <w:r>
+              <w:rPr>
+                <w:rFonts w:ascii="Microsoft YaHei" w:hAnsi="Microsoft YaHei" w:eastAsia="Microsoft YaHei"/>
+                <w:b w:val="0"/>
+                <w:color w:val="000000"/>
+                <w:sz w:val="18"/>
+              </w:rPr>
+              <w:t>06</w:t>
+            </w:r>
+          </w:p>
+        </w:tc>
+        <w:tc>
+          <w:tcPr>
+            <w:tcW w:type="dxa" w:w="1800"/>
+            <w:shd w:fill="EAF2F8"/>
+            <w:tcMar>
+              <w:top w:w="90" w:type="dxa"/>
+              <w:start w:w="110" w:type="dxa"/>
+              <w:bottom w:w="90" w:type="dxa"/>
+              <w:end w:w="110" w:type="dxa"/>
+            </w:tcMar>
+            <w:vAlign w:val="center"/>
+          </w:tcPr>
+          <w:p>
+            <w:pPr>
+              <w:spacing w:before="0" w:after="0" w:line="259" w:lineRule="auto"/>
+            </w:pPr>
+            <w:r>
+              <w:rPr>
+                <w:rFonts w:ascii="Microsoft YaHei" w:hAnsi="Microsoft YaHei" w:eastAsia="Microsoft YaHei"/>
+                <w:b w:val="0"/>
+                <w:color w:val="000000"/>
+                <w:sz w:val="18"/>
+              </w:rPr>
+              <w:t>SPI 释放</w:t>
+            </w:r>
+          </w:p>
+        </w:tc>
+        <w:tc>
+          <w:tcPr>
+            <w:tcW w:type="dxa" w:w="5112"/>
+            <w:shd w:fill="EAF2F8"/>
+            <w:tcMar>
+              <w:top w:w="90" w:type="dxa"/>
+              <w:start w:w="110" w:type="dxa"/>
+              <w:bottom w:w="90" w:type="dxa"/>
+              <w:end w:w="110" w:type="dxa"/>
+            </w:tcMar>
+            <w:vAlign w:val="center"/>
+          </w:tcPr>
+          <w:p>
+            <w:pPr>
+              <w:spacing w:before="0" w:after="0" w:line="259" w:lineRule="auto"/>
+            </w:pPr>
+            <w:r>
+              <w:rPr>
+                <w:rFonts w:ascii="Microsoft YaHei" w:hAnsi="Microsoft YaHei" w:eastAsia="Microsoft YaHei"/>
+                <w:b w:val="0"/>
+                <w:color w:val="000000"/>
+                <w:sz w:val="18"/>
+              </w:rPr>
+              <w:t>空</w:t>
+            </w:r>
+          </w:p>
+        </w:tc>
+        <w:tc>
+          <w:tcPr>
+            <w:tcW w:type="dxa" w:w="2088"/>
+            <w:shd w:fill="EAF2F8"/>
+            <w:tcMar>
+              <w:top w:w="90" w:type="dxa"/>
+              <w:start w:w="110" w:type="dxa"/>
+              <w:bottom w:w="90" w:type="dxa"/>
+              <w:end w:w="110" w:type="dxa"/>
+            </w:tcMar>
+            <w:vAlign w:val="center"/>
+          </w:tcPr>
+          <w:p>
+            <w:pPr>
+              <w:spacing w:before="0" w:after="0" w:line="259" w:lineRule="auto"/>
+            </w:pPr>
+            <w:r>
+              <w:rPr>
+                <w:rFonts w:ascii="Microsoft YaHei" w:hAnsi="Microsoft YaHei" w:eastAsia="Microsoft YaHei"/>
+                <w:b w:val="0"/>
+                <w:color w:val="000000"/>
+                <w:sz w:val="18"/>
+              </w:rPr>
+              <w:t>空</w:t>
+            </w:r>
+          </w:p>
+        </w:tc>
+      </w:tr>
+      <w:tr>
+        <w:trPr>
+          <w:cantSplit/>
+        </w:trPr>
+        <w:tc>
+          <w:tcPr>
+            <w:tcW w:type="dxa" w:w="1080"/>
+            <w:tcMar>
+              <w:top w:w="90" w:type="dxa"/>
+              <w:start w:w="110" w:type="dxa"/>
+              <w:bottom w:w="90" w:type="dxa"/>
+              <w:end w:w="110" w:type="dxa"/>
+            </w:tcMar>
+            <w:vAlign w:val="center"/>
+          </w:tcPr>
+          <w:p>
+            <w:pPr>
+              <w:spacing w:before="0" w:after="0" w:line="259" w:lineRule="auto"/>
+            </w:pPr>
+            <w:r>
+              <w:rPr>
+                <w:rFonts w:ascii="Microsoft YaHei" w:hAnsi="Microsoft YaHei" w:eastAsia="Microsoft YaHei"/>
+                <w:b w:val="0"/>
+                <w:color w:val="000000"/>
+                <w:sz w:val="18"/>
+              </w:rPr>
+              <w:t>07</w:t>
+            </w:r>
+          </w:p>
+        </w:tc>
+        <w:tc>
+          <w:tcPr>
+            <w:tcW w:type="dxa" w:w="1800"/>
+            <w:tcMar>
+              <w:top w:w="90" w:type="dxa"/>
+              <w:start w:w="110" w:type="dxa"/>
+              <w:bottom w:w="90" w:type="dxa"/>
+              <w:end w:w="110" w:type="dxa"/>
+            </w:tcMar>
+            <w:vAlign w:val="center"/>
+          </w:tcPr>
+          <w:p>
+            <w:pPr>
+              <w:spacing w:before="0" w:after="0" w:line="259" w:lineRule="auto"/>
+            </w:pPr>
+            <w:r>
+              <w:rPr>
+                <w:rFonts w:ascii="Microsoft YaHei" w:hAnsi="Microsoft YaHei" w:eastAsia="Microsoft YaHei"/>
+                <w:b w:val="0"/>
+                <w:color w:val="000000"/>
+                <w:sz w:val="18"/>
+              </w:rPr>
+              <w:t>SPI 全双工</w:t>
+            </w:r>
+          </w:p>
+        </w:tc>
+        <w:tc>
+          <w:tcPr>
+            <w:tcW w:type="dxa" w:w="5112"/>
+            <w:tcMar>
+              <w:top w:w="90" w:type="dxa"/>
+              <w:start w:w="110" w:type="dxa"/>
+              <w:bottom w:w="90" w:type="dxa"/>
+              <w:end w:w="110" w:type="dxa"/>
+            </w:tcMar>
+            <w:vAlign w:val="center"/>
+          </w:tcPr>
+          <w:p>
+            <w:pPr>
+              <w:spacing w:before="0" w:after="0" w:line="259" w:lineRule="auto"/>
+            </w:pPr>
+            <w:r>
+              <w:rPr>
+                <w:rFonts w:ascii="Microsoft YaHei" w:hAnsi="Microsoft YaHei" w:eastAsia="Microsoft YaHei"/>
+                <w:b w:val="0"/>
+                <w:color w:val="000000"/>
+                <w:sz w:val="18"/>
+              </w:rPr>
+              <w:t>长度 发送数据</w:t>
+            </w:r>
+          </w:p>
+        </w:tc>
+        <w:tc>
+          <w:tcPr>
+            <w:tcW w:type="dxa" w:w="2088"/>
+            <w:tcMar>
+              <w:top w:w="90" w:type="dxa"/>
+              <w:start w:w="110" w:type="dxa"/>
+              <w:bottom w:w="90" w:type="dxa"/>
+              <w:end w:w="110" w:type="dxa"/>
+            </w:tcMar>
+            <w:vAlign w:val="center"/>
+          </w:tcPr>
+          <w:p>
+            <w:pPr>
+              <w:spacing w:before="0" w:after="0" w:line="259" w:lineRule="auto"/>
+            </w:pPr>
+            <w:r>
+              <w:rPr>
+                <w:rFonts w:ascii="Microsoft YaHei" w:hAnsi="Microsoft YaHei" w:eastAsia="Microsoft YaHei"/>
+                <w:b w:val="0"/>
+                <w:color w:val="000000"/>
+                <w:sz w:val="18"/>
+              </w:rPr>
+              <w:t>同长度接收数据</w:t>
+            </w:r>
+          </w:p>
+        </w:tc>
+      </w:tr>
+      <w:tr>
+        <w:trPr>
+          <w:cantSplit/>
+        </w:trPr>
+        <w:tc>
+          <w:tcPr>
+            <w:tcW w:type="dxa" w:w="1080"/>
+            <w:shd w:fill="EAF2F8"/>
+            <w:tcMar>
+              <w:top w:w="90" w:type="dxa"/>
+              <w:start w:w="110" w:type="dxa"/>
+              <w:bottom w:w="90" w:type="dxa"/>
+              <w:end w:w="110" w:type="dxa"/>
+            </w:tcMar>
+            <w:vAlign w:val="center"/>
+          </w:tcPr>
+          <w:p>
+            <w:pPr>
+              <w:spacing w:before="0" w:after="0" w:line="259" w:lineRule="auto"/>
+            </w:pPr>
+            <w:r>
+              <w:rPr>
+                <w:rFonts w:ascii="Microsoft YaHei" w:hAnsi="Microsoft YaHei" w:eastAsia="Microsoft YaHei"/>
+                <w:b w:val="0"/>
+                <w:color w:val="000000"/>
+                <w:sz w:val="18"/>
+              </w:rPr>
+              <w:t>08</w:t>
+            </w:r>
+          </w:p>
+        </w:tc>
+        <w:tc>
+          <w:tcPr>
+            <w:tcW w:type="dxa" w:w="1800"/>
+            <w:shd w:fill="EAF2F8"/>
+            <w:tcMar>
+              <w:top w:w="90" w:type="dxa"/>
+              <w:start w:w="110" w:type="dxa"/>
+              <w:bottom w:w="90" w:type="dxa"/>
+              <w:end w:w="110" w:type="dxa"/>
+            </w:tcMar>
+            <w:vAlign w:val="center"/>
+          </w:tcPr>
+          <w:p>
+            <w:pPr>
+              <w:spacing w:before="0" w:after="0" w:line="259" w:lineRule="auto"/>
+            </w:pPr>
+            <w:r>
+              <w:rPr>
+                <w:rFonts w:ascii="Microsoft YaHei" w:hAnsi="Microsoft YaHei" w:eastAsia="Microsoft YaHei"/>
+                <w:b w:val="0"/>
+                <w:color w:val="000000"/>
+                <w:sz w:val="18"/>
+              </w:rPr>
+              <w:t>UART 启用</w:t>
+            </w:r>
+          </w:p>
+        </w:tc>
+        <w:tc>
+          <w:tcPr>
+            <w:tcW w:type="dxa" w:w="5112"/>
+            <w:shd w:fill="EAF2F8"/>
+            <w:tcMar>
+              <w:top w:w="90" w:type="dxa"/>
+              <w:start w:w="110" w:type="dxa"/>
+              <w:bottom w:w="90" w:type="dxa"/>
+              <w:end w:w="110" w:type="dxa"/>
+            </w:tcMar>
+            <w:vAlign w:val="center"/>
+          </w:tcPr>
+          <w:p>
+            <w:pPr>
+              <w:spacing w:before="0" w:after="0" w:line="259" w:lineRule="auto"/>
+            </w:pPr>
+            <w:r>
+              <w:rPr>
+                <w:rFonts w:ascii="Microsoft YaHei" w:hAnsi="Microsoft YaHei" w:eastAsia="Microsoft YaHei"/>
+                <w:b w:val="0"/>
+                <w:color w:val="000000"/>
+                <w:sz w:val="18"/>
+              </w:rPr>
+              <w:t>TX RX 波特率4字节 数据位 校验 停止位</w:t>
+            </w:r>
+          </w:p>
+        </w:tc>
+        <w:tc>
+          <w:tcPr>
+            <w:tcW w:type="dxa" w:w="2088"/>
+            <w:shd w:fill="EAF2F8"/>
+            <w:tcMar>
+              <w:top w:w="90" w:type="dxa"/>
+              <w:start w:w="110" w:type="dxa"/>
+              <w:bottom w:w="90" w:type="dxa"/>
+              <w:end w:w="110" w:type="dxa"/>
+            </w:tcMar>
+            <w:vAlign w:val="center"/>
+          </w:tcPr>
+          <w:p>
+            <w:pPr>
+              <w:spacing w:before="0" w:after="0" w:line="259" w:lineRule="auto"/>
+            </w:pPr>
+            <w:r>
+              <w:rPr>
+                <w:rFonts w:ascii="Microsoft YaHei" w:hAnsi="Microsoft YaHei" w:eastAsia="Microsoft YaHei"/>
+                <w:b w:val="0"/>
+                <w:color w:val="000000"/>
+                <w:sz w:val="18"/>
+              </w:rPr>
+              <w:t>空</w:t>
+            </w:r>
+          </w:p>
+        </w:tc>
+      </w:tr>
+      <w:tr>
+        <w:trPr>
+          <w:cantSplit/>
+        </w:trPr>
+        <w:tc>
+          <w:tcPr>
+            <w:tcW w:type="dxa" w:w="1080"/>
+            <w:tcMar>
+              <w:top w:w="90" w:type="dxa"/>
+              <w:start w:w="110" w:type="dxa"/>
+              <w:bottom w:w="90" w:type="dxa"/>
+              <w:end w:w="110" w:type="dxa"/>
+            </w:tcMar>
+            <w:vAlign w:val="center"/>
+          </w:tcPr>
+          <w:p>
+            <w:pPr>
+              <w:spacing w:before="0" w:after="0" w:line="259" w:lineRule="auto"/>
+            </w:pPr>
+            <w:r>
+              <w:rPr>
+                <w:rFonts w:ascii="Microsoft YaHei" w:hAnsi="Microsoft YaHei" w:eastAsia="Microsoft YaHei"/>
+                <w:b w:val="0"/>
+                <w:color w:val="000000"/>
+                <w:sz w:val="18"/>
+              </w:rPr>
+              <w:t>09</w:t>
+            </w:r>
+          </w:p>
+        </w:tc>
+        <w:tc>
+          <w:tcPr>
+            <w:tcW w:type="dxa" w:w="1800"/>
+            <w:tcMar>
+              <w:top w:w="90" w:type="dxa"/>
+              <w:start w:w="110" w:type="dxa"/>
+              <w:bottom w:w="90" w:type="dxa"/>
+              <w:end w:w="110" w:type="dxa"/>
+            </w:tcMar>
+            <w:vAlign w:val="center"/>
+          </w:tcPr>
+          <w:p>
+            <w:pPr>
+              <w:spacing w:before="0" w:after="0" w:line="259" w:lineRule="auto"/>
+            </w:pPr>
+            <w:r>
+              <w:rPr>
+                <w:rFonts w:ascii="Microsoft YaHei" w:hAnsi="Microsoft YaHei" w:eastAsia="Microsoft YaHei"/>
+                <w:b w:val="0"/>
+                <w:color w:val="000000"/>
+                <w:sz w:val="18"/>
+              </w:rPr>
+              <w:t>UART 释放</w:t>
+            </w:r>
+          </w:p>
+        </w:tc>
+        <w:tc>
+          <w:tcPr>
+            <w:tcW w:type="dxa" w:w="5112"/>
+            <w:tcMar>
+              <w:top w:w="90" w:type="dxa"/>
+              <w:start w:w="110" w:type="dxa"/>
+              <w:bottom w:w="90" w:type="dxa"/>
+              <w:end w:w="110" w:type="dxa"/>
+            </w:tcMar>
+            <w:vAlign w:val="center"/>
+          </w:tcPr>
+          <w:p>
+            <w:pPr>
+              <w:spacing w:before="0" w:after="0" w:line="259" w:lineRule="auto"/>
+            </w:pPr>
+            <w:r>
+              <w:rPr>
+                <w:rFonts w:ascii="Microsoft YaHei" w:hAnsi="Microsoft YaHei" w:eastAsia="Microsoft YaHei"/>
+                <w:b w:val="0"/>
+                <w:color w:val="000000"/>
+                <w:sz w:val="18"/>
+              </w:rPr>
+              <w:t>空</w:t>
+            </w:r>
+          </w:p>
+        </w:tc>
+        <w:tc>
+          <w:tcPr>
+            <w:tcW w:type="dxa" w:w="2088"/>
+            <w:tcMar>
+              <w:top w:w="90" w:type="dxa"/>
+              <w:start w:w="110" w:type="dxa"/>
+              <w:bottom w:w="90" w:type="dxa"/>
+              <w:end w:w="110" w:type="dxa"/>
+            </w:tcMar>
+            <w:vAlign w:val="center"/>
+          </w:tcPr>
+          <w:p>
+            <w:pPr>
+              <w:spacing w:before="0" w:after="0" w:line="259" w:lineRule="auto"/>
+            </w:pPr>
+            <w:r>
+              <w:rPr>
+                <w:rFonts w:ascii="Microsoft YaHei" w:hAnsi="Microsoft YaHei" w:eastAsia="Microsoft YaHei"/>
+                <w:b w:val="0"/>
+                <w:color w:val="000000"/>
+                <w:sz w:val="18"/>
+              </w:rPr>
+              <w:t>空</w:t>
+            </w:r>
+          </w:p>
+        </w:tc>
+      </w:tr>
+      <w:tr>
+        <w:trPr>
+          <w:cantSplit/>
+        </w:trPr>
+        <w:tc>
+          <w:tcPr>
+            <w:tcW w:type="dxa" w:w="1080"/>
+            <w:shd w:fill="EAF2F8"/>
+            <w:tcMar>
+              <w:top w:w="90" w:type="dxa"/>
+              <w:start w:w="110" w:type="dxa"/>
+              <w:bottom w:w="90" w:type="dxa"/>
+              <w:end w:w="110" w:type="dxa"/>
+            </w:tcMar>
+            <w:vAlign w:val="center"/>
+          </w:tcPr>
+          <w:p>
+            <w:pPr>
+              <w:spacing w:before="0" w:after="0" w:line="259" w:lineRule="auto"/>
+            </w:pPr>
+            <w:r>
+              <w:rPr>
+                <w:rFonts w:ascii="Microsoft YaHei" w:hAnsi="Microsoft YaHei" w:eastAsia="Microsoft YaHei"/>
+                <w:b w:val="0"/>
+                <w:color w:val="000000"/>
+                <w:sz w:val="18"/>
+              </w:rPr>
+              <w:t>0A</w:t>
+            </w:r>
+          </w:p>
+        </w:tc>
+        <w:tc>
+          <w:tcPr>
+            <w:tcW w:type="dxa" w:w="1800"/>
+            <w:shd w:fill="EAF2F8"/>
+            <w:tcMar>
+              <w:top w:w="90" w:type="dxa"/>
+              <w:start w:w="110" w:type="dxa"/>
+              <w:bottom w:w="90" w:type="dxa"/>
+              <w:end w:w="110" w:type="dxa"/>
+            </w:tcMar>
+            <w:vAlign w:val="center"/>
+          </w:tcPr>
+          <w:p>
+            <w:pPr>
+              <w:spacing w:before="0" w:after="0" w:line="259" w:lineRule="auto"/>
+            </w:pPr>
+            <w:r>
+              <w:rPr>
+                <w:rFonts w:ascii="Microsoft YaHei" w:hAnsi="Microsoft YaHei" w:eastAsia="Microsoft YaHei"/>
+                <w:b w:val="0"/>
+                <w:color w:val="000000"/>
+                <w:sz w:val="18"/>
+              </w:rPr>
+              <w:t>状态查询</w:t>
+            </w:r>
+          </w:p>
+        </w:tc>
+        <w:tc>
+          <w:tcPr>
+            <w:tcW w:type="dxa" w:w="5112"/>
+            <w:shd w:fill="EAF2F8"/>
+            <w:tcMar>
+              <w:top w:w="90" w:type="dxa"/>
+              <w:start w:w="110" w:type="dxa"/>
+              <w:bottom w:w="90" w:type="dxa"/>
+              <w:end w:w="110" w:type="dxa"/>
+            </w:tcMar>
+            <w:vAlign w:val="center"/>
+          </w:tcPr>
+          <w:p>
+            <w:pPr>
+              <w:spacing w:before="0" w:after="0" w:line="259" w:lineRule="auto"/>
+            </w:pPr>
+            <w:r>
+              <w:rPr>
+                <w:rFonts w:ascii="Microsoft YaHei" w:hAnsi="Microsoft YaHei" w:eastAsia="Microsoft YaHei"/>
+                <w:b w:val="0"/>
+                <w:color w:val="000000"/>
+                <w:sz w:val="18"/>
+              </w:rPr>
+              <w:t>空</w:t>
+            </w:r>
+          </w:p>
+        </w:tc>
+        <w:tc>
+          <w:tcPr>
+            <w:tcW w:type="dxa" w:w="2088"/>
+            <w:shd w:fill="EAF2F8"/>
+            <w:tcMar>
+              <w:top w:w="90" w:type="dxa"/>
+              <w:start w:w="110" w:type="dxa"/>
+              <w:bottom w:w="90" w:type="dxa"/>
+              <w:end w:w="110" w:type="dxa"/>
+            </w:tcMar>
+            <w:vAlign w:val="center"/>
+          </w:tcPr>
+          <w:p>
+            <w:pPr>
+              <w:spacing w:before="0" w:after="0" w:line="259" w:lineRule="auto"/>
+            </w:pPr>
+            <w:r>
+              <w:rPr>
+                <w:rFonts w:ascii="Microsoft YaHei" w:hAnsi="Microsoft YaHei" w:eastAsia="Microsoft YaHei"/>
+                <w:b w:val="0"/>
+                <w:color w:val="000000"/>
+                <w:sz w:val="18"/>
+              </w:rPr>
+              <w:t>25 字节状态记录</w:t>
+            </w:r>
+          </w:p>
+        </w:tc>
+      </w:tr>
+    </w:tbl>
+    <w:p>
+      <w:pPr>
+        <w:spacing w:after="0"/>
+      </w:pPr>
+    </w:p>
+    <w:p>
+      <w:pPr>
+        <w:pStyle w:val="BodyText"/>
+        <w:keepLines w:val="0"/>
+      </w:pPr>
+      <w:r>
+        <w:rPr>
+          <w:rFonts w:ascii="Microsoft YaHei" w:hAnsi="Microsoft YaHei" w:eastAsia="Microsoft YaHei"/>
+          <w:b w:val="0"/>
+          <w:color w:val="000000"/>
+          <w:sz w:val="21"/>
+        </w:rPr>
+        <w:t>I²C 是 7 位地址主机，只接受 0x08～0x77。扫描只探测这 112 个地址；响应位图的 bitN 对应地址 N。事务写长、读长分别限 0～128，但不能同时为 0；同时写读时在两段之间使用重复起始条件，不发 STOP。单次事务超时 500 ms，扫描每个地址探测超时 5 ms。总线需要外部上拉，ESP32-S3 引脚不得承受 5 V。</w:t>
+      </w:r>
+    </w:p>
+    <w:p>
+      <w:pPr>
+        <w:pStyle w:val="BodyText"/>
+        <w:keepLines w:val="0"/>
+      </w:pPr>
+      <w:r>
+        <w:rPr>
+          <w:rFonts w:ascii="Microsoft YaHei" w:hAnsi="Microsoft YaHei" w:eastAsia="Microsoft YaHei"/>
+          <w:b w:val="0"/>
+          <w:color w:val="000000"/>
+          <w:sz w:val="21"/>
+        </w:rPr>
+        <w:t>SPI 使用 SPI2 主机、标准单线、MSB 优先和全双工模式。模式 0～3，频率 10 kHz～10 MHz；单次传输 1～128 字节，收发长度相同。配置 CS 时每次事务自动拉低并释放；省略 CS 时应自行控制目标设备片选。高频时必须在实际连线长度和目标器件上核验时序。</w:t>
+      </w:r>
+    </w:p>
+    <w:p>
+      <w:pPr>
+        <w:pStyle w:val="BodyText"/>
+        <w:keepLines w:val="0"/>
+      </w:pPr>
+      <w:r>
+        <w:rPr>
+          <w:rFonts w:ascii="Microsoft YaHei" w:hAnsi="Microsoft YaHei" w:eastAsia="Microsoft YaHei"/>
+          <w:b w:val="0"/>
+          <w:color w:val="000000"/>
+          <w:sz w:val="21"/>
+        </w:rPr>
+        <w:t>UART1 支持 300～2,000,000 bps，7 或 8 数据位，校验 0 无、1 偶、2 奇，停止位 1 或 2。没有硬件流控。CDC1 不打开时收到的 UART 字节会丢弃；队列和 UART 缓冲有限，持续高速发送或主机长时间不读可能丢字节，不能将它当作无损流记录器。</w:t>
+      </w:r>
+    </w:p>
+    <w:p>
+      <w:pPr>
+        <w:pStyle w:val="Heading2"/>
+      </w:pPr>
+      <w:r>
+        <w:t>13 3 状态记录</w:t>
+      </w:r>
+    </w:p>
+    <w:p>
+      <w:pPr>
+        <w:pStyle w:val="BodyText"/>
+        <w:keepLines w:val="0"/>
+      </w:pPr>
+      <w:r>
+        <w:rPr>
+          <w:rFonts w:ascii="Microsoft YaHei" w:hAnsi="Microsoft YaHei" w:eastAsia="Microsoft YaHei"/>
+          <w:b w:val="0"/>
+          <w:color w:val="000000"/>
+          <w:sz w:val="21"/>
+        </w:rPr>
+        <w:t>操作码 0A 的响应数据固定 25 字节，偏移相对数据字段起算。未启用外设的引脚为 FF，频率为 0。</w:t>
+      </w:r>
+    </w:p>
+    <w:tbl>
+      <w:tblPr>
+        <w:tblW w:type="auto" w:w="0"/>
+        <w:jc w:val="center"/>
+        <w:tblLayout w:type="fixed"/>
+        <w:tblLook w:firstColumn="1" w:firstRow="1" w:lastColumn="0" w:lastRow="0" w:noHBand="0" w:noVBand="1" w:val="04A0"/>
+        <w:tblBorders>
+          <w:top w:val="single" w:sz="6" w:space="0" w:color="D9D9D9"/>
+          <w:left w:val="single" w:sz="6" w:space="0" w:color="D9D9D9"/>
+          <w:bottom w:val="single" w:sz="6" w:space="0" w:color="D9D9D9"/>
+          <w:right w:val="single" w:sz="6" w:space="0" w:color="D9D9D9"/>
+          <w:insideH w:val="single" w:sz="6" w:space="0" w:color="D9D9D9"/>
+          <w:insideV w:val="single" w:sz="6" w:space="0" w:color="D9D9D9"/>
+        </w:tblBorders>
+      </w:tblPr>
+      <w:tblGrid>
+        <w:gridCol w:w="3389"/>
+        <w:gridCol w:w="3389"/>
+        <w:gridCol w:w="3389"/>
+      </w:tblGrid>
+      <w:tr>
+        <w:trPr>
+          <w:tblHeader w:val="true"/>
+          <w:cantSplit/>
+        </w:trPr>
+        <w:tc>
+          <w:tcPr>
+            <w:tcW w:type="dxa" w:w="1368"/>
+            <w:shd w:fill="1F4E78"/>
+            <w:tcMar>
+              <w:top w:w="90" w:type="dxa"/>
+              <w:start w:w="110" w:type="dxa"/>
+              <w:bottom w:w="90" w:type="dxa"/>
+              <w:end w:w="110" w:type="dxa"/>
+            </w:tcMar>
+            <w:vAlign w:val="center"/>
+          </w:tcPr>
+          <w:p>
+            <w:pPr>
+              <w:spacing w:before="0" w:after="0"/>
+              <w:jc w:val="center"/>
+            </w:pPr>
+            <w:r>
+              <w:rPr>
+                <w:rFonts w:ascii="Microsoft YaHei" w:hAnsi="Microsoft YaHei" w:eastAsia="Microsoft YaHei"/>
+                <w:b/>
+                <w:color w:val="FFFFFF"/>
+                <w:sz w:val="18"/>
+              </w:rPr>
+              <w:t>偏移</w:t>
+            </w:r>
+          </w:p>
+        </w:tc>
+        <w:tc>
+          <w:tcPr>
+            <w:tcW w:type="dxa" w:w="1080"/>
+            <w:shd w:fill="1F4E78"/>
+            <w:tcMar>
+              <w:top w:w="90" w:type="dxa"/>
+              <w:start w:w="110" w:type="dxa"/>
+              <w:bottom w:w="90" w:type="dxa"/>
+              <w:end w:w="110" w:type="dxa"/>
+            </w:tcMar>
+            <w:vAlign w:val="center"/>
+          </w:tcPr>
+          <w:p>
+            <w:pPr>
+              <w:spacing w:before="0" w:after="0"/>
+              <w:jc w:val="center"/>
+            </w:pPr>
+            <w:r>
+              <w:rPr>
+                <w:rFonts w:ascii="Microsoft YaHei" w:hAnsi="Microsoft YaHei" w:eastAsia="Microsoft YaHei"/>
+                <w:b/>
+                <w:color w:val="FFFFFF"/>
+                <w:sz w:val="18"/>
+              </w:rPr>
+              <w:t>长度</w:t>
+            </w:r>
+          </w:p>
+        </w:tc>
+        <w:tc>
+          <w:tcPr>
+            <w:tcW w:type="dxa" w:w="7632"/>
+            <w:shd w:fill="1F4E78"/>
+            <w:tcMar>
+              <w:top w:w="90" w:type="dxa"/>
+              <w:start w:w="110" w:type="dxa"/>
+              <w:bottom w:w="90" w:type="dxa"/>
+              <w:end w:w="110" w:type="dxa"/>
+            </w:tcMar>
+            <w:vAlign w:val="center"/>
+          </w:tcPr>
+          <w:p>
+            <w:pPr>
+              <w:spacing w:before="0" w:after="0"/>
+              <w:jc w:val="center"/>
+            </w:pPr>
+            <w:r>
+              <w:rPr>
+                <w:rFonts w:ascii="Microsoft YaHei" w:hAnsi="Microsoft YaHei" w:eastAsia="Microsoft YaHei"/>
+                <w:b/>
+                <w:color w:val="FFFFFF"/>
+                <w:sz w:val="18"/>
+              </w:rPr>
+              <w:t>含义</w:t>
+            </w:r>
+          </w:p>
+        </w:tc>
+      </w:tr>
+      <w:tr>
+        <w:trPr>
+          <w:cantSplit/>
+        </w:trPr>
+        <w:tc>
+          <w:tcPr>
+            <w:tcW w:type="dxa" w:w="1368"/>
+            <w:tcMar>
+              <w:top w:w="90" w:type="dxa"/>
+              <w:start w:w="110" w:type="dxa"/>
+              <w:bottom w:w="90" w:type="dxa"/>
+              <w:end w:w="110" w:type="dxa"/>
+            </w:tcMar>
+            <w:vAlign w:val="center"/>
+          </w:tcPr>
+          <w:p>
+            <w:pPr>
+              <w:spacing w:before="0" w:after="0" w:line="259" w:lineRule="auto"/>
+            </w:pPr>
+            <w:r>
+              <w:rPr>
+                <w:rFonts w:ascii="Microsoft YaHei" w:hAnsi="Microsoft YaHei" w:eastAsia="Microsoft YaHei"/>
+                <w:b w:val="0"/>
+                <w:color w:val="000000"/>
+                <w:sz w:val="18"/>
+              </w:rPr>
+              <w:t>0</w:t>
+            </w:r>
+          </w:p>
+        </w:tc>
+        <w:tc>
+          <w:tcPr>
+            <w:tcW w:type="dxa" w:w="1080"/>
+            <w:tcMar>
+              <w:top w:w="90" w:type="dxa"/>
+              <w:start w:w="110" w:type="dxa"/>
+              <w:bottom w:w="90" w:type="dxa"/>
+              <w:end w:w="110" w:type="dxa"/>
+            </w:tcMar>
+            <w:vAlign w:val="center"/>
+          </w:tcPr>
+          <w:p>
+            <w:pPr>
+              <w:spacing w:before="0" w:after="0" w:line="259" w:lineRule="auto"/>
+            </w:pPr>
+            <w:r>
+              <w:rPr>
+                <w:rFonts w:ascii="Microsoft YaHei" w:hAnsi="Microsoft YaHei" w:eastAsia="Microsoft YaHei"/>
+                <w:b w:val="0"/>
+                <w:color w:val="000000"/>
+                <w:sz w:val="18"/>
+              </w:rPr>
+              <w:t>1</w:t>
+            </w:r>
+          </w:p>
+        </w:tc>
+        <w:tc>
+          <w:tcPr>
+            <w:tcW w:type="dxa" w:w="7632"/>
+            <w:tcMar>
+              <w:top w:w="90" w:type="dxa"/>
+              <w:start w:w="110" w:type="dxa"/>
+              <w:bottom w:w="90" w:type="dxa"/>
+              <w:end w:w="110" w:type="dxa"/>
+            </w:tcMar>
+            <w:vAlign w:val="center"/>
+          </w:tcPr>
+          <w:p>
+            <w:pPr>
+              <w:spacing w:before="0" w:after="0" w:line="259" w:lineRule="auto"/>
+            </w:pPr>
+            <w:r>
+              <w:rPr>
+                <w:rFonts w:ascii="Microsoft YaHei" w:hAnsi="Microsoft YaHei" w:eastAsia="Microsoft YaHei"/>
+                <w:b w:val="0"/>
+                <w:color w:val="000000"/>
+                <w:sz w:val="18"/>
+              </w:rPr>
+              <w:t>标志位：bit0 I²C，bit1 SPI，bit2 UART</w:t>
+            </w:r>
+          </w:p>
+        </w:tc>
+      </w:tr>
+      <w:tr>
+        <w:trPr>
+          <w:cantSplit/>
+        </w:trPr>
+        <w:tc>
+          <w:tcPr>
+            <w:tcW w:type="dxa" w:w="1368"/>
+            <w:shd w:fill="EAF2F8"/>
+            <w:tcMar>
+              <w:top w:w="90" w:type="dxa"/>
+              <w:start w:w="110" w:type="dxa"/>
+              <w:bottom w:w="90" w:type="dxa"/>
+              <w:end w:w="110" w:type="dxa"/>
+            </w:tcMar>
+            <w:vAlign w:val="center"/>
+          </w:tcPr>
+          <w:p>
+            <w:pPr>
+              <w:spacing w:before="0" w:after="0" w:line="259" w:lineRule="auto"/>
+            </w:pPr>
+            <w:r>
+              <w:rPr>
+                <w:rFonts w:ascii="Microsoft YaHei" w:hAnsi="Microsoft YaHei" w:eastAsia="Microsoft YaHei"/>
+                <w:b w:val="0"/>
+                <w:color w:val="000000"/>
+                <w:sz w:val="18"/>
+              </w:rPr>
+              <w:t>1～2</w:t>
+            </w:r>
+          </w:p>
+        </w:tc>
+        <w:tc>
+          <w:tcPr>
+            <w:tcW w:type="dxa" w:w="1080"/>
+            <w:shd w:fill="EAF2F8"/>
+            <w:tcMar>
+              <w:top w:w="90" w:type="dxa"/>
+              <w:start w:w="110" w:type="dxa"/>
+              <w:bottom w:w="90" w:type="dxa"/>
+              <w:end w:w="110" w:type="dxa"/>
+            </w:tcMar>
+            <w:vAlign w:val="center"/>
+          </w:tcPr>
+          <w:p>
+            <w:pPr>
+              <w:spacing w:before="0" w:after="0" w:line="259" w:lineRule="auto"/>
+            </w:pPr>
+            <w:r>
+              <w:rPr>
+                <w:rFonts w:ascii="Microsoft YaHei" w:hAnsi="Microsoft YaHei" w:eastAsia="Microsoft YaHei"/>
+                <w:b w:val="0"/>
+                <w:color w:val="000000"/>
+                <w:sz w:val="18"/>
+              </w:rPr>
+              <w:t>2</w:t>
+            </w:r>
+          </w:p>
+        </w:tc>
+        <w:tc>
+          <w:tcPr>
+            <w:tcW w:type="dxa" w:w="7632"/>
+            <w:shd w:fill="EAF2F8"/>
+            <w:tcMar>
+              <w:top w:w="90" w:type="dxa"/>
+              <w:start w:w="110" w:type="dxa"/>
+              <w:bottom w:w="90" w:type="dxa"/>
+              <w:end w:w="110" w:type="dxa"/>
+            </w:tcMar>
+            <w:vAlign w:val="center"/>
+          </w:tcPr>
+          <w:p>
+            <w:pPr>
+              <w:spacing w:before="0" w:after="0" w:line="259" w:lineRule="auto"/>
+            </w:pPr>
+            <w:r>
+              <w:rPr>
+                <w:rFonts w:ascii="Microsoft YaHei" w:hAnsi="Microsoft YaHei" w:eastAsia="Microsoft YaHei"/>
+                <w:b w:val="0"/>
+                <w:color w:val="000000"/>
+                <w:sz w:val="18"/>
+              </w:rPr>
+              <w:t>I²C SDA、SCL 通道</w:t>
+            </w:r>
+          </w:p>
+        </w:tc>
+      </w:tr>
+      <w:tr>
+        <w:trPr>
+          <w:cantSplit/>
+        </w:trPr>
+        <w:tc>
+          <w:tcPr>
+            <w:tcW w:type="dxa" w:w="1368"/>
+            <w:tcMar>
+              <w:top w:w="90" w:type="dxa"/>
+              <w:start w:w="110" w:type="dxa"/>
+              <w:bottom w:w="90" w:type="dxa"/>
+              <w:end w:w="110" w:type="dxa"/>
+            </w:tcMar>
+            <w:vAlign w:val="center"/>
+          </w:tcPr>
+          <w:p>
+            <w:pPr>
+              <w:spacing w:before="0" w:after="0" w:line="259" w:lineRule="auto"/>
+            </w:pPr>
+            <w:r>
+              <w:rPr>
+                <w:rFonts w:ascii="Microsoft YaHei" w:hAnsi="Microsoft YaHei" w:eastAsia="Microsoft YaHei"/>
+                <w:b w:val="0"/>
+                <w:color w:val="000000"/>
+                <w:sz w:val="18"/>
+              </w:rPr>
+              <w:t>3～6</w:t>
+            </w:r>
+          </w:p>
+        </w:tc>
+        <w:tc>
+          <w:tcPr>
+            <w:tcW w:type="dxa" w:w="1080"/>
+            <w:tcMar>
+              <w:top w:w="90" w:type="dxa"/>
+              <w:start w:w="110" w:type="dxa"/>
+              <w:bottom w:w="90" w:type="dxa"/>
+              <w:end w:w="110" w:type="dxa"/>
+            </w:tcMar>
+            <w:vAlign w:val="center"/>
+          </w:tcPr>
+          <w:p>
+            <w:pPr>
+              <w:spacing w:before="0" w:after="0" w:line="259" w:lineRule="auto"/>
+            </w:pPr>
+            <w:r>
+              <w:rPr>
+                <w:rFonts w:ascii="Microsoft YaHei" w:hAnsi="Microsoft YaHei" w:eastAsia="Microsoft YaHei"/>
+                <w:b w:val="0"/>
+                <w:color w:val="000000"/>
+                <w:sz w:val="18"/>
+              </w:rPr>
+              <w:t>4</w:t>
+            </w:r>
+          </w:p>
+        </w:tc>
+        <w:tc>
+          <w:tcPr>
+            <w:tcW w:type="dxa" w:w="7632"/>
+            <w:tcMar>
+              <w:top w:w="90" w:type="dxa"/>
+              <w:start w:w="110" w:type="dxa"/>
+              <w:bottom w:w="90" w:type="dxa"/>
+              <w:end w:w="110" w:type="dxa"/>
+            </w:tcMar>
+            <w:vAlign w:val="center"/>
+          </w:tcPr>
+          <w:p>
+            <w:pPr>
+              <w:spacing w:before="0" w:after="0" w:line="259" w:lineRule="auto"/>
+            </w:pPr>
+            <w:r>
+              <w:rPr>
+                <w:rFonts w:ascii="Microsoft YaHei" w:hAnsi="Microsoft YaHei" w:eastAsia="Microsoft YaHei"/>
+                <w:b w:val="0"/>
+                <w:color w:val="000000"/>
+                <w:sz w:val="18"/>
+              </w:rPr>
+              <w:t>SPI SCLK、MOSI、MISO、CS 通道</w:t>
+            </w:r>
+          </w:p>
+        </w:tc>
+      </w:tr>
+      <w:tr>
+        <w:trPr>
+          <w:cantSplit/>
+        </w:trPr>
+        <w:tc>
+          <w:tcPr>
+            <w:tcW w:type="dxa" w:w="1368"/>
+            <w:shd w:fill="EAF2F8"/>
+            <w:tcMar>
+              <w:top w:w="90" w:type="dxa"/>
+              <w:start w:w="110" w:type="dxa"/>
+              <w:bottom w:w="90" w:type="dxa"/>
+              <w:end w:w="110" w:type="dxa"/>
+            </w:tcMar>
+            <w:vAlign w:val="center"/>
+          </w:tcPr>
+          <w:p>
+            <w:pPr>
+              <w:spacing w:before="0" w:after="0" w:line="259" w:lineRule="auto"/>
+            </w:pPr>
+            <w:r>
+              <w:rPr>
+                <w:rFonts w:ascii="Microsoft YaHei" w:hAnsi="Microsoft YaHei" w:eastAsia="Microsoft YaHei"/>
+                <w:b w:val="0"/>
+                <w:color w:val="000000"/>
+                <w:sz w:val="18"/>
+              </w:rPr>
+              <w:t>7～8</w:t>
+            </w:r>
+          </w:p>
+        </w:tc>
+        <w:tc>
+          <w:tcPr>
+            <w:tcW w:type="dxa" w:w="1080"/>
+            <w:shd w:fill="EAF2F8"/>
+            <w:tcMar>
+              <w:top w:w="90" w:type="dxa"/>
+              <w:start w:w="110" w:type="dxa"/>
+              <w:bottom w:w="90" w:type="dxa"/>
+              <w:end w:w="110" w:type="dxa"/>
+            </w:tcMar>
+            <w:vAlign w:val="center"/>
+          </w:tcPr>
+          <w:p>
+            <w:pPr>
+              <w:spacing w:before="0" w:after="0" w:line="259" w:lineRule="auto"/>
+            </w:pPr>
+            <w:r>
+              <w:rPr>
+                <w:rFonts w:ascii="Microsoft YaHei" w:hAnsi="Microsoft YaHei" w:eastAsia="Microsoft YaHei"/>
+                <w:b w:val="0"/>
+                <w:color w:val="000000"/>
+                <w:sz w:val="18"/>
+              </w:rPr>
+              <w:t>2</w:t>
+            </w:r>
+          </w:p>
+        </w:tc>
+        <w:tc>
+          <w:tcPr>
+            <w:tcW w:type="dxa" w:w="7632"/>
+            <w:shd w:fill="EAF2F8"/>
+            <w:tcMar>
+              <w:top w:w="90" w:type="dxa"/>
+              <w:start w:w="110" w:type="dxa"/>
+              <w:bottom w:w="90" w:type="dxa"/>
+              <w:end w:w="110" w:type="dxa"/>
+            </w:tcMar>
+            <w:vAlign w:val="center"/>
+          </w:tcPr>
+          <w:p>
+            <w:pPr>
+              <w:spacing w:before="0" w:after="0" w:line="259" w:lineRule="auto"/>
+            </w:pPr>
+            <w:r>
+              <w:rPr>
+                <w:rFonts w:ascii="Microsoft YaHei" w:hAnsi="Microsoft YaHei" w:eastAsia="Microsoft YaHei"/>
+                <w:b w:val="0"/>
+                <w:color w:val="000000"/>
+                <w:sz w:val="18"/>
+              </w:rPr>
+              <w:t>UART TX、RX 通道</w:t>
+            </w:r>
+          </w:p>
+        </w:tc>
+      </w:tr>
+      <w:tr>
+        <w:trPr>
+          <w:cantSplit/>
+        </w:trPr>
+        <w:tc>
+          <w:tcPr>
+            <w:tcW w:type="dxa" w:w="1368"/>
+            <w:tcMar>
+              <w:top w:w="90" w:type="dxa"/>
+              <w:start w:w="110" w:type="dxa"/>
+              <w:bottom w:w="90" w:type="dxa"/>
+              <w:end w:w="110" w:type="dxa"/>
+            </w:tcMar>
+            <w:vAlign w:val="center"/>
+          </w:tcPr>
+          <w:p>
+            <w:pPr>
+              <w:spacing w:before="0" w:after="0" w:line="259" w:lineRule="auto"/>
+            </w:pPr>
+            <w:r>
+              <w:rPr>
+                <w:rFonts w:ascii="Microsoft YaHei" w:hAnsi="Microsoft YaHei" w:eastAsia="Microsoft YaHei"/>
+                <w:b w:val="0"/>
+                <w:color w:val="000000"/>
+                <w:sz w:val="18"/>
+              </w:rPr>
+              <w:t>9～12</w:t>
+            </w:r>
+          </w:p>
+        </w:tc>
+        <w:tc>
+          <w:tcPr>
+            <w:tcW w:type="dxa" w:w="1080"/>
+            <w:tcMar>
+              <w:top w:w="90" w:type="dxa"/>
+              <w:start w:w="110" w:type="dxa"/>
+              <w:bottom w:w="90" w:type="dxa"/>
+              <w:end w:w="110" w:type="dxa"/>
+            </w:tcMar>
+            <w:vAlign w:val="center"/>
+          </w:tcPr>
+          <w:p>
+            <w:pPr>
+              <w:spacing w:before="0" w:after="0" w:line="259" w:lineRule="auto"/>
+            </w:pPr>
+            <w:r>
+              <w:rPr>
+                <w:rFonts w:ascii="Microsoft YaHei" w:hAnsi="Microsoft YaHei" w:eastAsia="Microsoft YaHei"/>
+                <w:b w:val="0"/>
+                <w:color w:val="000000"/>
+                <w:sz w:val="18"/>
+              </w:rPr>
+              <w:t>4</w:t>
+            </w:r>
+          </w:p>
+        </w:tc>
+        <w:tc>
+          <w:tcPr>
+            <w:tcW w:type="dxa" w:w="7632"/>
+            <w:tcMar>
+              <w:top w:w="90" w:type="dxa"/>
+              <w:start w:w="110" w:type="dxa"/>
+              <w:bottom w:w="90" w:type="dxa"/>
+              <w:end w:w="110" w:type="dxa"/>
+            </w:tcMar>
+            <w:vAlign w:val="center"/>
+          </w:tcPr>
+          <w:p>
+            <w:pPr>
+              <w:spacing w:before="0" w:after="0" w:line="259" w:lineRule="auto"/>
+            </w:pPr>
+            <w:r>
+              <w:rPr>
+                <w:rFonts w:ascii="Microsoft YaHei" w:hAnsi="Microsoft YaHei" w:eastAsia="Microsoft YaHei"/>
+                <w:b w:val="0"/>
+                <w:color w:val="000000"/>
+                <w:sz w:val="18"/>
+              </w:rPr>
+              <w:t>I²C 频率 Hz</w:t>
+            </w:r>
+          </w:p>
+        </w:tc>
+      </w:tr>
+      <w:tr>
+        <w:trPr>
+          <w:cantSplit/>
+        </w:trPr>
+        <w:tc>
+          <w:tcPr>
+            <w:tcW w:type="dxa" w:w="1368"/>
+            <w:shd w:fill="EAF2F8"/>
+            <w:tcMar>
+              <w:top w:w="90" w:type="dxa"/>
+              <w:start w:w="110" w:type="dxa"/>
+              <w:bottom w:w="90" w:type="dxa"/>
+              <w:end w:w="110" w:type="dxa"/>
+            </w:tcMar>
+            <w:vAlign w:val="center"/>
+          </w:tcPr>
+          <w:p>
+            <w:pPr>
+              <w:spacing w:before="0" w:after="0" w:line="259" w:lineRule="auto"/>
+            </w:pPr>
+            <w:r>
+              <w:rPr>
+                <w:rFonts w:ascii="Microsoft YaHei" w:hAnsi="Microsoft YaHei" w:eastAsia="Microsoft YaHei"/>
+                <w:b w:val="0"/>
+                <w:color w:val="000000"/>
+                <w:sz w:val="18"/>
+              </w:rPr>
+              <w:t>13～16</w:t>
+            </w:r>
+          </w:p>
+        </w:tc>
+        <w:tc>
+          <w:tcPr>
+            <w:tcW w:type="dxa" w:w="1080"/>
+            <w:shd w:fill="EAF2F8"/>
+            <w:tcMar>
+              <w:top w:w="90" w:type="dxa"/>
+              <w:start w:w="110" w:type="dxa"/>
+              <w:bottom w:w="90" w:type="dxa"/>
+              <w:end w:w="110" w:type="dxa"/>
+            </w:tcMar>
+            <w:vAlign w:val="center"/>
+          </w:tcPr>
+          <w:p>
+            <w:pPr>
+              <w:spacing w:before="0" w:after="0" w:line="259" w:lineRule="auto"/>
+            </w:pPr>
+            <w:r>
+              <w:rPr>
+                <w:rFonts w:ascii="Microsoft YaHei" w:hAnsi="Microsoft YaHei" w:eastAsia="Microsoft YaHei"/>
+                <w:b w:val="0"/>
+                <w:color w:val="000000"/>
+                <w:sz w:val="18"/>
+              </w:rPr>
+              <w:t>4</w:t>
+            </w:r>
+          </w:p>
+        </w:tc>
+        <w:tc>
+          <w:tcPr>
+            <w:tcW w:type="dxa" w:w="7632"/>
+            <w:shd w:fill="EAF2F8"/>
+            <w:tcMar>
+              <w:top w:w="90" w:type="dxa"/>
+              <w:start w:w="110" w:type="dxa"/>
+              <w:bottom w:w="90" w:type="dxa"/>
+              <w:end w:w="110" w:type="dxa"/>
+            </w:tcMar>
+            <w:vAlign w:val="center"/>
+          </w:tcPr>
+          <w:p>
+            <w:pPr>
+              <w:spacing w:before="0" w:after="0" w:line="259" w:lineRule="auto"/>
+            </w:pPr>
+            <w:r>
+              <w:rPr>
+                <w:rFonts w:ascii="Microsoft YaHei" w:hAnsi="Microsoft YaHei" w:eastAsia="Microsoft YaHei"/>
+                <w:b w:val="0"/>
+                <w:color w:val="000000"/>
+                <w:sz w:val="18"/>
+              </w:rPr>
+              <w:t>SPI 频率 Hz</w:t>
+            </w:r>
+          </w:p>
+        </w:tc>
+      </w:tr>
+      <w:tr>
+        <w:trPr>
+          <w:cantSplit/>
+        </w:trPr>
+        <w:tc>
+          <w:tcPr>
+            <w:tcW w:type="dxa" w:w="1368"/>
+            <w:tcMar>
+              <w:top w:w="90" w:type="dxa"/>
+              <w:start w:w="110" w:type="dxa"/>
+              <w:bottom w:w="90" w:type="dxa"/>
+              <w:end w:w="110" w:type="dxa"/>
+            </w:tcMar>
+            <w:vAlign w:val="center"/>
+          </w:tcPr>
+          <w:p>
+            <w:pPr>
+              <w:spacing w:before="0" w:after="0" w:line="259" w:lineRule="auto"/>
+            </w:pPr>
+            <w:r>
+              <w:rPr>
+                <w:rFonts w:ascii="Microsoft YaHei" w:hAnsi="Microsoft YaHei" w:eastAsia="Microsoft YaHei"/>
+                <w:b w:val="0"/>
+                <w:color w:val="000000"/>
+                <w:sz w:val="18"/>
+              </w:rPr>
+              <w:t>17～20</w:t>
+            </w:r>
+          </w:p>
+        </w:tc>
+        <w:tc>
+          <w:tcPr>
+            <w:tcW w:type="dxa" w:w="1080"/>
+            <w:tcMar>
+              <w:top w:w="90" w:type="dxa"/>
+              <w:start w:w="110" w:type="dxa"/>
+              <w:bottom w:w="90" w:type="dxa"/>
+              <w:end w:w="110" w:type="dxa"/>
+            </w:tcMar>
+            <w:vAlign w:val="center"/>
+          </w:tcPr>
+          <w:p>
+            <w:pPr>
+              <w:spacing w:before="0" w:after="0" w:line="259" w:lineRule="auto"/>
+            </w:pPr>
+            <w:r>
+              <w:rPr>
+                <w:rFonts w:ascii="Microsoft YaHei" w:hAnsi="Microsoft YaHei" w:eastAsia="Microsoft YaHei"/>
+                <w:b w:val="0"/>
+                <w:color w:val="000000"/>
+                <w:sz w:val="18"/>
+              </w:rPr>
+              <w:t>4</w:t>
+            </w:r>
+          </w:p>
+        </w:tc>
+        <w:tc>
+          <w:tcPr>
+            <w:tcW w:type="dxa" w:w="7632"/>
+            <w:tcMar>
+              <w:top w:w="90" w:type="dxa"/>
+              <w:start w:w="110" w:type="dxa"/>
+              <w:bottom w:w="90" w:type="dxa"/>
+              <w:end w:w="110" w:type="dxa"/>
+            </w:tcMar>
+            <w:vAlign w:val="center"/>
+          </w:tcPr>
+          <w:p>
+            <w:pPr>
+              <w:spacing w:before="0" w:after="0" w:line="259" w:lineRule="auto"/>
+            </w:pPr>
+            <w:r>
+              <w:rPr>
+                <w:rFonts w:ascii="Microsoft YaHei" w:hAnsi="Microsoft YaHei" w:eastAsia="Microsoft YaHei"/>
+                <w:b w:val="0"/>
+                <w:color w:val="000000"/>
+                <w:sz w:val="18"/>
+              </w:rPr>
+              <w:t>UART 波特率 bps</w:t>
+            </w:r>
+          </w:p>
+        </w:tc>
+      </w:tr>
+      <w:tr>
+        <w:trPr>
+          <w:cantSplit/>
+        </w:trPr>
+        <w:tc>
+          <w:tcPr>
+            <w:tcW w:type="dxa" w:w="1368"/>
+            <w:shd w:fill="EAF2F8"/>
+            <w:tcMar>
+              <w:top w:w="90" w:type="dxa"/>
+              <w:start w:w="110" w:type="dxa"/>
+              <w:bottom w:w="90" w:type="dxa"/>
+              <w:end w:w="110" w:type="dxa"/>
+            </w:tcMar>
+            <w:vAlign w:val="center"/>
+          </w:tcPr>
+          <w:p>
+            <w:pPr>
+              <w:spacing w:before="0" w:after="0" w:line="259" w:lineRule="auto"/>
+            </w:pPr>
+            <w:r>
+              <w:rPr>
+                <w:rFonts w:ascii="Microsoft YaHei" w:hAnsi="Microsoft YaHei" w:eastAsia="Microsoft YaHei"/>
+                <w:b w:val="0"/>
+                <w:color w:val="000000"/>
+                <w:sz w:val="18"/>
+              </w:rPr>
+              <w:t>21</w:t>
+            </w:r>
+          </w:p>
+        </w:tc>
+        <w:tc>
+          <w:tcPr>
+            <w:tcW w:type="dxa" w:w="1080"/>
+            <w:shd w:fill="EAF2F8"/>
+            <w:tcMar>
+              <w:top w:w="90" w:type="dxa"/>
+              <w:start w:w="110" w:type="dxa"/>
+              <w:bottom w:w="90" w:type="dxa"/>
+              <w:end w:w="110" w:type="dxa"/>
+            </w:tcMar>
+            <w:vAlign w:val="center"/>
+          </w:tcPr>
+          <w:p>
+            <w:pPr>
+              <w:spacing w:before="0" w:after="0" w:line="259" w:lineRule="auto"/>
+            </w:pPr>
+            <w:r>
+              <w:rPr>
+                <w:rFonts w:ascii="Microsoft YaHei" w:hAnsi="Microsoft YaHei" w:eastAsia="Microsoft YaHei"/>
+                <w:b w:val="0"/>
+                <w:color w:val="000000"/>
+                <w:sz w:val="18"/>
+              </w:rPr>
+              <w:t>1</w:t>
+            </w:r>
+          </w:p>
+        </w:tc>
+        <w:tc>
+          <w:tcPr>
+            <w:tcW w:type="dxa" w:w="7632"/>
+            <w:shd w:fill="EAF2F8"/>
+            <w:tcMar>
+              <w:top w:w="90" w:type="dxa"/>
+              <w:start w:w="110" w:type="dxa"/>
+              <w:bottom w:w="90" w:type="dxa"/>
+              <w:end w:w="110" w:type="dxa"/>
+            </w:tcMar>
+            <w:vAlign w:val="center"/>
+          </w:tcPr>
+          <w:p>
+            <w:pPr>
+              <w:spacing w:before="0" w:after="0" w:line="259" w:lineRule="auto"/>
+            </w:pPr>
+            <w:r>
+              <w:rPr>
+                <w:rFonts w:ascii="Microsoft YaHei" w:hAnsi="Microsoft YaHei" w:eastAsia="Microsoft YaHei"/>
+                <w:b w:val="0"/>
+                <w:color w:val="000000"/>
+                <w:sz w:val="18"/>
+              </w:rPr>
+              <w:t>SPI 模式</w:t>
+            </w:r>
+          </w:p>
+        </w:tc>
+      </w:tr>
+      <w:tr>
+        <w:trPr>
+          <w:cantSplit/>
+        </w:trPr>
+        <w:tc>
+          <w:tcPr>
+            <w:tcW w:type="dxa" w:w="1368"/>
+            <w:tcMar>
+              <w:top w:w="90" w:type="dxa"/>
+              <w:start w:w="110" w:type="dxa"/>
+              <w:bottom w:w="90" w:type="dxa"/>
+              <w:end w:w="110" w:type="dxa"/>
+            </w:tcMar>
+            <w:vAlign w:val="center"/>
+          </w:tcPr>
+          <w:p>
+            <w:pPr>
+              <w:spacing w:before="0" w:after="0" w:line="259" w:lineRule="auto"/>
+            </w:pPr>
+            <w:r>
+              <w:rPr>
+                <w:rFonts w:ascii="Microsoft YaHei" w:hAnsi="Microsoft YaHei" w:eastAsia="Microsoft YaHei"/>
+                <w:b w:val="0"/>
+                <w:color w:val="000000"/>
+                <w:sz w:val="18"/>
+              </w:rPr>
+              <w:t>22～24</w:t>
+            </w:r>
+          </w:p>
+        </w:tc>
+        <w:tc>
+          <w:tcPr>
+            <w:tcW w:type="dxa" w:w="1080"/>
+            <w:tcMar>
+              <w:top w:w="90" w:type="dxa"/>
+              <w:start w:w="110" w:type="dxa"/>
+              <w:bottom w:w="90" w:type="dxa"/>
+              <w:end w:w="110" w:type="dxa"/>
+            </w:tcMar>
+            <w:vAlign w:val="center"/>
+          </w:tcPr>
+          <w:p>
+            <w:pPr>
+              <w:spacing w:before="0" w:after="0" w:line="259" w:lineRule="auto"/>
+            </w:pPr>
+            <w:r>
+              <w:rPr>
+                <w:rFonts w:ascii="Microsoft YaHei" w:hAnsi="Microsoft YaHei" w:eastAsia="Microsoft YaHei"/>
+                <w:b w:val="0"/>
+                <w:color w:val="000000"/>
+                <w:sz w:val="18"/>
+              </w:rPr>
+              <w:t>3</w:t>
+            </w:r>
+          </w:p>
+        </w:tc>
+        <w:tc>
+          <w:tcPr>
+            <w:tcW w:type="dxa" w:w="7632"/>
+            <w:tcMar>
+              <w:top w:w="90" w:type="dxa"/>
+              <w:start w:w="110" w:type="dxa"/>
+              <w:bottom w:w="90" w:type="dxa"/>
+              <w:end w:w="110" w:type="dxa"/>
+            </w:tcMar>
+            <w:vAlign w:val="center"/>
+          </w:tcPr>
+          <w:p>
+            <w:pPr>
+              <w:spacing w:before="0" w:after="0" w:line="259" w:lineRule="auto"/>
+            </w:pPr>
+            <w:r>
+              <w:rPr>
+                <w:rFonts w:ascii="Microsoft YaHei" w:hAnsi="Microsoft YaHei" w:eastAsia="Microsoft YaHei"/>
+                <w:b w:val="0"/>
+                <w:color w:val="000000"/>
+                <w:sz w:val="18"/>
+              </w:rPr>
+              <w:t>UART 数据位、校验、停止位</w:t>
+            </w:r>
+          </w:p>
+        </w:tc>
+      </w:tr>
+    </w:tbl>
+    <w:p>
+      <w:pPr>
+        <w:spacing w:after="0"/>
+      </w:pPr>
+    </w:p>
+    <w:p>
+      <w:pPr>
+        <w:pStyle w:val="Heading2"/>
+      </w:pPr>
+      <w:r>
+        <w:t>13 4 报文示例</w:t>
+      </w:r>
+    </w:p>
+    <w:p>
+      <w:pPr>
+        <w:pStyle w:val="Code"/>
+        <w:keepLines/>
+        <w:spacing w:before="0" w:after="0"/>
+        <w:shd w:fill="F3F5F7"/>
+      </w:pPr>
+      <w:r>
+        <w:rPr>
+          <w:rFonts w:ascii="Cascadia Mono" w:hAnsi="Cascadia Mono" w:eastAsia="Cascadia Mono"/>
+          <w:b w:val="0"/>
+          <w:color w:val="000000"/>
+          <w:sz w:val="18"/>
+        </w:rPr>
+        <w:t>I2C 100k:  01 41 01 06 04 05 00 01 86 A0 44 01</w:t>
+      </w:r>
+    </w:p>
+    <w:p>
+      <w:pPr>
+        <w:pStyle w:val="Code"/>
+        <w:keepLines/>
+        <w:spacing w:before="0" w:after="0"/>
+        <w:shd w:fill="F3F5F7"/>
+      </w:pPr>
+      <w:r>
+        <w:rPr>
+          <w:rFonts w:ascii="Cascadia Mono" w:hAnsi="Cascadia Mono" w:eastAsia="Cascadia Mono"/>
+          <w:b w:val="0"/>
+          <w:color w:val="000000"/>
+          <w:sz w:val="18"/>
+        </w:rPr>
+        <w:t>I2C scan:  01 41 03 00 51 3C</w:t>
+      </w:r>
+    </w:p>
+    <w:p>
+      <w:pPr>
+        <w:pStyle w:val="Code"/>
+        <w:keepLines/>
+        <w:spacing w:before="0" w:after="0"/>
+        <w:shd w:fill="F3F5F7"/>
+      </w:pPr>
+      <w:r>
+        <w:rPr>
+          <w:rFonts w:ascii="Cascadia Mono" w:hAnsi="Cascadia Mono" w:eastAsia="Cascadia Mono"/>
+          <w:b w:val="0"/>
+          <w:color w:val="000000"/>
+          <w:sz w:val="18"/>
+        </w:rPr>
+        <w:t>I2C W/R:   01 41 04 04 50 01 04 00 62 87</w:t>
+      </w:r>
+    </w:p>
+    <w:p>
+      <w:pPr>
+        <w:pStyle w:val="Code"/>
+        <w:keepLines/>
+        <w:spacing w:before="0" w:after="0"/>
+        <w:shd w:fill="F3F5F7"/>
+      </w:pPr>
+      <w:r>
+        <w:rPr>
+          <w:rFonts w:ascii="Cascadia Mono" w:hAnsi="Cascadia Mono" w:eastAsia="Cascadia Mono"/>
+          <w:b w:val="0"/>
+          <w:color w:val="000000"/>
+          <w:sz w:val="18"/>
+        </w:rPr>
+        <w:t>SPI 1MHz:  01 41 05 09 06 07 08 09 00 00 0F 42 40 DE 39</w:t>
+      </w:r>
+    </w:p>
+    <w:p>
+      <w:pPr>
+        <w:pStyle w:val="Code"/>
+        <w:keepLines/>
+        <w:spacing w:before="0" w:after="0"/>
+        <w:shd w:fill="F3F5F7"/>
+      </w:pPr>
+      <w:r>
+        <w:rPr>
+          <w:rFonts w:ascii="Cascadia Mono" w:hAnsi="Cascadia Mono" w:eastAsia="Cascadia Mono"/>
+          <w:b w:val="0"/>
+          <w:color w:val="000000"/>
+          <w:sz w:val="18"/>
+        </w:rPr>
+        <w:t>SPI xfer:  01 41 07 05 04 9F 00 00 00 6B DD</w:t>
+      </w:r>
+    </w:p>
+    <w:p>
+      <w:pPr>
+        <w:pStyle w:val="Code"/>
+        <w:keepLines/>
+        <w:spacing w:before="0" w:after="0"/>
+        <w:shd w:fill="F3F5F7"/>
+      </w:pPr>
+      <w:r>
+        <w:rPr>
+          <w:rFonts w:ascii="Cascadia Mono" w:hAnsi="Cascadia Mono" w:eastAsia="Cascadia Mono"/>
+          <w:b w:val="0"/>
+          <w:color w:val="000000"/>
+          <w:sz w:val="18"/>
+        </w:rPr>
+        <w:t>UART 8N1:  01 41 08 09 19 1A 00 01 C2 00 08 00 01 19 38</w:t>
+      </w:r>
+    </w:p>
+    <w:p>
+      <w:pPr>
+        <w:pStyle w:val="Code"/>
+        <w:keepLines/>
+        <w:spacing w:before="0" w:after="0"/>
+        <w:shd w:fill="F3F5F7"/>
+      </w:pPr>
+      <w:r>
+        <w:rPr>
+          <w:rFonts w:ascii="Cascadia Mono" w:hAnsi="Cascadia Mono" w:eastAsia="Cascadia Mono"/>
+          <w:b w:val="0"/>
+          <w:color w:val="000000"/>
+          <w:sz w:val="18"/>
+        </w:rPr>
+        <w:t>Status:    01 41 0A 00 57 6C</w:t>
+      </w:r>
+    </w:p>
+    <w:p>
+      <w:pPr>
+        <w:spacing w:after="0"/>
+      </w:pPr>
+    </w:p>
+    <w:p>
+      <w:pPr>
+        <w:pStyle w:val="Heading1"/>
         <w:spacing w:before="160" w:after="60"/>
       </w:pPr>
       <w:r>
-        <w:t>13 参考资料</w:t>
+        <w:t>14 参考资料</w:t>
       </w:r>
     </w:p>
     <w:p>
@@ -12789,7 +15728,7 @@
             <w:u w:val="single"/>
             <w:sz w:val="18"/>
           </w:rPr>
-          <w:t>ESP32-S3 Datasheet</w:t>
+          <w:t>ESP-IDF I2C Master Driver</w:t>
         </w:r>
       </w:hyperlink>
     </w:p>
@@ -12806,6 +15745,57 @@
             <w:u w:val="single"/>
             <w:sz w:val="18"/>
           </w:rPr>
+          <w:t>ESP-IDF SPI Master Driver</w:t>
+        </w:r>
+      </w:hyperlink>
+    </w:p>
+    <w:p>
+      <w:pPr>
+        <w:pStyle w:val="ListBullet"/>
+        <w:spacing w:after="0" w:line="240" w:lineRule="auto"/>
+      </w:pPr>
+      <w:hyperlink r:id="rId16">
+        <w:r>
+          <w:rPr>
+            <w:rFonts w:ascii="Microsoft YaHei" w:hAnsi="Microsoft YaHei" w:eastAsia="Microsoft YaHei"/>
+            <w:color w:val="0563C1"/>
+            <w:u w:val="single"/>
+            <w:sz w:val="18"/>
+          </w:rPr>
+          <w:t>ESP-IDF UART Driver</w:t>
+        </w:r>
+      </w:hyperlink>
+    </w:p>
+    <w:p>
+      <w:pPr>
+        <w:pStyle w:val="ListBullet"/>
+        <w:spacing w:after="0" w:line="240" w:lineRule="auto"/>
+      </w:pPr>
+      <w:hyperlink r:id="rId17">
+        <w:r>
+          <w:rPr>
+            <w:rFonts w:ascii="Microsoft YaHei" w:hAnsi="Microsoft YaHei" w:eastAsia="Microsoft YaHei"/>
+            <w:color w:val="0563C1"/>
+            <w:u w:val="single"/>
+            <w:sz w:val="18"/>
+          </w:rPr>
+          <w:t>ESP32-S3 Datasheet</w:t>
+        </w:r>
+      </w:hyperlink>
+    </w:p>
+    <w:p>
+      <w:pPr>
+        <w:pStyle w:val="ListBullet"/>
+        <w:spacing w:after="0" w:line="240" w:lineRule="auto"/>
+      </w:pPr>
+      <w:hyperlink r:id="rId18">
+        <w:r>
+          <w:rPr>
+            <w:rFonts w:ascii="Microsoft YaHei" w:hAnsi="Microsoft YaHei" w:eastAsia="Microsoft YaHei"/>
+            <w:color w:val="0563C1"/>
+            <w:u w:val="single"/>
+            <w:sz w:val="18"/>
+          </w:rPr>
           <w:t>Modbus Application Protocol V1.1b3</w:t>
         </w:r>
       </w:hyperlink>
@@ -12815,7 +15805,7 @@
         <w:pStyle w:val="ListBullet"/>
         <w:spacing w:after="0" w:line="240" w:lineRule="auto"/>
       </w:pPr>
-      <w:hyperlink r:id="rId16">
+      <w:hyperlink r:id="rId19">
         <w:r>
           <w:rPr>
             <w:rFonts w:ascii="Microsoft YaHei" w:hAnsi="Microsoft YaHei" w:eastAsia="Microsoft YaHei"/>
@@ -12869,7 +15859,7 @@
               <w:color w:val="000000"/>
               <w:sz w:val="17"/>
             </w:rPr>
-            <w:t>ESP32-S3 USB Modbus IO 协议 1.1</w:t>
+            <w:t>ESP32-S3 USB Modbus IO 协议 1.2</w:t>
           </w:r>
         </w:p>
       </w:tc>

</xml_diff>